<commit_message>
Adiciona fluxo das exceções do backend à documentação
</commit_message>
<xml_diff>
--- a/docs/DocumentacaoSistema.docx
+++ b/docs/DocumentacaoSistema.docx
@@ -1,6 +1,6 @@
 
 <file path=word/document.xml><?xml version="1.0" encoding="utf-8"?>
-<w:document xmlns:wpc="http://schemas.microsoft.com/office/word/2010/wordprocessingCanvas" xmlns:cx="http://schemas.microsoft.com/office/drawing/2014/chartex" xmlns:cx1="http://schemas.microsoft.com/office/drawing/2015/9/8/chartex" xmlns:cx2="http://schemas.microsoft.com/office/drawing/2015/10/21/chartex" xmlns:cx3="http://schemas.microsoft.com/office/drawing/2016/5/9/chartex" xmlns:cx4="http://schemas.microsoft.com/office/drawing/2016/5/10/chartex" xmlns:cx5="http://schemas.microsoft.com/office/drawing/2016/5/11/chartex" xmlns:cx6="http://schemas.microsoft.com/office/drawing/2016/5/12/chartex" xmlns:cx7="http://schemas.microsoft.com/office/drawing/2016/5/13/chartex" xmlns:cx8="http://schemas.microsoft.com/office/drawing/2016/5/14/chartex" xmlns:mc="http://schemas.openxmlformats.org/markup-compatibility/2006" xmlns:aink="http://schemas.microsoft.com/office/drawing/2016/ink" xmlns:am3d="http://schemas.microsoft.com/office/drawing/2017/model3d" xmlns:o="urn:schemas-microsoft-com:office:office" xmlns:oel="http://schemas.microsoft.com/office/2019/extlst" xmlns:r="http://schemas.openxmlformats.org/officeDocument/2006/relationships" xmlns:m="http://schemas.openxmlformats.org/officeDocument/2006/math" xmlns:v="urn:schemas-microsoft-com:vml" xmlns:wp14="http://schemas.microsoft.com/office/word/2010/wordprocessingDrawing" xmlns:wp="http://schemas.openxmlformats.org/drawingml/2006/wordprocessingDrawing" xmlns:w10="urn:schemas-microsoft-com:office:word" xmlns:w="http://schemas.openxmlformats.org/wordprocessingml/2006/main" xmlns:w14="http://schemas.microsoft.com/office/word/2010/wordml" xmlns:w15="http://schemas.microsoft.com/office/word/2012/wordml" xmlns:w16cex="http://schemas.microsoft.com/office/word/2018/wordml/cex" xmlns:w16cid="http://schemas.microsoft.com/office/word/2016/wordml/cid" xmlns:w16="http://schemas.microsoft.com/office/word/2018/wordml" xmlns:w16du="http://schemas.microsoft.com/office/word/2023/wordml/word16du" xmlns:w16sdtdh="http://schemas.microsoft.com/office/word/2020/wordml/sdtdatahash" xmlns:w16sdtfl="http://schemas.microsoft.com/office/word/2024/wordml/sdtformatlock" xmlns:w16se="http://schemas.microsoft.com/office/word/2015/wordml/symex" xmlns:wpg="http://schemas.microsoft.com/office/word/2010/wordprocessingGroup" xmlns:wpi="http://schemas.microsoft.com/office/word/2010/wordprocessingInk" xmlns:wne="http://schemas.microsoft.com/office/word/2006/wordml" xmlns:wps="http://schemas.microsoft.com/office/word/2010/wordprocessingShape" mc:Ignorable="w14 w15 w16se w16cid w16 w16cex w16sdtdh w16sdtfl w16du wp14">
+<w:document xmlns:wpc="http://schemas.microsoft.com/office/word/2010/wordprocessingCanvas" xmlns:cx="http://schemas.microsoft.com/office/drawing/2014/chartex" xmlns:cx1="http://schemas.microsoft.com/office/drawing/2015/9/8/chartex" xmlns:cx2="http://schemas.microsoft.com/office/drawing/2015/10/21/chartex" xmlns:cx3="http://schemas.microsoft.com/office/drawing/2016/5/9/chartex" xmlns:cx4="http://schemas.microsoft.com/office/drawing/2016/5/10/chartex" xmlns:cx5="http://schemas.microsoft.com/office/drawing/2016/5/11/chartex" xmlns:cx6="http://schemas.microsoft.com/office/drawing/2016/5/12/chartex" xmlns:cx7="http://schemas.microsoft.com/office/drawing/2016/5/13/chartex" xmlns:cx8="http://schemas.microsoft.com/office/drawing/2016/5/14/chartex" xmlns:mc="http://schemas.openxmlformats.org/markup-compatibility/2006" xmlns:aink="http://schemas.microsoft.com/office/drawing/2016/ink" xmlns:am3d="http://schemas.microsoft.com/office/drawing/2017/model3d" xmlns:o="urn:schemas-microsoft-com:office:office" xmlns:r="http://schemas.openxmlformats.org/officeDocument/2006/relationships" xmlns:m="http://schemas.openxmlformats.org/officeDocument/2006/math" xmlns:v="urn:schemas-microsoft-com:vml" xmlns:wp14="http://schemas.microsoft.com/office/word/2010/wordprocessingDrawing" xmlns:wp="http://schemas.openxmlformats.org/drawingml/2006/wordprocessingDrawing" xmlns:w10="urn:schemas-microsoft-com:office:word" xmlns:w="http://schemas.openxmlformats.org/wordprocessingml/2006/main" xmlns:w14="http://schemas.microsoft.com/office/word/2010/wordml" xmlns:w15="http://schemas.microsoft.com/office/word/2012/wordml" xmlns:w16cex="http://schemas.microsoft.com/office/word/2018/wordml/cex" xmlns:w16cid="http://schemas.microsoft.com/office/word/2016/wordml/cid" xmlns:w16="http://schemas.microsoft.com/office/word/2018/wordml" xmlns:w16sdtdh="http://schemas.microsoft.com/office/word/2020/wordml/sdtdatahash" xmlns:w16se="http://schemas.microsoft.com/office/word/2015/wordml/symex" xmlns:wpg="http://schemas.microsoft.com/office/word/2010/wordprocessingGroup" xmlns:wpi="http://schemas.microsoft.com/office/word/2010/wordprocessingInk" xmlns:wne="http://schemas.microsoft.com/office/word/2006/wordml" xmlns:wps="http://schemas.microsoft.com/office/word/2010/wordprocessingShape" mc:Ignorable="w14 w15 w16se w16cid w16 w16cex w16sdtdh wp14">
   <w:body>
     <w:p>
       <w:pPr>
@@ -461,9 +461,10 @@
       <w:pPr>
         <w:spacing w:after="0"/>
         <w:ind w:right="70"/>
-      </w:pPr>
-      <w:r>
-        <w:t xml:space="preserve">Trabalho de Conclusão de Curso apresentado ao SENAI BETIM MARIA MADALENA </w:t>
+        <w:jc w:val="right"/>
+      </w:pPr>
+      <w:r>
+        <w:t>Trabalho de Conclusão de Curso apresentado ao SENAI BETIM MARIA MADALENA</w:t>
       </w:r>
     </w:p>
     <w:p>
@@ -473,7 +474,7 @@
         <w:jc w:val="right"/>
       </w:pPr>
       <w:r>
-        <w:t xml:space="preserve">NOGUEIRA como requisito para aprovação no curso tecnólogo Desenvolvimento de Sistemas. </w:t>
+        <w:t>NOGUEIRA como requisito para aprovação no curso tecnólogo Desenvolvimento de Sistemas.</w:t>
       </w:r>
     </w:p>
     <w:p>
@@ -634,6 +635,12 @@
     </w:p>
     <w:sdt>
       <w:sdtPr>
+        <w:rPr>
+          <w:rFonts w:ascii="Arial" w:eastAsia="Arial" w:hAnsi="Arial" w:cs="Arial"/>
+          <w:color w:val="000000"/>
+          <w:sz w:val="24"/>
+          <w:szCs w:val="22"/>
+        </w:rPr>
         <w:id w:val="-1873211138"/>
         <w:docPartObj>
           <w:docPartGallery w:val="Table of Contents"/>
@@ -642,12 +649,8 @@
       </w:sdtPr>
       <w:sdtEndPr>
         <w:rPr>
-          <w:rFonts w:ascii="Arial" w:eastAsia="Arial" w:hAnsi="Arial" w:cs="Arial"/>
           <w:b/>
           <w:bCs/>
-          <w:color w:val="000000"/>
-          <w:sz w:val="24"/>
-          <w:szCs w:val="22"/>
         </w:rPr>
       </w:sdtEndPr>
       <w:sdtContent>
@@ -666,9 +669,7 @@
               <w:rFonts w:asciiTheme="minorHAnsi" w:eastAsiaTheme="minorEastAsia" w:hAnsiTheme="minorHAnsi" w:cstheme="minorBidi"/>
               <w:noProof/>
               <w:color w:val="auto"/>
-              <w:kern w:val="2"/>
-              <w:szCs w:val="24"/>
-              <w14:ligatures w14:val="standardContextual"/>
+              <w:sz w:val="22"/>
             </w:rPr>
           </w:pPr>
           <w:r>
@@ -680,7 +681,7 @@
           <w:r>
             <w:fldChar w:fldCharType="separate"/>
           </w:r>
-          <w:hyperlink w:anchor="_Toc233832125" w:history="1">
+          <w:hyperlink w:anchor="_Toc233893997" w:history="1">
             <w:r>
               <w:rPr>
                 <w:rStyle w:val="Hyperlink"/>
@@ -707,7 +708,7 @@
                 <w:noProof/>
                 <w:webHidden/>
               </w:rPr>
-              <w:instrText xml:space="preserve"> PAGEREF _Toc233832125 \h </w:instrText>
+              <w:instrText xml:space="preserve"> PAGEREF _Toc233893997 \h </w:instrText>
             </w:r>
             <w:r>
               <w:rPr>
@@ -748,12 +749,10 @@
               <w:rFonts w:asciiTheme="minorHAnsi" w:eastAsiaTheme="minorEastAsia" w:hAnsiTheme="minorHAnsi" w:cstheme="minorBidi"/>
               <w:noProof/>
               <w:color w:val="auto"/>
-              <w:kern w:val="2"/>
-              <w:szCs w:val="24"/>
-              <w14:ligatures w14:val="standardContextual"/>
+              <w:sz w:val="22"/>
             </w:rPr>
           </w:pPr>
-          <w:hyperlink w:anchor="_Toc233832126" w:history="1">
+          <w:hyperlink w:anchor="_Toc233893998" w:history="1">
             <w:r>
               <w:rPr>
                 <w:rStyle w:val="Hyperlink"/>
@@ -780,7 +779,7 @@
                 <w:noProof/>
                 <w:webHidden/>
               </w:rPr>
-              <w:instrText xml:space="preserve"> PAGEREF _Toc233832126 \h </w:instrText>
+              <w:instrText xml:space="preserve"> PAGEREF _Toc233893998 \h </w:instrText>
             </w:r>
             <w:r>
               <w:rPr>
@@ -821,12 +820,10 @@
               <w:rFonts w:asciiTheme="minorHAnsi" w:eastAsiaTheme="minorEastAsia" w:hAnsiTheme="minorHAnsi" w:cstheme="minorBidi"/>
               <w:noProof/>
               <w:color w:val="auto"/>
-              <w:kern w:val="2"/>
-              <w:szCs w:val="24"/>
-              <w14:ligatures w14:val="standardContextual"/>
+              <w:sz w:val="22"/>
             </w:rPr>
           </w:pPr>
-          <w:hyperlink w:anchor="_Toc233832127" w:history="1">
+          <w:hyperlink w:anchor="_Toc233893999" w:history="1">
             <w:r>
               <w:rPr>
                 <w:rStyle w:val="Hyperlink"/>
@@ -853,7 +850,7 @@
                 <w:noProof/>
                 <w:webHidden/>
               </w:rPr>
-              <w:instrText xml:space="preserve"> PAGEREF _Toc233832127 \h </w:instrText>
+              <w:instrText xml:space="preserve"> PAGEREF _Toc233893999 \h </w:instrText>
             </w:r>
             <w:r>
               <w:rPr>
@@ -894,12 +891,10 @@
               <w:rFonts w:asciiTheme="minorHAnsi" w:eastAsiaTheme="minorEastAsia" w:hAnsiTheme="minorHAnsi" w:cstheme="minorBidi"/>
               <w:noProof/>
               <w:color w:val="auto"/>
-              <w:kern w:val="2"/>
-              <w:szCs w:val="24"/>
-              <w14:ligatures w14:val="standardContextual"/>
+              <w:sz w:val="22"/>
             </w:rPr>
           </w:pPr>
-          <w:hyperlink w:anchor="_Toc233832128" w:history="1">
+          <w:hyperlink w:anchor="_Toc233894000" w:history="1">
             <w:r>
               <w:rPr>
                 <w:rStyle w:val="Hyperlink"/>
@@ -926,7 +921,7 @@
                 <w:noProof/>
                 <w:webHidden/>
               </w:rPr>
-              <w:instrText xml:space="preserve"> PAGEREF _Toc233832128 \h </w:instrText>
+              <w:instrText xml:space="preserve"> PAGEREF _Toc233894000 \h </w:instrText>
             </w:r>
             <w:r>
               <w:rPr>
@@ -967,12 +962,10 @@
               <w:rFonts w:asciiTheme="minorHAnsi" w:eastAsiaTheme="minorEastAsia" w:hAnsiTheme="minorHAnsi" w:cstheme="minorBidi"/>
               <w:noProof/>
               <w:color w:val="auto"/>
-              <w:kern w:val="2"/>
-              <w:szCs w:val="24"/>
-              <w14:ligatures w14:val="standardContextual"/>
+              <w:sz w:val="22"/>
             </w:rPr>
           </w:pPr>
-          <w:hyperlink w:anchor="_Toc233832129" w:history="1">
+          <w:hyperlink w:anchor="_Toc233894001" w:history="1">
             <w:r>
               <w:rPr>
                 <w:rStyle w:val="Hyperlink"/>
@@ -999,7 +992,7 @@
                 <w:noProof/>
                 <w:webHidden/>
               </w:rPr>
-              <w:instrText xml:space="preserve"> PAGEREF _Toc233832129 \h </w:instrText>
+              <w:instrText xml:space="preserve"> PAGEREF _Toc233894001 \h </w:instrText>
             </w:r>
             <w:r>
               <w:rPr>
@@ -1040,12 +1033,10 @@
               <w:rFonts w:asciiTheme="minorHAnsi" w:eastAsiaTheme="minorEastAsia" w:hAnsiTheme="minorHAnsi" w:cstheme="minorBidi"/>
               <w:noProof/>
               <w:color w:val="auto"/>
-              <w:kern w:val="2"/>
-              <w:szCs w:val="24"/>
-              <w14:ligatures w14:val="standardContextual"/>
+              <w:sz w:val="22"/>
             </w:rPr>
           </w:pPr>
-          <w:hyperlink w:anchor="_Toc233832130" w:history="1">
+          <w:hyperlink w:anchor="_Toc233894002" w:history="1">
             <w:r>
               <w:rPr>
                 <w:rStyle w:val="Hyperlink"/>
@@ -1072,7 +1063,7 @@
                 <w:noProof/>
                 <w:webHidden/>
               </w:rPr>
-              <w:instrText xml:space="preserve"> PAGEREF _Toc233832130 \h </w:instrText>
+              <w:instrText xml:space="preserve"> PAGEREF _Toc233894002 \h </w:instrText>
             </w:r>
             <w:r>
               <w:rPr>
@@ -1113,12 +1104,10 @@
               <w:rFonts w:asciiTheme="minorHAnsi" w:eastAsiaTheme="minorEastAsia" w:hAnsiTheme="minorHAnsi" w:cstheme="minorBidi"/>
               <w:noProof/>
               <w:color w:val="auto"/>
-              <w:kern w:val="2"/>
-              <w:szCs w:val="24"/>
-              <w14:ligatures w14:val="standardContextual"/>
+              <w:sz w:val="22"/>
             </w:rPr>
           </w:pPr>
-          <w:hyperlink w:anchor="_Toc233832131" w:history="1">
+          <w:hyperlink w:anchor="_Toc233894003" w:history="1">
             <w:r>
               <w:rPr>
                 <w:rStyle w:val="Hyperlink"/>
@@ -1145,7 +1134,7 @@
                 <w:noProof/>
                 <w:webHidden/>
               </w:rPr>
-              <w:instrText xml:space="preserve"> PAGEREF _Toc233832131 \h </w:instrText>
+              <w:instrText xml:space="preserve"> PAGEREF _Toc233894003 \h </w:instrText>
             </w:r>
             <w:r>
               <w:rPr>
@@ -1186,12 +1175,10 @@
               <w:rFonts w:asciiTheme="minorHAnsi" w:eastAsiaTheme="minorEastAsia" w:hAnsiTheme="minorHAnsi" w:cstheme="minorBidi"/>
               <w:noProof/>
               <w:color w:val="auto"/>
-              <w:kern w:val="2"/>
-              <w:szCs w:val="24"/>
-              <w14:ligatures w14:val="standardContextual"/>
+              <w:sz w:val="22"/>
             </w:rPr>
           </w:pPr>
-          <w:hyperlink w:anchor="_Toc233832132" w:history="1">
+          <w:hyperlink w:anchor="_Toc233894004" w:history="1">
             <w:r>
               <w:rPr>
                 <w:rStyle w:val="Hyperlink"/>
@@ -1218,7 +1205,7 @@
                 <w:noProof/>
                 <w:webHidden/>
               </w:rPr>
-              <w:instrText xml:space="preserve"> PAGEREF _Toc233832132 \h </w:instrText>
+              <w:instrText xml:space="preserve"> PAGEREF _Toc233894004 \h </w:instrText>
             </w:r>
             <w:r>
               <w:rPr>
@@ -1259,12 +1246,10 @@
               <w:rFonts w:asciiTheme="minorHAnsi" w:eastAsiaTheme="minorEastAsia" w:hAnsiTheme="minorHAnsi" w:cstheme="minorBidi"/>
               <w:noProof/>
               <w:color w:val="auto"/>
-              <w:kern w:val="2"/>
-              <w:szCs w:val="24"/>
-              <w14:ligatures w14:val="standardContextual"/>
+              <w:sz w:val="22"/>
             </w:rPr>
           </w:pPr>
-          <w:hyperlink w:anchor="_Toc233832133" w:history="1">
+          <w:hyperlink w:anchor="_Toc233894005" w:history="1">
             <w:r>
               <w:rPr>
                 <w:rStyle w:val="Hyperlink"/>
@@ -1291,7 +1276,7 @@
                 <w:noProof/>
                 <w:webHidden/>
               </w:rPr>
-              <w:instrText xml:space="preserve"> PAGEREF _Toc233832133 \h </w:instrText>
+              <w:instrText xml:space="preserve"> PAGEREF _Toc233894005 \h </w:instrText>
             </w:r>
             <w:r>
               <w:rPr>
@@ -1332,12 +1317,10 @@
               <w:rFonts w:asciiTheme="minorHAnsi" w:eastAsiaTheme="minorEastAsia" w:hAnsiTheme="minorHAnsi" w:cstheme="minorBidi"/>
               <w:noProof/>
               <w:color w:val="auto"/>
-              <w:kern w:val="2"/>
-              <w:szCs w:val="24"/>
-              <w14:ligatures w14:val="standardContextual"/>
+              <w:sz w:val="22"/>
             </w:rPr>
           </w:pPr>
-          <w:hyperlink w:anchor="_Toc233832134" w:history="1">
+          <w:hyperlink w:anchor="_Toc233894006" w:history="1">
             <w:r>
               <w:rPr>
                 <w:rStyle w:val="Hyperlink"/>
@@ -1364,7 +1347,7 @@
                 <w:noProof/>
                 <w:webHidden/>
               </w:rPr>
-              <w:instrText xml:space="preserve"> PAGEREF _Toc233832134 \h </w:instrText>
+              <w:instrText xml:space="preserve"> PAGEREF _Toc233894006 \h </w:instrText>
             </w:r>
             <w:r>
               <w:rPr>
@@ -1405,12 +1388,10 @@
               <w:rFonts w:asciiTheme="minorHAnsi" w:eastAsiaTheme="minorEastAsia" w:hAnsiTheme="minorHAnsi" w:cstheme="minorBidi"/>
               <w:noProof/>
               <w:color w:val="auto"/>
-              <w:kern w:val="2"/>
-              <w:szCs w:val="24"/>
-              <w14:ligatures w14:val="standardContextual"/>
+              <w:sz w:val="22"/>
             </w:rPr>
           </w:pPr>
-          <w:hyperlink w:anchor="_Toc233832135" w:history="1">
+          <w:hyperlink w:anchor="_Toc233894007" w:history="1">
             <w:r>
               <w:rPr>
                 <w:rStyle w:val="Hyperlink"/>
@@ -1437,7 +1418,7 @@
                 <w:noProof/>
                 <w:webHidden/>
               </w:rPr>
-              <w:instrText xml:space="preserve"> PAGEREF _Toc233832135 \h </w:instrText>
+              <w:instrText xml:space="preserve"> PAGEREF _Toc233894007 \h </w:instrText>
             </w:r>
             <w:r>
               <w:rPr>
@@ -1478,12 +1459,10 @@
               <w:rFonts w:asciiTheme="minorHAnsi" w:eastAsiaTheme="minorEastAsia" w:hAnsiTheme="minorHAnsi" w:cstheme="minorBidi"/>
               <w:noProof/>
               <w:color w:val="auto"/>
-              <w:kern w:val="2"/>
-              <w:szCs w:val="24"/>
-              <w14:ligatures w14:val="standardContextual"/>
+              <w:sz w:val="22"/>
             </w:rPr>
           </w:pPr>
-          <w:hyperlink w:anchor="_Toc233832136" w:history="1">
+          <w:hyperlink w:anchor="_Toc233894008" w:history="1">
             <w:r>
               <w:rPr>
                 <w:rStyle w:val="Hyperlink"/>
@@ -1510,7 +1489,7 @@
                 <w:noProof/>
                 <w:webHidden/>
               </w:rPr>
-              <w:instrText xml:space="preserve"> PAGEREF _Toc233832136 \h </w:instrText>
+              <w:instrText xml:space="preserve"> PAGEREF _Toc233894008 \h </w:instrText>
             </w:r>
             <w:r>
               <w:rPr>
@@ -1551,12 +1530,10 @@
               <w:rFonts w:asciiTheme="minorHAnsi" w:eastAsiaTheme="minorEastAsia" w:hAnsiTheme="minorHAnsi" w:cstheme="minorBidi"/>
               <w:noProof/>
               <w:color w:val="auto"/>
-              <w:kern w:val="2"/>
-              <w:szCs w:val="24"/>
-              <w14:ligatures w14:val="standardContextual"/>
+              <w:sz w:val="22"/>
             </w:rPr>
           </w:pPr>
-          <w:hyperlink w:anchor="_Toc233832137" w:history="1">
+          <w:hyperlink w:anchor="_Toc233894009" w:history="1">
             <w:r>
               <w:rPr>
                 <w:rStyle w:val="Hyperlink"/>
@@ -1583,7 +1560,7 @@
                 <w:noProof/>
                 <w:webHidden/>
               </w:rPr>
-              <w:instrText xml:space="preserve"> PAGEREF _Toc233832137 \h </w:instrText>
+              <w:instrText xml:space="preserve"> PAGEREF _Toc233894009 \h </w:instrText>
             </w:r>
             <w:r>
               <w:rPr>
@@ -1624,12 +1601,10 @@
               <w:rFonts w:asciiTheme="minorHAnsi" w:eastAsiaTheme="minorEastAsia" w:hAnsiTheme="minorHAnsi" w:cstheme="minorBidi"/>
               <w:noProof/>
               <w:color w:val="auto"/>
-              <w:kern w:val="2"/>
-              <w:szCs w:val="24"/>
-              <w14:ligatures w14:val="standardContextual"/>
+              <w:sz w:val="22"/>
             </w:rPr>
           </w:pPr>
-          <w:hyperlink w:anchor="_Toc233832138" w:history="1">
+          <w:hyperlink w:anchor="_Toc233894010" w:history="1">
             <w:r>
               <w:rPr>
                 <w:rStyle w:val="Hyperlink"/>
@@ -1656,7 +1631,7 @@
                 <w:noProof/>
                 <w:webHidden/>
               </w:rPr>
-              <w:instrText xml:space="preserve"> PAGEREF _Toc233832138 \h </w:instrText>
+              <w:instrText xml:space="preserve"> PAGEREF _Toc233894010 \h </w:instrText>
             </w:r>
             <w:r>
               <w:rPr>
@@ -1697,12 +1672,10 @@
               <w:rFonts w:asciiTheme="minorHAnsi" w:eastAsiaTheme="minorEastAsia" w:hAnsiTheme="minorHAnsi" w:cstheme="minorBidi"/>
               <w:noProof/>
               <w:color w:val="auto"/>
-              <w:kern w:val="2"/>
-              <w:szCs w:val="24"/>
-              <w14:ligatures w14:val="standardContextual"/>
+              <w:sz w:val="22"/>
             </w:rPr>
           </w:pPr>
-          <w:hyperlink w:anchor="_Toc233832139" w:history="1">
+          <w:hyperlink w:anchor="_Toc233894011" w:history="1">
             <w:r>
               <w:rPr>
                 <w:rStyle w:val="Hyperlink"/>
@@ -1729,7 +1702,7 @@
                 <w:noProof/>
                 <w:webHidden/>
               </w:rPr>
-              <w:instrText xml:space="preserve"> PAGEREF _Toc233832139 \h </w:instrText>
+              <w:instrText xml:space="preserve"> PAGEREF _Toc233894011 \h </w:instrText>
             </w:r>
             <w:r>
               <w:rPr>
@@ -1770,12 +1743,10 @@
               <w:rFonts w:asciiTheme="minorHAnsi" w:eastAsiaTheme="minorEastAsia" w:hAnsiTheme="minorHAnsi" w:cstheme="minorBidi"/>
               <w:noProof/>
               <w:color w:val="auto"/>
-              <w:kern w:val="2"/>
-              <w:szCs w:val="24"/>
-              <w14:ligatures w14:val="standardContextual"/>
+              <w:sz w:val="22"/>
             </w:rPr>
           </w:pPr>
-          <w:hyperlink w:anchor="_Toc233832140" w:history="1">
+          <w:hyperlink w:anchor="_Toc233894012" w:history="1">
             <w:r>
               <w:rPr>
                 <w:rStyle w:val="Hyperlink"/>
@@ -1802,7 +1773,7 @@
                 <w:noProof/>
                 <w:webHidden/>
               </w:rPr>
-              <w:instrText xml:space="preserve"> PAGEREF _Toc233832140 \h </w:instrText>
+              <w:instrText xml:space="preserve"> PAGEREF _Toc233894012 \h </w:instrText>
             </w:r>
             <w:r>
               <w:rPr>
@@ -1843,12 +1814,10 @@
               <w:rFonts w:asciiTheme="minorHAnsi" w:eastAsiaTheme="minorEastAsia" w:hAnsiTheme="minorHAnsi" w:cstheme="minorBidi"/>
               <w:noProof/>
               <w:color w:val="auto"/>
-              <w:kern w:val="2"/>
-              <w:szCs w:val="24"/>
-              <w14:ligatures w14:val="standardContextual"/>
+              <w:sz w:val="22"/>
             </w:rPr>
           </w:pPr>
-          <w:hyperlink w:anchor="_Toc233832141" w:history="1">
+          <w:hyperlink w:anchor="_Toc233894013" w:history="1">
             <w:r>
               <w:rPr>
                 <w:rStyle w:val="Hyperlink"/>
@@ -1875,7 +1844,7 @@
                 <w:noProof/>
                 <w:webHidden/>
               </w:rPr>
-              <w:instrText xml:space="preserve"> PAGEREF _Toc233832141 \h </w:instrText>
+              <w:instrText xml:space="preserve"> PAGEREF _Toc233894013 \h </w:instrText>
             </w:r>
             <w:r>
               <w:rPr>
@@ -1916,12 +1885,10 @@
               <w:rFonts w:asciiTheme="minorHAnsi" w:eastAsiaTheme="minorEastAsia" w:hAnsiTheme="minorHAnsi" w:cstheme="minorBidi"/>
               <w:noProof/>
               <w:color w:val="auto"/>
-              <w:kern w:val="2"/>
-              <w:szCs w:val="24"/>
-              <w14:ligatures w14:val="standardContextual"/>
+              <w:sz w:val="22"/>
             </w:rPr>
           </w:pPr>
-          <w:hyperlink w:anchor="_Toc233832142" w:history="1">
+          <w:hyperlink w:anchor="_Toc233894014" w:history="1">
             <w:r>
               <w:rPr>
                 <w:rStyle w:val="Hyperlink"/>
@@ -1948,7 +1915,7 @@
                 <w:noProof/>
                 <w:webHidden/>
               </w:rPr>
-              <w:instrText xml:space="preserve"> PAGEREF _Toc233832142 \h </w:instrText>
+              <w:instrText xml:space="preserve"> PAGEREF _Toc233894014 \h </w:instrText>
             </w:r>
             <w:r>
               <w:rPr>
@@ -1989,12 +1956,10 @@
               <w:rFonts w:asciiTheme="minorHAnsi" w:eastAsiaTheme="minorEastAsia" w:hAnsiTheme="minorHAnsi" w:cstheme="minorBidi"/>
               <w:noProof/>
               <w:color w:val="auto"/>
-              <w:kern w:val="2"/>
-              <w:szCs w:val="24"/>
-              <w14:ligatures w14:val="standardContextual"/>
+              <w:sz w:val="22"/>
             </w:rPr>
           </w:pPr>
-          <w:hyperlink w:anchor="_Toc233832143" w:history="1">
+          <w:hyperlink w:anchor="_Toc233894015" w:history="1">
             <w:r>
               <w:rPr>
                 <w:rStyle w:val="Hyperlink"/>
@@ -2021,7 +1986,7 @@
                 <w:noProof/>
                 <w:webHidden/>
               </w:rPr>
-              <w:instrText xml:space="preserve"> PAGEREF _Toc233832143 \h </w:instrText>
+              <w:instrText xml:space="preserve"> PAGEREF _Toc233894015 \h </w:instrText>
             </w:r>
             <w:r>
               <w:rPr>
@@ -2062,12 +2027,10 @@
               <w:rFonts w:asciiTheme="minorHAnsi" w:eastAsiaTheme="minorEastAsia" w:hAnsiTheme="minorHAnsi" w:cstheme="minorBidi"/>
               <w:noProof/>
               <w:color w:val="auto"/>
-              <w:kern w:val="2"/>
-              <w:szCs w:val="24"/>
-              <w14:ligatures w14:val="standardContextual"/>
+              <w:sz w:val="22"/>
             </w:rPr>
           </w:pPr>
-          <w:hyperlink w:anchor="_Toc233832144" w:history="1">
+          <w:hyperlink w:anchor="_Toc233894016" w:history="1">
             <w:r>
               <w:rPr>
                 <w:rStyle w:val="Hyperlink"/>
@@ -2094,7 +2057,7 @@
                 <w:noProof/>
                 <w:webHidden/>
               </w:rPr>
-              <w:instrText xml:space="preserve"> PAGEREF _Toc233832144 \h </w:instrText>
+              <w:instrText xml:space="preserve"> PAGEREF _Toc233894016 \h </w:instrText>
             </w:r>
             <w:r>
               <w:rPr>
@@ -2135,12 +2098,10 @@
               <w:rFonts w:asciiTheme="minorHAnsi" w:eastAsiaTheme="minorEastAsia" w:hAnsiTheme="minorHAnsi" w:cstheme="minorBidi"/>
               <w:noProof/>
               <w:color w:val="auto"/>
-              <w:kern w:val="2"/>
-              <w:szCs w:val="24"/>
-              <w14:ligatures w14:val="standardContextual"/>
+              <w:sz w:val="22"/>
             </w:rPr>
           </w:pPr>
-          <w:hyperlink w:anchor="_Toc233832145" w:history="1">
+          <w:hyperlink w:anchor="_Toc233894017" w:history="1">
             <w:r>
               <w:rPr>
                 <w:rStyle w:val="Hyperlink"/>
@@ -2167,7 +2128,7 @@
                 <w:noProof/>
                 <w:webHidden/>
               </w:rPr>
-              <w:instrText xml:space="preserve"> PAGEREF _Toc233832145 \h </w:instrText>
+              <w:instrText xml:space="preserve"> PAGEREF _Toc233894017 \h </w:instrText>
             </w:r>
             <w:r>
               <w:rPr>
@@ -2208,12 +2169,10 @@
               <w:rFonts w:asciiTheme="minorHAnsi" w:eastAsiaTheme="minorEastAsia" w:hAnsiTheme="minorHAnsi" w:cstheme="minorBidi"/>
               <w:noProof/>
               <w:color w:val="auto"/>
-              <w:kern w:val="2"/>
-              <w:szCs w:val="24"/>
-              <w14:ligatures w14:val="standardContextual"/>
+              <w:sz w:val="22"/>
             </w:rPr>
           </w:pPr>
-          <w:hyperlink w:anchor="_Toc233832146" w:history="1">
+          <w:hyperlink w:anchor="_Toc233894018" w:history="1">
             <w:r>
               <w:rPr>
                 <w:rStyle w:val="Hyperlink"/>
@@ -2240,7 +2199,7 @@
                 <w:noProof/>
                 <w:webHidden/>
               </w:rPr>
-              <w:instrText xml:space="preserve"> PAGEREF _Toc233832146 \h </w:instrText>
+              <w:instrText xml:space="preserve"> PAGEREF _Toc233894018 \h </w:instrText>
             </w:r>
             <w:r>
               <w:rPr>
@@ -2281,12 +2240,10 @@
               <w:rFonts w:asciiTheme="minorHAnsi" w:eastAsiaTheme="minorEastAsia" w:hAnsiTheme="minorHAnsi" w:cstheme="minorBidi"/>
               <w:noProof/>
               <w:color w:val="auto"/>
-              <w:kern w:val="2"/>
-              <w:szCs w:val="24"/>
-              <w14:ligatures w14:val="standardContextual"/>
+              <w:sz w:val="22"/>
             </w:rPr>
           </w:pPr>
-          <w:hyperlink w:anchor="_Toc233832147" w:history="1">
+          <w:hyperlink w:anchor="_Toc233894019" w:history="1">
             <w:r>
               <w:rPr>
                 <w:rStyle w:val="Hyperlink"/>
@@ -2313,7 +2270,7 @@
                 <w:noProof/>
                 <w:webHidden/>
               </w:rPr>
-              <w:instrText xml:space="preserve"> PAGEREF _Toc233832147 \h </w:instrText>
+              <w:instrText xml:space="preserve"> PAGEREF _Toc233894019 \h </w:instrText>
             </w:r>
             <w:r>
               <w:rPr>
@@ -2354,12 +2311,10 @@
               <w:rFonts w:asciiTheme="minorHAnsi" w:eastAsiaTheme="minorEastAsia" w:hAnsiTheme="minorHAnsi" w:cstheme="minorBidi"/>
               <w:noProof/>
               <w:color w:val="auto"/>
-              <w:kern w:val="2"/>
-              <w:szCs w:val="24"/>
-              <w14:ligatures w14:val="standardContextual"/>
+              <w:sz w:val="22"/>
             </w:rPr>
           </w:pPr>
-          <w:hyperlink w:anchor="_Toc233832148" w:history="1">
+          <w:hyperlink w:anchor="_Toc233894020" w:history="1">
             <w:r>
               <w:rPr>
                 <w:rStyle w:val="Hyperlink"/>
@@ -2386,7 +2341,7 @@
                 <w:noProof/>
                 <w:webHidden/>
               </w:rPr>
-              <w:instrText xml:space="preserve"> PAGEREF _Toc233832148 \h </w:instrText>
+              <w:instrText xml:space="preserve"> PAGEREF _Toc233894020 \h </w:instrText>
             </w:r>
             <w:r>
               <w:rPr>
@@ -2427,12 +2382,10 @@
               <w:rFonts w:asciiTheme="minorHAnsi" w:eastAsiaTheme="minorEastAsia" w:hAnsiTheme="minorHAnsi" w:cstheme="minorBidi"/>
               <w:noProof/>
               <w:color w:val="auto"/>
-              <w:kern w:val="2"/>
-              <w:szCs w:val="24"/>
-              <w14:ligatures w14:val="standardContextual"/>
+              <w:sz w:val="22"/>
             </w:rPr>
           </w:pPr>
-          <w:hyperlink w:anchor="_Toc233832149" w:history="1">
+          <w:hyperlink w:anchor="_Toc233894021" w:history="1">
             <w:r>
               <w:rPr>
                 <w:rStyle w:val="Hyperlink"/>
@@ -2459,7 +2412,7 @@
                 <w:noProof/>
                 <w:webHidden/>
               </w:rPr>
-              <w:instrText xml:space="preserve"> PAGEREF _Toc233832149 \h </w:instrText>
+              <w:instrText xml:space="preserve"> PAGEREF _Toc233894021 \h </w:instrText>
             </w:r>
             <w:r>
               <w:rPr>
@@ -2500,12 +2453,10 @@
               <w:rFonts w:asciiTheme="minorHAnsi" w:eastAsiaTheme="minorEastAsia" w:hAnsiTheme="minorHAnsi" w:cstheme="minorBidi"/>
               <w:noProof/>
               <w:color w:val="auto"/>
-              <w:kern w:val="2"/>
-              <w:szCs w:val="24"/>
-              <w14:ligatures w14:val="standardContextual"/>
+              <w:sz w:val="22"/>
             </w:rPr>
           </w:pPr>
-          <w:hyperlink w:anchor="_Toc233832150" w:history="1">
+          <w:hyperlink w:anchor="_Toc233894022" w:history="1">
             <w:r>
               <w:rPr>
                 <w:rStyle w:val="Hyperlink"/>
@@ -2532,7 +2483,7 @@
                 <w:noProof/>
                 <w:webHidden/>
               </w:rPr>
-              <w:instrText xml:space="preserve"> PAGEREF _Toc233832150 \h </w:instrText>
+              <w:instrText xml:space="preserve"> PAGEREF _Toc233894022 \h </w:instrText>
             </w:r>
             <w:r>
               <w:rPr>
@@ -2573,12 +2524,10 @@
               <w:rFonts w:asciiTheme="minorHAnsi" w:eastAsiaTheme="minorEastAsia" w:hAnsiTheme="minorHAnsi" w:cstheme="minorBidi"/>
               <w:noProof/>
               <w:color w:val="auto"/>
-              <w:kern w:val="2"/>
-              <w:szCs w:val="24"/>
-              <w14:ligatures w14:val="standardContextual"/>
+              <w:sz w:val="22"/>
             </w:rPr>
           </w:pPr>
-          <w:hyperlink w:anchor="_Toc233832151" w:history="1">
+          <w:hyperlink w:anchor="_Toc233894023" w:history="1">
             <w:r>
               <w:rPr>
                 <w:rStyle w:val="Hyperlink"/>
@@ -2605,7 +2554,7 @@
                 <w:noProof/>
                 <w:webHidden/>
               </w:rPr>
-              <w:instrText xml:space="preserve"> PAGEREF _Toc233832151 \h </w:instrText>
+              <w:instrText xml:space="preserve"> PAGEREF _Toc233894023 \h </w:instrText>
             </w:r>
             <w:r>
               <w:rPr>
@@ -2646,12 +2595,10 @@
               <w:rFonts w:asciiTheme="minorHAnsi" w:eastAsiaTheme="minorEastAsia" w:hAnsiTheme="minorHAnsi" w:cstheme="minorBidi"/>
               <w:noProof/>
               <w:color w:val="auto"/>
-              <w:kern w:val="2"/>
-              <w:szCs w:val="24"/>
-              <w14:ligatures w14:val="standardContextual"/>
+              <w:sz w:val="22"/>
             </w:rPr>
           </w:pPr>
-          <w:hyperlink w:anchor="_Toc233832152" w:history="1">
+          <w:hyperlink w:anchor="_Toc233894024" w:history="1">
             <w:r>
               <w:rPr>
                 <w:rStyle w:val="Hyperlink"/>
@@ -2678,7 +2625,7 @@
                 <w:noProof/>
                 <w:webHidden/>
               </w:rPr>
-              <w:instrText xml:space="preserve"> PAGEREF _Toc233832152 \h </w:instrText>
+              <w:instrText xml:space="preserve"> PAGEREF _Toc233894024 \h </w:instrText>
             </w:r>
             <w:r>
               <w:rPr>
@@ -2719,12 +2666,10 @@
               <w:rFonts w:asciiTheme="minorHAnsi" w:eastAsiaTheme="minorEastAsia" w:hAnsiTheme="minorHAnsi" w:cstheme="minorBidi"/>
               <w:noProof/>
               <w:color w:val="auto"/>
-              <w:kern w:val="2"/>
-              <w:szCs w:val="24"/>
-              <w14:ligatures w14:val="standardContextual"/>
+              <w:sz w:val="22"/>
             </w:rPr>
           </w:pPr>
-          <w:hyperlink w:anchor="_Toc233832153" w:history="1">
+          <w:hyperlink w:anchor="_Toc233894025" w:history="1">
             <w:r>
               <w:rPr>
                 <w:rStyle w:val="Hyperlink"/>
@@ -2751,7 +2696,7 @@
                 <w:noProof/>
                 <w:webHidden/>
               </w:rPr>
-              <w:instrText xml:space="preserve"> PAGEREF _Toc233832153 \h </w:instrText>
+              <w:instrText xml:space="preserve"> PAGEREF _Toc233894025 \h </w:instrText>
             </w:r>
             <w:r>
               <w:rPr>
@@ -2792,12 +2737,10 @@
               <w:rFonts w:asciiTheme="minorHAnsi" w:eastAsiaTheme="minorEastAsia" w:hAnsiTheme="minorHAnsi" w:cstheme="minorBidi"/>
               <w:noProof/>
               <w:color w:val="auto"/>
-              <w:kern w:val="2"/>
-              <w:szCs w:val="24"/>
-              <w14:ligatures w14:val="standardContextual"/>
+              <w:sz w:val="22"/>
             </w:rPr>
           </w:pPr>
-          <w:hyperlink w:anchor="_Toc233832154" w:history="1">
+          <w:hyperlink w:anchor="_Toc233894026" w:history="1">
             <w:r>
               <w:rPr>
                 <w:rStyle w:val="Hyperlink"/>
@@ -2824,7 +2767,7 @@
                 <w:noProof/>
                 <w:webHidden/>
               </w:rPr>
-              <w:instrText xml:space="preserve"> PAGEREF _Toc233832154 \h </w:instrText>
+              <w:instrText xml:space="preserve"> PAGEREF _Toc233894026 \h </w:instrText>
             </w:r>
             <w:r>
               <w:rPr>
@@ -2865,12 +2808,10 @@
               <w:rFonts w:asciiTheme="minorHAnsi" w:eastAsiaTheme="minorEastAsia" w:hAnsiTheme="minorHAnsi" w:cstheme="minorBidi"/>
               <w:noProof/>
               <w:color w:val="auto"/>
-              <w:kern w:val="2"/>
-              <w:szCs w:val="24"/>
-              <w14:ligatures w14:val="standardContextual"/>
+              <w:sz w:val="22"/>
             </w:rPr>
           </w:pPr>
-          <w:hyperlink w:anchor="_Toc233832155" w:history="1">
+          <w:hyperlink w:anchor="_Toc233894027" w:history="1">
             <w:r>
               <w:rPr>
                 <w:rStyle w:val="Hyperlink"/>
@@ -2897,7 +2838,7 @@
                 <w:noProof/>
                 <w:webHidden/>
               </w:rPr>
-              <w:instrText xml:space="preserve"> PAGEREF _Toc233832155 \h </w:instrText>
+              <w:instrText xml:space="preserve"> PAGEREF _Toc233894027 \h </w:instrText>
             </w:r>
             <w:r>
               <w:rPr>
@@ -2938,12 +2879,10 @@
               <w:rFonts w:asciiTheme="minorHAnsi" w:eastAsiaTheme="minorEastAsia" w:hAnsiTheme="minorHAnsi" w:cstheme="minorBidi"/>
               <w:noProof/>
               <w:color w:val="auto"/>
-              <w:kern w:val="2"/>
-              <w:szCs w:val="24"/>
-              <w14:ligatures w14:val="standardContextual"/>
+              <w:sz w:val="22"/>
             </w:rPr>
           </w:pPr>
-          <w:hyperlink w:anchor="_Toc233832156" w:history="1">
+          <w:hyperlink w:anchor="_Toc233894028" w:history="1">
             <w:r>
               <w:rPr>
                 <w:rStyle w:val="Hyperlink"/>
@@ -2970,7 +2909,7 @@
                 <w:noProof/>
                 <w:webHidden/>
               </w:rPr>
-              <w:instrText xml:space="preserve"> PAGEREF _Toc233832156 \h </w:instrText>
+              <w:instrText xml:space="preserve"> PAGEREF _Toc233894028 \h </w:instrText>
             </w:r>
             <w:r>
               <w:rPr>
@@ -3011,12 +2950,10 @@
               <w:rFonts w:asciiTheme="minorHAnsi" w:eastAsiaTheme="minorEastAsia" w:hAnsiTheme="minorHAnsi" w:cstheme="minorBidi"/>
               <w:noProof/>
               <w:color w:val="auto"/>
-              <w:kern w:val="2"/>
-              <w:szCs w:val="24"/>
-              <w14:ligatures w14:val="standardContextual"/>
+              <w:sz w:val="22"/>
             </w:rPr>
           </w:pPr>
-          <w:hyperlink w:anchor="_Toc233832157" w:history="1">
+          <w:hyperlink w:anchor="_Toc233894029" w:history="1">
             <w:r>
               <w:rPr>
                 <w:rStyle w:val="Hyperlink"/>
@@ -3043,7 +2980,7 @@
                 <w:noProof/>
                 <w:webHidden/>
               </w:rPr>
-              <w:instrText xml:space="preserve"> PAGEREF _Toc233832157 \h </w:instrText>
+              <w:instrText xml:space="preserve"> PAGEREF _Toc233894029 \h </w:instrText>
             </w:r>
             <w:r>
               <w:rPr>
@@ -3084,12 +3021,10 @@
               <w:rFonts w:asciiTheme="minorHAnsi" w:eastAsiaTheme="minorEastAsia" w:hAnsiTheme="minorHAnsi" w:cstheme="minorBidi"/>
               <w:noProof/>
               <w:color w:val="auto"/>
-              <w:kern w:val="2"/>
-              <w:szCs w:val="24"/>
-              <w14:ligatures w14:val="standardContextual"/>
+              <w:sz w:val="22"/>
             </w:rPr>
           </w:pPr>
-          <w:hyperlink w:anchor="_Toc233832158" w:history="1">
+          <w:hyperlink w:anchor="_Toc233894030" w:history="1">
             <w:r>
               <w:rPr>
                 <w:rStyle w:val="Hyperlink"/>
@@ -3116,7 +3051,7 @@
                 <w:noProof/>
                 <w:webHidden/>
               </w:rPr>
-              <w:instrText xml:space="preserve"> PAGEREF _Toc233832158 \h </w:instrText>
+              <w:instrText xml:space="preserve"> PAGEREF _Toc233894030 \h </w:instrText>
             </w:r>
             <w:r>
               <w:rPr>
@@ -3157,12 +3092,10 @@
               <w:rFonts w:asciiTheme="minorHAnsi" w:eastAsiaTheme="minorEastAsia" w:hAnsiTheme="minorHAnsi" w:cstheme="minorBidi"/>
               <w:noProof/>
               <w:color w:val="auto"/>
-              <w:kern w:val="2"/>
-              <w:szCs w:val="24"/>
-              <w14:ligatures w14:val="standardContextual"/>
+              <w:sz w:val="22"/>
             </w:rPr>
           </w:pPr>
-          <w:hyperlink w:anchor="_Toc233832159" w:history="1">
+          <w:hyperlink w:anchor="_Toc233894031" w:history="1">
             <w:r>
               <w:rPr>
                 <w:rStyle w:val="Hyperlink"/>
@@ -3189,7 +3122,7 @@
                 <w:noProof/>
                 <w:webHidden/>
               </w:rPr>
-              <w:instrText xml:space="preserve"> PAGEREF _Toc233832159 \h </w:instrText>
+              <w:instrText xml:space="preserve"> PAGEREF _Toc233894031 \h </w:instrText>
             </w:r>
             <w:r>
               <w:rPr>
@@ -3230,12 +3163,10 @@
               <w:rFonts w:asciiTheme="minorHAnsi" w:eastAsiaTheme="minorEastAsia" w:hAnsiTheme="minorHAnsi" w:cstheme="minorBidi"/>
               <w:noProof/>
               <w:color w:val="auto"/>
-              <w:kern w:val="2"/>
-              <w:szCs w:val="24"/>
-              <w14:ligatures w14:val="standardContextual"/>
+              <w:sz w:val="22"/>
             </w:rPr>
           </w:pPr>
-          <w:hyperlink w:anchor="_Toc233832160" w:history="1">
+          <w:hyperlink w:anchor="_Toc233894032" w:history="1">
             <w:r>
               <w:rPr>
                 <w:rStyle w:val="Hyperlink"/>
@@ -3262,7 +3193,7 @@
                 <w:noProof/>
                 <w:webHidden/>
               </w:rPr>
-              <w:instrText xml:space="preserve"> PAGEREF _Toc233832160 \h </w:instrText>
+              <w:instrText xml:space="preserve"> PAGEREF _Toc233894032 \h </w:instrText>
             </w:r>
             <w:r>
               <w:rPr>
@@ -3303,12 +3234,10 @@
               <w:rFonts w:asciiTheme="minorHAnsi" w:eastAsiaTheme="minorEastAsia" w:hAnsiTheme="minorHAnsi" w:cstheme="minorBidi"/>
               <w:noProof/>
               <w:color w:val="auto"/>
-              <w:kern w:val="2"/>
-              <w:szCs w:val="24"/>
-              <w14:ligatures w14:val="standardContextual"/>
+              <w:sz w:val="22"/>
             </w:rPr>
           </w:pPr>
-          <w:hyperlink w:anchor="_Toc233832161" w:history="1">
+          <w:hyperlink w:anchor="_Toc233894033" w:history="1">
             <w:r>
               <w:rPr>
                 <w:rStyle w:val="Hyperlink"/>
@@ -3335,7 +3264,7 @@
                 <w:noProof/>
                 <w:webHidden/>
               </w:rPr>
-              <w:instrText xml:space="preserve"> PAGEREF _Toc233832161 \h </w:instrText>
+              <w:instrText xml:space="preserve"> PAGEREF _Toc233894033 \h </w:instrText>
             </w:r>
             <w:r>
               <w:rPr>
@@ -3376,12 +3305,10 @@
               <w:rFonts w:asciiTheme="minorHAnsi" w:eastAsiaTheme="minorEastAsia" w:hAnsiTheme="minorHAnsi" w:cstheme="minorBidi"/>
               <w:noProof/>
               <w:color w:val="auto"/>
-              <w:kern w:val="2"/>
-              <w:szCs w:val="24"/>
-              <w14:ligatures w14:val="standardContextual"/>
+              <w:sz w:val="22"/>
             </w:rPr>
           </w:pPr>
-          <w:hyperlink w:anchor="_Toc233832162" w:history="1">
+          <w:hyperlink w:anchor="_Toc233894034" w:history="1">
             <w:r>
               <w:rPr>
                 <w:rStyle w:val="Hyperlink"/>
@@ -3408,7 +3335,7 @@
                 <w:noProof/>
                 <w:webHidden/>
               </w:rPr>
-              <w:instrText xml:space="preserve"> PAGEREF _Toc233832162 \h </w:instrText>
+              <w:instrText xml:space="preserve"> PAGEREF _Toc233894034 \h </w:instrText>
             </w:r>
             <w:r>
               <w:rPr>
@@ -3449,12 +3376,10 @@
               <w:rFonts w:asciiTheme="minorHAnsi" w:eastAsiaTheme="minorEastAsia" w:hAnsiTheme="minorHAnsi" w:cstheme="minorBidi"/>
               <w:noProof/>
               <w:color w:val="auto"/>
-              <w:kern w:val="2"/>
-              <w:szCs w:val="24"/>
-              <w14:ligatures w14:val="standardContextual"/>
+              <w:sz w:val="22"/>
             </w:rPr>
           </w:pPr>
-          <w:hyperlink w:anchor="_Toc233832163" w:history="1">
+          <w:hyperlink w:anchor="_Toc233894035" w:history="1">
             <w:r>
               <w:rPr>
                 <w:rStyle w:val="Hyperlink"/>
@@ -3481,7 +3406,7 @@
                 <w:noProof/>
                 <w:webHidden/>
               </w:rPr>
-              <w:instrText xml:space="preserve"> PAGEREF _Toc233832163 \h </w:instrText>
+              <w:instrText xml:space="preserve"> PAGEREF _Toc233894035 \h </w:instrText>
             </w:r>
             <w:r>
               <w:rPr>
@@ -3501,7 +3426,149 @@
                 <w:noProof/>
                 <w:webHidden/>
               </w:rPr>
-              <w:t>26</w:t>
+              <w:t>27</w:t>
+            </w:r>
+            <w:r>
+              <w:rPr>
+                <w:noProof/>
+                <w:webHidden/>
+              </w:rPr>
+              <w:fldChar w:fldCharType="end"/>
+            </w:r>
+          </w:hyperlink>
+        </w:p>
+        <w:p>
+          <w:pPr>
+            <w:pStyle w:val="Sumrio2"/>
+            <w:tabs>
+              <w:tab w:val="right" w:leader="dot" w:pos="9060"/>
+            </w:tabs>
+            <w:rPr>
+              <w:rFonts w:asciiTheme="minorHAnsi" w:eastAsiaTheme="minorEastAsia" w:hAnsiTheme="minorHAnsi" w:cstheme="minorBidi"/>
+              <w:noProof/>
+              <w:color w:val="auto"/>
+              <w:sz w:val="22"/>
+            </w:rPr>
+          </w:pPr>
+          <w:hyperlink w:anchor="_Toc233894036" w:history="1">
+            <w:r>
+              <w:rPr>
+                <w:rStyle w:val="Hyperlink"/>
+                <w:noProof/>
+              </w:rPr>
+              <w:t>2.7.5 EXEMPLO DE RESPOSTA</w:t>
+            </w:r>
+            <w:r>
+              <w:rPr>
+                <w:noProof/>
+                <w:webHidden/>
+              </w:rPr>
+              <w:tab/>
+            </w:r>
+            <w:r>
+              <w:rPr>
+                <w:noProof/>
+                <w:webHidden/>
+              </w:rPr>
+              <w:fldChar w:fldCharType="begin"/>
+            </w:r>
+            <w:r>
+              <w:rPr>
+                <w:noProof/>
+                <w:webHidden/>
+              </w:rPr>
+              <w:instrText xml:space="preserve"> PAGEREF _Toc233894036 \h </w:instrText>
+            </w:r>
+            <w:r>
+              <w:rPr>
+                <w:noProof/>
+                <w:webHidden/>
+              </w:rPr>
+            </w:r>
+            <w:r>
+              <w:rPr>
+                <w:noProof/>
+                <w:webHidden/>
+              </w:rPr>
+              <w:fldChar w:fldCharType="separate"/>
+            </w:r>
+            <w:r>
+              <w:rPr>
+                <w:noProof/>
+                <w:webHidden/>
+              </w:rPr>
+              <w:t>28</w:t>
+            </w:r>
+            <w:r>
+              <w:rPr>
+                <w:noProof/>
+                <w:webHidden/>
+              </w:rPr>
+              <w:fldChar w:fldCharType="end"/>
+            </w:r>
+          </w:hyperlink>
+        </w:p>
+        <w:p>
+          <w:pPr>
+            <w:pStyle w:val="Sumrio1"/>
+            <w:tabs>
+              <w:tab w:val="right" w:leader="dot" w:pos="9060"/>
+            </w:tabs>
+            <w:rPr>
+              <w:rFonts w:asciiTheme="minorHAnsi" w:eastAsiaTheme="minorEastAsia" w:hAnsiTheme="minorHAnsi" w:cstheme="minorBidi"/>
+              <w:noProof/>
+              <w:color w:val="auto"/>
+              <w:sz w:val="22"/>
+            </w:rPr>
+          </w:pPr>
+          <w:hyperlink w:anchor="_Toc233894037" w:history="1">
+            <w:r>
+              <w:rPr>
+                <w:rStyle w:val="Hyperlink"/>
+                <w:noProof/>
+              </w:rPr>
+              <w:t>3. MANUAL DE INSTALAÇÃO E EXECUÇÃO</w:t>
+            </w:r>
+            <w:r>
+              <w:rPr>
+                <w:noProof/>
+                <w:webHidden/>
+              </w:rPr>
+              <w:tab/>
+            </w:r>
+            <w:r>
+              <w:rPr>
+                <w:noProof/>
+                <w:webHidden/>
+              </w:rPr>
+              <w:fldChar w:fldCharType="begin"/>
+            </w:r>
+            <w:r>
+              <w:rPr>
+                <w:noProof/>
+                <w:webHidden/>
+              </w:rPr>
+              <w:instrText xml:space="preserve"> PAGEREF _Toc233894037 \h </w:instrText>
+            </w:r>
+            <w:r>
+              <w:rPr>
+                <w:noProof/>
+                <w:webHidden/>
+              </w:rPr>
+            </w:r>
+            <w:r>
+              <w:rPr>
+                <w:noProof/>
+                <w:webHidden/>
+              </w:rPr>
+              <w:fldChar w:fldCharType="separate"/>
+            </w:r>
+            <w:r>
+              <w:rPr>
+                <w:noProof/>
+                <w:webHidden/>
+              </w:rPr>
+              <w:t>28</w:t>
             </w:r>
             <w:r>
               <w:rPr>
@@ -3570,9 +3637,8 @@
         <w:pStyle w:val="Ttulo1"/>
         <w:spacing w:after="0"/>
         <w:ind w:left="-5"/>
-        <w:jc w:val="left"/>
-      </w:pPr>
-      <w:bookmarkStart w:id="0" w:name="_Toc233832125"/>
+      </w:pPr>
+      <w:bookmarkStart w:id="0" w:name="_Toc233893997"/>
       <w:r>
         <w:t>1. INTRODUÇÃO</w:t>
       </w:r>
@@ -3661,9 +3727,8 @@
         <w:pStyle w:val="Ttulo1"/>
         <w:spacing w:after="0"/>
         <w:ind w:left="-5"/>
-        <w:jc w:val="left"/>
-      </w:pPr>
-      <w:bookmarkStart w:id="1" w:name="_Toc233832126"/>
+      </w:pPr>
+      <w:bookmarkStart w:id="1" w:name="_Toc233893998"/>
       <w:r>
         <w:t>2. DESENVOLVIMENTO</w:t>
       </w:r>
@@ -3686,7 +3751,7 @@
         <w:pStyle w:val="Ttulo2"/>
         <w:ind w:left="5"/>
       </w:pPr>
-      <w:bookmarkStart w:id="2" w:name="_Toc233832127"/>
+      <w:bookmarkStart w:id="2" w:name="_Toc233893999"/>
       <w:r>
         <w:t>2.1 OBJETIVO DO SISTEMA</w:t>
       </w:r>
@@ -3817,7 +3882,7 @@
         <w:pStyle w:val="Ttulo2"/>
         <w:ind w:left="5"/>
       </w:pPr>
-      <w:bookmarkStart w:id="3" w:name="_Toc233832128"/>
+      <w:bookmarkStart w:id="3" w:name="_Toc233894000"/>
       <w:r>
         <w:lastRenderedPageBreak/>
         <w:t>2.2 TECNOLOGIAS UTILIZADAS</w:t>
@@ -4525,7 +4590,7 @@
       <w:pPr>
         <w:pStyle w:val="Ttulo2"/>
       </w:pPr>
-      <w:bookmarkStart w:id="4" w:name="_Toc233832129"/>
+      <w:bookmarkStart w:id="4" w:name="_Toc233894001"/>
       <w:r>
         <w:t>2.3 REQUISITOS DO SISTEMA</w:t>
       </w:r>
@@ -4925,7 +4990,7 @@
       <w:pPr>
         <w:pStyle w:val="Ttulo2"/>
       </w:pPr>
-      <w:bookmarkStart w:id="5" w:name="_Toc233832130"/>
+      <w:bookmarkStart w:id="5" w:name="_Toc233894002"/>
       <w:r>
         <w:lastRenderedPageBreak/>
         <w:t xml:space="preserve">2.4 </w:t>
@@ -5103,7 +5168,7 @@
       <w:pPr>
         <w:pStyle w:val="Ttulo2"/>
       </w:pPr>
-      <w:bookmarkStart w:id="6" w:name="_Toc233832131"/>
+      <w:bookmarkStart w:id="6" w:name="_Toc233894003"/>
       <w:r>
         <w:t xml:space="preserve">2.4.1 </w:t>
       </w:r>
@@ -5200,16 +5265,13 @@
       <w:pPr>
         <w:pStyle w:val="Ttulo2"/>
       </w:pPr>
-      <w:bookmarkStart w:id="7" w:name="_Toc233832132"/>
+      <w:bookmarkStart w:id="7" w:name="_Toc233894004"/>
       <w:r>
         <w:lastRenderedPageBreak/>
         <w:t xml:space="preserve">2.4.2 </w:t>
       </w:r>
       <w:r>
-        <w:t>CAMADA</w:t>
-      </w:r>
-      <w:r>
-        <w:t xml:space="preserve"> </w:t>
+        <w:t xml:space="preserve">CAMADA </w:t>
       </w:r>
       <w:r>
         <w:t>DTO</w:t>
@@ -5434,15 +5496,12 @@
       <w:pPr>
         <w:pStyle w:val="Ttulo2"/>
       </w:pPr>
-      <w:bookmarkStart w:id="8" w:name="_Toc233832133"/>
+      <w:bookmarkStart w:id="8" w:name="_Toc233894005"/>
       <w:r>
         <w:t xml:space="preserve">2.4.3 </w:t>
       </w:r>
       <w:r>
-        <w:t>CAMADA</w:t>
-      </w:r>
-      <w:r>
-        <w:t xml:space="preserve"> </w:t>
+        <w:t xml:space="preserve">CAMADA </w:t>
       </w:r>
       <w:r>
         <w:t>EXCEPTION</w:t>
@@ -5584,16 +5643,13 @@
       <w:pPr>
         <w:pStyle w:val="Ttulo2"/>
       </w:pPr>
-      <w:bookmarkStart w:id="9" w:name="_Toc233832134"/>
+      <w:bookmarkStart w:id="9" w:name="_Toc233894006"/>
       <w:r>
         <w:lastRenderedPageBreak/>
         <w:t xml:space="preserve">2.4.4 </w:t>
       </w:r>
       <w:r>
-        <w:t>CAMADA</w:t>
-      </w:r>
-      <w:r>
-        <w:t xml:space="preserve"> </w:t>
+        <w:t xml:space="preserve">CAMADA </w:t>
       </w:r>
       <w:r>
         <w:t>MODEL</w:t>
@@ -5684,15 +5740,12 @@
       <w:pPr>
         <w:pStyle w:val="Ttulo2"/>
       </w:pPr>
-      <w:bookmarkStart w:id="10" w:name="_Toc233832135"/>
+      <w:bookmarkStart w:id="10" w:name="_Toc233894007"/>
       <w:r>
         <w:t xml:space="preserve">2.4.5 </w:t>
       </w:r>
       <w:r>
-        <w:t>CAMADA</w:t>
-      </w:r>
-      <w:r>
-        <w:t xml:space="preserve"> </w:t>
+        <w:t xml:space="preserve">CAMADA </w:t>
       </w:r>
       <w:r>
         <w:t>REPOSITORY</w:t>
@@ -5843,16 +5896,13 @@
       <w:pPr>
         <w:pStyle w:val="Ttulo2"/>
       </w:pPr>
-      <w:bookmarkStart w:id="11" w:name="_Toc233832136"/>
+      <w:bookmarkStart w:id="11" w:name="_Toc233894008"/>
       <w:r>
         <w:lastRenderedPageBreak/>
         <w:t xml:space="preserve">2.4.6 </w:t>
       </w:r>
       <w:r>
-        <w:t>CAMADA</w:t>
-      </w:r>
-      <w:r>
-        <w:t xml:space="preserve"> </w:t>
+        <w:t xml:space="preserve">CAMADA </w:t>
       </w:r>
       <w:r>
         <w:t>SERVICE</w:t>
@@ -5962,7 +6012,7 @@
       <w:pPr>
         <w:pStyle w:val="Ttulo2"/>
       </w:pPr>
-      <w:bookmarkStart w:id="12" w:name="_Toc233832137"/>
+      <w:bookmarkStart w:id="12" w:name="_Toc233894009"/>
       <w:r>
         <w:t>2.5 BANCO DE DADOS</w:t>
       </w:r>
@@ -6178,7 +6228,7 @@
       <w:pPr>
         <w:pStyle w:val="Ttulo2"/>
       </w:pPr>
-      <w:bookmarkStart w:id="13" w:name="_Toc233832138"/>
+      <w:bookmarkStart w:id="13" w:name="_Toc233894010"/>
       <w:r>
         <w:t>2.5.1 TABELA PERFIL</w:t>
       </w:r>
@@ -6404,7 +6454,7 @@
       <w:pPr>
         <w:pStyle w:val="Ttulo2"/>
       </w:pPr>
-      <w:bookmarkStart w:id="14" w:name="_Toc233832139"/>
+      <w:bookmarkStart w:id="14" w:name="_Toc233894011"/>
       <w:r>
         <w:lastRenderedPageBreak/>
         <w:t>2.5.2 TABELA USUÁRIO</w:t>
@@ -6768,7 +6818,7 @@
       <w:pPr>
         <w:pStyle w:val="Ttulo2"/>
       </w:pPr>
-      <w:bookmarkStart w:id="15" w:name="_Toc233832140"/>
+      <w:bookmarkStart w:id="15" w:name="_Toc233894012"/>
       <w:r>
         <w:t>2.5.3 TABELA STATUS_PRODUTO</w:t>
       </w:r>
@@ -7009,7 +7059,7 @@
       <w:pPr>
         <w:pStyle w:val="Ttulo2"/>
       </w:pPr>
-      <w:bookmarkStart w:id="16" w:name="_Toc233832141"/>
+      <w:bookmarkStart w:id="16" w:name="_Toc233894013"/>
       <w:r>
         <w:lastRenderedPageBreak/>
         <w:t>2.5.4 TABELA PRODUTO</w:t>
@@ -7362,7 +7412,7 @@
       <w:pPr>
         <w:pStyle w:val="Ttulo2"/>
       </w:pPr>
-      <w:bookmarkStart w:id="17" w:name="_Toc233832142"/>
+      <w:bookmarkStart w:id="17" w:name="_Toc233894014"/>
       <w:r>
         <w:t>2.5.5 TABELA ESTOQUE</w:t>
       </w:r>
@@ -7714,7 +7764,7 @@
       <w:pPr>
         <w:pStyle w:val="Ttulo2"/>
       </w:pPr>
-      <w:bookmarkStart w:id="18" w:name="_Toc233832143"/>
+      <w:bookmarkStart w:id="18" w:name="_Toc233894015"/>
       <w:r>
         <w:lastRenderedPageBreak/>
         <w:t>2.5.6 TABELA RECEITA</w:t>
@@ -7984,7 +8034,7 @@
       <w:pPr>
         <w:pStyle w:val="Ttulo2"/>
       </w:pPr>
-      <w:bookmarkStart w:id="19" w:name="_Toc233832144"/>
+      <w:bookmarkStart w:id="19" w:name="_Toc233894016"/>
       <w:r>
         <w:t>2.5.7 TABELA VERSAO_RECEITA</w:t>
       </w:r>
@@ -8294,7 +8344,7 @@
       <w:pPr>
         <w:pStyle w:val="Ttulo2"/>
       </w:pPr>
-      <w:bookmarkStart w:id="20" w:name="_Toc233832145"/>
+      <w:bookmarkStart w:id="20" w:name="_Toc233894017"/>
       <w:r>
         <w:lastRenderedPageBreak/>
         <w:t>2.5.8 TABELA TESTE</w:t>
@@ -8647,7 +8697,7 @@
       <w:pPr>
         <w:pStyle w:val="Ttulo2"/>
       </w:pPr>
-      <w:bookmarkStart w:id="21" w:name="_Toc233832146"/>
+      <w:bookmarkStart w:id="21" w:name="_Toc233894018"/>
       <w:r>
         <w:t>2.5.9 TABELA HISTÓRICO</w:t>
       </w:r>
@@ -9005,7 +9055,7 @@
       <w:pPr>
         <w:pStyle w:val="Ttulo2"/>
       </w:pPr>
-      <w:bookmarkStart w:id="22" w:name="_Toc233832147"/>
+      <w:bookmarkStart w:id="22" w:name="_Toc233894019"/>
       <w:r>
         <w:t>2.5.10 RELACIONAMENTOS</w:t>
       </w:r>
@@ -9392,7 +9442,7 @@
       <w:pPr>
         <w:pStyle w:val="Ttulo2"/>
       </w:pPr>
-      <w:bookmarkStart w:id="23" w:name="_Toc233832148"/>
+      <w:bookmarkStart w:id="23" w:name="_Toc233894020"/>
       <w:r>
         <w:t>2.6 ESTRUTURA DA API</w:t>
       </w:r>
@@ -9658,22 +9708,53 @@
     </w:p>
     <w:p>
       <w:pPr>
+        <w:jc w:val="center"/>
+        <w:rPr>
+          <w:b/>
+          <w:bCs/>
+          <w:sz w:val="20"/>
+          <w:szCs w:val="20"/>
+        </w:rPr>
+      </w:pPr>
+    </w:p>
+    <w:p>
+      <w:pPr>
         <w:ind w:firstLine="698"/>
         <w:jc w:val="right"/>
-      </w:pPr>
-      <w:r>
+        <w:rPr>
+          <w:sz w:val="20"/>
+          <w:szCs w:val="20"/>
+        </w:rPr>
+      </w:pPr>
+      <w:r>
+        <w:rPr>
+          <w:b/>
+          <w:bCs/>
+          <w:sz w:val="20"/>
+          <w:szCs w:val="20"/>
+        </w:rPr>
+        <w:t>Fonte:</w:t>
+      </w:r>
+      <w:r>
+        <w:rPr>
+          <w:sz w:val="20"/>
+          <w:szCs w:val="20"/>
+        </w:rPr>
+        <w:t xml:space="preserve"> Elaborado pelos autores (2026)</w:t>
+      </w:r>
+    </w:p>
+    <w:p>
+      <w:pPr>
+        <w:jc w:val="right"/>
         <w:rPr>
           <w:b/>
           <w:bCs/>
         </w:rPr>
-        <w:t>Fonte:</w:t>
-      </w:r>
-      <w:r>
-        <w:t xml:space="preserve"> Elaborado pelos autores (2026)</w:t>
-      </w:r>
-    </w:p>
-    <w:p>
-      <w:pPr>
+      </w:pPr>
+    </w:p>
+    <w:p>
+      <w:pPr>
+        <w:jc w:val="right"/>
         <w:rPr>
           <w:b/>
           <w:bCs/>
@@ -9682,9 +9763,27 @@
     </w:p>
     <w:p>
       <w:pPr>
+        <w:jc w:val="right"/>
+        <w:rPr>
+          <w:b/>
+          <w:bCs/>
+        </w:rPr>
+      </w:pPr>
+    </w:p>
+    <w:p>
+      <w:pPr>
+        <w:rPr>
+          <w:b/>
+          <w:bCs/>
+        </w:rPr>
+      </w:pPr>
+    </w:p>
+    <w:p>
+      <w:pPr>
         <w:ind w:firstLine="698"/>
       </w:pPr>
       <w:r>
+        <w:lastRenderedPageBreak/>
         <w:t xml:space="preserve">Conforme ilustrado na Figura 3, uma requisição enviada pelo cliente é inicialmente recebida pela camada </w:t>
       </w:r>
       <w:proofErr w:type="spellStart"/>
@@ -9719,11 +9818,7 @@
       </w:r>
       <w:proofErr w:type="spellEnd"/>
       <w:r>
-        <w:t xml:space="preserve"> </w:t>
-      </w:r>
-      <w:r>
-        <w:lastRenderedPageBreak/>
-        <w:t>realiza a comunicação com o banco de dados, retornando o resultado da operação até o cliente.</w:t>
+        <w:t xml:space="preserve"> realiza a comunicação com o banco de dados, retornando o resultado da operação até o cliente.</w:t>
       </w:r>
     </w:p>
     <w:p>
@@ -9740,7 +9835,7 @@
       <w:pPr>
         <w:pStyle w:val="Ttulo2"/>
       </w:pPr>
-      <w:bookmarkStart w:id="24" w:name="_Toc233832149"/>
+      <w:bookmarkStart w:id="24" w:name="_Toc233894021"/>
       <w:r>
         <w:t>2.6.1 MÉTODOS HTTP</w:t>
       </w:r>
@@ -9956,7 +10051,7 @@
       <w:pPr>
         <w:pStyle w:val="Ttulo2"/>
       </w:pPr>
-      <w:bookmarkStart w:id="25" w:name="_Toc233832150"/>
+      <w:bookmarkStart w:id="25" w:name="_Toc233894022"/>
       <w:r>
         <w:t>2.6.2 USUARIO CONTROLLER</w:t>
       </w:r>
@@ -10262,6 +10357,7 @@
               <w:jc w:val="center"/>
             </w:pPr>
             <w:r>
+              <w:lastRenderedPageBreak/>
               <w:t>PUT</w:t>
             </w:r>
           </w:p>
@@ -10359,9 +10455,18 @@
       <w:pPr>
         <w:pStyle w:val="Ttulo2"/>
       </w:pPr>
-      <w:bookmarkStart w:id="26" w:name="_Toc233832151"/>
-      <w:r>
-        <w:lastRenderedPageBreak/>
+    </w:p>
+    <w:p>
+      <w:pPr>
+        <w:pStyle w:val="Ttulo2"/>
+      </w:pPr>
+    </w:p>
+    <w:p>
+      <w:pPr>
+        <w:pStyle w:val="Ttulo2"/>
+      </w:pPr>
+      <w:bookmarkStart w:id="26" w:name="_Toc233894023"/>
+      <w:r>
         <w:t>2.6.</w:t>
       </w:r>
       <w:r>
@@ -10737,7 +10842,7 @@
       <w:pPr>
         <w:pStyle w:val="Ttulo2"/>
       </w:pPr>
-      <w:bookmarkStart w:id="27" w:name="_Toc233832152"/>
+      <w:bookmarkStart w:id="27" w:name="_Toc233894024"/>
       <w:r>
         <w:t>2.6.</w:t>
       </w:r>
@@ -10936,6 +11041,7 @@
               <w:jc w:val="center"/>
             </w:pPr>
             <w:r>
+              <w:lastRenderedPageBreak/>
               <w:t>GET</w:t>
             </w:r>
           </w:p>
@@ -11071,7 +11177,6 @@
               <w:jc w:val="center"/>
             </w:pPr>
             <w:r>
-              <w:lastRenderedPageBreak/>
               <w:t>DELETE</w:t>
             </w:r>
           </w:p>
@@ -11114,7 +11219,7 @@
       <w:pPr>
         <w:pStyle w:val="Ttulo2"/>
       </w:pPr>
-      <w:bookmarkStart w:id="28" w:name="_Toc233832153"/>
+      <w:bookmarkStart w:id="28" w:name="_Toc233894025"/>
       <w:r>
         <w:t>2.6.</w:t>
       </w:r>
@@ -11510,42 +11615,20 @@
     </w:p>
     <w:p>
       <w:pPr>
-        <w:spacing w:after="161" w:line="260" w:lineRule="auto"/>
-        <w:ind w:left="-15" w:right="168" w:firstLine="701"/>
-      </w:pPr>
-    </w:p>
-    <w:p>
-      <w:pPr>
-        <w:spacing w:after="161" w:line="260" w:lineRule="auto"/>
-        <w:ind w:left="-15" w:right="168" w:firstLine="701"/>
-      </w:pPr>
-    </w:p>
-    <w:p>
-      <w:pPr>
-        <w:spacing w:after="161" w:line="260" w:lineRule="auto"/>
-        <w:ind w:left="-15" w:right="168" w:firstLine="701"/>
-      </w:pPr>
-    </w:p>
-    <w:p>
-      <w:pPr>
-        <w:spacing w:after="161" w:line="260" w:lineRule="auto"/>
-        <w:ind w:left="-15" w:right="168" w:firstLine="701"/>
-      </w:pPr>
-    </w:p>
-    <w:p>
-      <w:pPr>
-        <w:spacing w:after="161" w:line="260" w:lineRule="auto"/>
-        <w:ind w:left="-15" w:right="168" w:firstLine="701"/>
-      </w:pPr>
-    </w:p>
-    <w:p/>
-    <w:p>
-      <w:pPr>
         <w:pStyle w:val="Ttulo2"/>
       </w:pPr>
-      <w:bookmarkStart w:id="29" w:name="_Toc233832154"/>
-      <w:r>
-        <w:lastRenderedPageBreak/>
+    </w:p>
+    <w:p>
+      <w:pPr>
+        <w:pStyle w:val="Ttulo2"/>
+      </w:pPr>
+    </w:p>
+    <w:p>
+      <w:pPr>
+        <w:pStyle w:val="Ttulo2"/>
+      </w:pPr>
+      <w:bookmarkStart w:id="29" w:name="_Toc233894026"/>
+      <w:r>
         <w:t>2.6.</w:t>
       </w:r>
       <w:r>
@@ -11895,7 +11978,7 @@
       <w:pPr>
         <w:pStyle w:val="Ttulo2"/>
       </w:pPr>
-      <w:bookmarkStart w:id="30" w:name="_Toc233832155"/>
+      <w:bookmarkStart w:id="30" w:name="_Toc233894027"/>
       <w:r>
         <w:t>2.6.</w:t>
       </w:r>
@@ -12258,7 +12341,7 @@
       <w:pPr>
         <w:pStyle w:val="Ttulo2"/>
       </w:pPr>
-      <w:bookmarkStart w:id="31" w:name="_Toc233832156"/>
+      <w:bookmarkStart w:id="31" w:name="_Toc233894028"/>
       <w:r>
         <w:lastRenderedPageBreak/>
         <w:t>2.6.</w:t>
@@ -12667,7 +12750,7 @@
       <w:pPr>
         <w:pStyle w:val="Ttulo2"/>
       </w:pPr>
-      <w:bookmarkStart w:id="32" w:name="_Toc233832157"/>
+      <w:bookmarkStart w:id="32" w:name="_Toc233894029"/>
       <w:r>
         <w:t>2.6.</w:t>
       </w:r>
@@ -13026,7 +13109,7 @@
       <w:pPr>
         <w:pStyle w:val="Ttulo2"/>
       </w:pPr>
-      <w:bookmarkStart w:id="33" w:name="_Toc233832158"/>
+      <w:bookmarkStart w:id="33" w:name="_Toc233894030"/>
       <w:r>
         <w:lastRenderedPageBreak/>
         <w:t>2.6.</w:t>
@@ -13208,13 +13291,7 @@
               <w:ind w:left="0" w:firstLine="0"/>
             </w:pPr>
             <w:r>
-              <w:t xml:space="preserve">Lista </w:t>
-            </w:r>
-            <w:r>
-              <w:t>o histórico de alterações</w:t>
-            </w:r>
-            <w:r>
-              <w:t>.</w:t>
+              <w:t>Lista o histórico de alterações.</w:t>
             </w:r>
           </w:p>
         </w:tc>
@@ -13267,10 +13344,7 @@
               <w:ind w:left="0" w:firstLine="0"/>
             </w:pPr>
             <w:r>
-              <w:t xml:space="preserve">Consulta </w:t>
-            </w:r>
-            <w:r>
-              <w:t>um registro específico.</w:t>
+              <w:t>Consulta um registro específico.</w:t>
             </w:r>
           </w:p>
         </w:tc>
@@ -13320,10 +13394,7 @@
               <w:ind w:left="0" w:firstLine="0"/>
             </w:pPr>
             <w:r>
-              <w:t>Registra um</w:t>
-            </w:r>
-            <w:r>
-              <w:t>a nova ação no histórico.</w:t>
+              <w:t>Registra uma nova ação no histórico.</w:t>
             </w:r>
           </w:p>
         </w:tc>
@@ -13376,10 +13447,7 @@
               <w:ind w:left="0" w:firstLine="0"/>
             </w:pPr>
             <w:r>
-              <w:t xml:space="preserve">Atualiza um </w:t>
-            </w:r>
-            <w:r>
-              <w:t>registro no histórico.</w:t>
+              <w:t>Atualiza um registro no histórico.</w:t>
             </w:r>
           </w:p>
         </w:tc>
@@ -13432,10 +13500,7 @@
               <w:ind w:left="0" w:firstLine="0"/>
             </w:pPr>
             <w:r>
-              <w:t>Remove u</w:t>
-            </w:r>
-            <w:r>
-              <w:t>m registro do histórico.</w:t>
+              <w:t>Remove um registro do histórico.</w:t>
             </w:r>
           </w:p>
         </w:tc>
@@ -13447,7 +13512,7 @@
       <w:pPr>
         <w:pStyle w:val="Ttulo2"/>
       </w:pPr>
-      <w:bookmarkStart w:id="34" w:name="_Toc233832159"/>
+      <w:bookmarkStart w:id="34" w:name="_Toc233894031"/>
       <w:r>
         <w:t>2.7 TRATAMENTO DE EXCEÇÕES</w:t>
       </w:r>
@@ -13522,7 +13587,7 @@
       <w:pPr>
         <w:pStyle w:val="Ttulo2"/>
       </w:pPr>
-      <w:bookmarkStart w:id="35" w:name="_Toc233832160"/>
+      <w:bookmarkStart w:id="35" w:name="_Toc233894032"/>
       <w:r>
         <w:lastRenderedPageBreak/>
         <w:t xml:space="preserve">2.7.1 </w:t>
@@ -13616,7 +13681,7 @@
       <w:pPr>
         <w:pStyle w:val="Ttulo2"/>
       </w:pPr>
-      <w:bookmarkStart w:id="36" w:name="_Toc233832161"/>
+      <w:bookmarkStart w:id="36" w:name="_Toc233894033"/>
       <w:r>
         <w:t xml:space="preserve">2.7.2 </w:t>
       </w:r>
@@ -13823,7 +13888,7 @@
       <w:pPr>
         <w:pStyle w:val="Ttulo2"/>
       </w:pPr>
-      <w:bookmarkStart w:id="37" w:name="_Toc233832162"/>
+      <w:bookmarkStart w:id="37" w:name="_Toc233894034"/>
       <w:r>
         <w:lastRenderedPageBreak/>
         <w:t>2.7.3 EXCEÇÕES PERSONALIZADAS</w:t>
@@ -14064,17 +14129,310 @@
     </w:tbl>
     <w:p/>
     <w:p/>
+    <w:p/>
+    <w:p/>
+    <w:p/>
+    <w:p/>
+    <w:p/>
+    <w:p/>
+    <w:p/>
+    <w:p/>
+    <w:p/>
+    <w:p/>
+    <w:p/>
+    <w:p/>
+    <w:p/>
+    <w:p/>
     <w:p>
       <w:pPr>
         <w:pStyle w:val="Ttulo2"/>
       </w:pPr>
-      <w:bookmarkStart w:id="38" w:name="_Toc233832163"/>
-      <w:r>
+      <w:bookmarkStart w:id="38" w:name="_Toc233894035"/>
+      <w:r>
+        <w:lastRenderedPageBreak/>
         <w:t>2.7.4 FLUXO DO TRATAMENTO DE EXCEÇÕES</w:t>
       </w:r>
       <w:bookmarkEnd w:id="38"/>
     </w:p>
     <w:p/>
+    <w:p>
+      <w:r>
+        <w:tab/>
+      </w:r>
+      <w:r>
+        <w:tab/>
+      </w:r>
+      <w:r>
+        <w:t xml:space="preserve">Durante o processamento de uma requisição, caso uma exceção seja lançada pela camada </w:t>
+      </w:r>
+      <w:r>
+        <w:rPr>
+          <w:b/>
+          <w:bCs/>
+        </w:rPr>
+        <w:t>Service</w:t>
+      </w:r>
+      <w:r>
+        <w:t xml:space="preserve">, ela é interceptada pelo </w:t>
+      </w:r>
+      <w:proofErr w:type="spellStart"/>
+      <w:r>
+        <w:rPr>
+          <w:b/>
+          <w:bCs/>
+        </w:rPr>
+        <w:t>GlobalExceptionHandler</w:t>
+      </w:r>
+      <w:proofErr w:type="spellEnd"/>
+      <w:r>
+        <w:t xml:space="preserve">, que cria um objeto </w:t>
+      </w:r>
+      <w:proofErr w:type="spellStart"/>
+      <w:r>
+        <w:rPr>
+          <w:b/>
+          <w:bCs/>
+        </w:rPr>
+        <w:t>ErrorResponse</w:t>
+      </w:r>
+      <w:proofErr w:type="spellEnd"/>
+      <w:r>
+        <w:t xml:space="preserve"> contendo as informações do erro e o retorna ao cliente juntamente com o código HTTP correspondente.</w:t>
+      </w:r>
+    </w:p>
+    <w:p>
+      <w:r>
+        <w:tab/>
+      </w:r>
+      <w:r>
+        <w:tab/>
+      </w:r>
+      <w:r>
+        <w:t>Esse fluxo garante que todas as respostas de erro possuam o mesmo formato, independentemente da origem da exceção.</w:t>
+      </w:r>
+    </w:p>
+    <w:p/>
+    <w:p>
+      <w:pPr>
+        <w:jc w:val="center"/>
+        <w:rPr>
+          <w:b/>
+          <w:bCs/>
+          <w:sz w:val="20"/>
+          <w:szCs w:val="20"/>
+        </w:rPr>
+      </w:pPr>
+      <w:r>
+        <w:rPr>
+          <w:b/>
+          <w:bCs/>
+          <w:sz w:val="20"/>
+          <w:szCs w:val="20"/>
+        </w:rPr>
+        <w:t>Figura 4 – Fluxo do tratamento de exceções</w:t>
+      </w:r>
+    </w:p>
+    <w:p/>
+    <w:p>
+      <w:r>
+        <w:rPr>
+          <w:noProof/>
+        </w:rPr>
+        <w:drawing>
+          <wp:inline distT="0" distB="0" distL="0" distR="0" wp14:anchorId="7DA21871" wp14:editId="4F7B7C7F">
+            <wp:extent cx="5756910" cy="2456815"/>
+            <wp:effectExtent l="0" t="0" r="0" b="635"/>
+            <wp:docPr id="3" name="Imagem 3"/>
+            <wp:cNvGraphicFramePr>
+              <a:graphicFrameLocks xmlns:a="http://schemas.openxmlformats.org/drawingml/2006/main" noChangeAspect="1"/>
+            </wp:cNvGraphicFramePr>
+            <a:graphic xmlns:a="http://schemas.openxmlformats.org/drawingml/2006/main">
+              <a:graphicData uri="http://schemas.openxmlformats.org/drawingml/2006/picture">
+                <pic:pic xmlns:pic="http://schemas.openxmlformats.org/drawingml/2006/picture">
+                  <pic:nvPicPr>
+                    <pic:cNvPr id="0" name="Picture 2"/>
+                    <pic:cNvPicPr>
+                      <a:picLocks noChangeAspect="1" noChangeArrowheads="1"/>
+                    </pic:cNvPicPr>
+                  </pic:nvPicPr>
+                  <pic:blipFill>
+                    <a:blip r:embed="rId11" cstate="print">
+                      <a:extLst>
+                        <a:ext uri="{28A0092B-C50C-407E-A947-70E740481C1C}">
+                          <a14:useLocalDpi xmlns:a14="http://schemas.microsoft.com/office/drawing/2010/main" val="0"/>
+                        </a:ext>
+                      </a:extLst>
+                    </a:blip>
+                    <a:srcRect/>
+                    <a:stretch>
+                      <a:fillRect/>
+                    </a:stretch>
+                  </pic:blipFill>
+                  <pic:spPr bwMode="auto">
+                    <a:xfrm>
+                      <a:off x="0" y="0"/>
+                      <a:ext cx="5756910" cy="2456815"/>
+                    </a:xfrm>
+                    <a:prstGeom prst="rect">
+                      <a:avLst/>
+                    </a:prstGeom>
+                    <a:noFill/>
+                    <a:ln>
+                      <a:noFill/>
+                    </a:ln>
+                  </pic:spPr>
+                </pic:pic>
+              </a:graphicData>
+            </a:graphic>
+          </wp:inline>
+        </w:drawing>
+      </w:r>
+    </w:p>
+    <w:p>
+      <w:pPr>
+        <w:jc w:val="right"/>
+        <w:rPr>
+          <w:sz w:val="20"/>
+          <w:szCs w:val="20"/>
+        </w:rPr>
+      </w:pPr>
+      <w:r>
+        <w:rPr>
+          <w:b/>
+          <w:bCs/>
+          <w:sz w:val="20"/>
+          <w:szCs w:val="20"/>
+        </w:rPr>
+        <w:t>Fonte:</w:t>
+      </w:r>
+      <w:r>
+        <w:rPr>
+          <w:sz w:val="20"/>
+          <w:szCs w:val="20"/>
+        </w:rPr>
+        <w:t xml:space="preserve"> Elaborado pelos autores (2026)</w:t>
+      </w:r>
+    </w:p>
+    <w:p/>
+    <w:p/>
+    <w:p/>
+    <w:p/>
+    <w:p/>
+    <w:p/>
+    <w:p/>
+    <w:p/>
+    <w:p/>
+    <w:p/>
+    <w:p/>
+    <w:p/>
+    <w:p>
+      <w:pPr>
+        <w:pStyle w:val="Ttulo2"/>
+      </w:pPr>
+      <w:bookmarkStart w:id="39" w:name="_Toc233894036"/>
+      <w:r>
+        <w:lastRenderedPageBreak/>
+        <w:t>2.7.5 EXEMPLO DE RESPOSTA</w:t>
+      </w:r>
+      <w:bookmarkEnd w:id="39"/>
+    </w:p>
+    <w:p/>
+    <w:p>
+      <w:r>
+        <w:tab/>
+      </w:r>
+      <w:r>
+        <w:tab/>
+      </w:r>
+      <w:r>
+        <w:t>Quando ocorre uma exceção, a API retorna uma resposta em formato JSON semelhante ao exemplo abaixo:</w:t>
+      </w:r>
+    </w:p>
+    <w:p/>
+    <w:p>
+      <w:pPr>
+        <w:jc w:val="left"/>
+      </w:pPr>
+      <w:r>
+        <w:t>{</w:t>
+      </w:r>
+    </w:p>
+    <w:p>
+      <w:pPr>
+        <w:jc w:val="left"/>
+      </w:pPr>
+      <w:r>
+        <w:t>"</w:t>
+      </w:r>
+      <w:proofErr w:type="spellStart"/>
+      <w:r>
+        <w:t>timestamp</w:t>
+      </w:r>
+      <w:proofErr w:type="spellEnd"/>
+      <w:r>
+        <w:t>": "2026-07-01T20:15:43.512",</w:t>
+      </w:r>
+    </w:p>
+    <w:p>
+      <w:pPr>
+        <w:jc w:val="left"/>
+      </w:pPr>
+      <w:r>
+        <w:t>"status": 404,</w:t>
+      </w:r>
+    </w:p>
+    <w:p>
+      <w:pPr>
+        <w:jc w:val="left"/>
+      </w:pPr>
+      <w:r>
+        <w:t>"mensagem": "Teste não encontrado!"</w:t>
+      </w:r>
+    </w:p>
+    <w:p>
+      <w:pPr>
+        <w:jc w:val="left"/>
+      </w:pPr>
+      <w:r>
+        <w:t>}</w:t>
+      </w:r>
+    </w:p>
+    <w:p>
+      <w:pPr>
+        <w:pStyle w:val="Ttulo1"/>
+      </w:pPr>
+    </w:p>
+    <w:p/>
+    <w:p>
+      <w:pPr>
+        <w:pStyle w:val="Ttulo1"/>
+        <w:spacing w:after="0"/>
+        <w:ind w:left="-5"/>
+      </w:pPr>
+      <w:bookmarkStart w:id="40" w:name="_Toc233894037"/>
+      <w:r>
+        <w:t>3</w:t>
+      </w:r>
+      <w:r>
+        <w:t xml:space="preserve">. </w:t>
+      </w:r>
+      <w:r>
+        <w:t>MANUAL DE INSTALAÇÃO E EXECUÇÃO</w:t>
+      </w:r>
+      <w:bookmarkEnd w:id="40"/>
+      <w:r>
+        <w:t xml:space="preserve"> (BACKEND)</w:t>
+      </w:r>
+    </w:p>
+    <w:p/>
+    <w:p>
+      <w:r>
+        <w:tab/>
+      </w:r>
+      <w:r>
+        <w:tab/>
+      </w:r>
+    </w:p>
     <w:p/>
     <w:sectPr>
       <w:pgSz w:w="11905" w:h="16840"/>
@@ -14086,7 +14444,7 @@
 </file>
 
 <file path=word/endnotes.xml><?xml version="1.0" encoding="utf-8"?>
-<w:endnotes xmlns:wpc="http://schemas.microsoft.com/office/word/2010/wordprocessingCanvas" xmlns:cx="http://schemas.microsoft.com/office/drawing/2014/chartex" xmlns:cx1="http://schemas.microsoft.com/office/drawing/2015/9/8/chartex" xmlns:cx2="http://schemas.microsoft.com/office/drawing/2015/10/21/chartex" xmlns:cx3="http://schemas.microsoft.com/office/drawing/2016/5/9/chartex" xmlns:cx4="http://schemas.microsoft.com/office/drawing/2016/5/10/chartex" xmlns:cx5="http://schemas.microsoft.com/office/drawing/2016/5/11/chartex" xmlns:cx6="http://schemas.microsoft.com/office/drawing/2016/5/12/chartex" xmlns:cx7="http://schemas.microsoft.com/office/drawing/2016/5/13/chartex" xmlns:cx8="http://schemas.microsoft.com/office/drawing/2016/5/14/chartex" xmlns:mc="http://schemas.openxmlformats.org/markup-compatibility/2006" xmlns:aink="http://schemas.microsoft.com/office/drawing/2016/ink" xmlns:am3d="http://schemas.microsoft.com/office/drawing/2017/model3d" xmlns:o="urn:schemas-microsoft-com:office:office" xmlns:oel="http://schemas.microsoft.com/office/2019/extlst" xmlns:r="http://schemas.openxmlformats.org/officeDocument/2006/relationships" xmlns:m="http://schemas.openxmlformats.org/officeDocument/2006/math" xmlns:v="urn:schemas-microsoft-com:vml" xmlns:wp14="http://schemas.microsoft.com/office/word/2010/wordprocessingDrawing" xmlns:wp="http://schemas.openxmlformats.org/drawingml/2006/wordprocessingDrawing" xmlns:w10="urn:schemas-microsoft-com:office:word" xmlns:w="http://schemas.openxmlformats.org/wordprocessingml/2006/main" xmlns:w14="http://schemas.microsoft.com/office/word/2010/wordml" xmlns:w15="http://schemas.microsoft.com/office/word/2012/wordml" xmlns:w16cex="http://schemas.microsoft.com/office/word/2018/wordml/cex" xmlns:w16cid="http://schemas.microsoft.com/office/word/2016/wordml/cid" xmlns:w16="http://schemas.microsoft.com/office/word/2018/wordml" xmlns:w16du="http://schemas.microsoft.com/office/word/2023/wordml/word16du" xmlns:w16sdtdh="http://schemas.microsoft.com/office/word/2020/wordml/sdtdatahash" xmlns:w16sdtfl="http://schemas.microsoft.com/office/word/2024/wordml/sdtformatlock" xmlns:w16se="http://schemas.microsoft.com/office/word/2015/wordml/symex" xmlns:wpg="http://schemas.microsoft.com/office/word/2010/wordprocessingGroup" xmlns:wpi="http://schemas.microsoft.com/office/word/2010/wordprocessingInk" xmlns:wne="http://schemas.microsoft.com/office/word/2006/wordml" xmlns:wps="http://schemas.microsoft.com/office/word/2010/wordprocessingShape" mc:Ignorable="w14 w15 w16se w16cid w16 w16cex w16sdtdh w16sdtfl w16du wp14">
+<w:endnotes xmlns:wpc="http://schemas.microsoft.com/office/word/2010/wordprocessingCanvas" xmlns:cx="http://schemas.microsoft.com/office/drawing/2014/chartex" xmlns:cx1="http://schemas.microsoft.com/office/drawing/2015/9/8/chartex" xmlns:cx2="http://schemas.microsoft.com/office/drawing/2015/10/21/chartex" xmlns:cx3="http://schemas.microsoft.com/office/drawing/2016/5/9/chartex" xmlns:cx4="http://schemas.microsoft.com/office/drawing/2016/5/10/chartex" xmlns:cx5="http://schemas.microsoft.com/office/drawing/2016/5/11/chartex" xmlns:cx6="http://schemas.microsoft.com/office/drawing/2016/5/12/chartex" xmlns:cx7="http://schemas.microsoft.com/office/drawing/2016/5/13/chartex" xmlns:cx8="http://schemas.microsoft.com/office/drawing/2016/5/14/chartex" xmlns:mc="http://schemas.openxmlformats.org/markup-compatibility/2006" xmlns:aink="http://schemas.microsoft.com/office/drawing/2016/ink" xmlns:am3d="http://schemas.microsoft.com/office/drawing/2017/model3d" xmlns:o="urn:schemas-microsoft-com:office:office" xmlns:r="http://schemas.openxmlformats.org/officeDocument/2006/relationships" xmlns:m="http://schemas.openxmlformats.org/officeDocument/2006/math" xmlns:v="urn:schemas-microsoft-com:vml" xmlns:wp14="http://schemas.microsoft.com/office/word/2010/wordprocessingDrawing" xmlns:wp="http://schemas.openxmlformats.org/drawingml/2006/wordprocessingDrawing" xmlns:w10="urn:schemas-microsoft-com:office:word" xmlns:w="http://schemas.openxmlformats.org/wordprocessingml/2006/main" xmlns:w14="http://schemas.microsoft.com/office/word/2010/wordml" xmlns:w15="http://schemas.microsoft.com/office/word/2012/wordml" xmlns:w16cex="http://schemas.microsoft.com/office/word/2018/wordml/cex" xmlns:w16cid="http://schemas.microsoft.com/office/word/2016/wordml/cid" xmlns:w16="http://schemas.microsoft.com/office/word/2018/wordml" xmlns:w16sdtdh="http://schemas.microsoft.com/office/word/2020/wordml/sdtdatahash" xmlns:w16se="http://schemas.microsoft.com/office/word/2015/wordml/symex" xmlns:wpg="http://schemas.microsoft.com/office/word/2010/wordprocessingGroup" xmlns:wpi="http://schemas.microsoft.com/office/word/2010/wordprocessingInk" xmlns:wne="http://schemas.microsoft.com/office/word/2006/wordml" xmlns:wps="http://schemas.microsoft.com/office/word/2010/wordprocessingShape" mc:Ignorable="w14 w15 w16se w16cid w16 w16cex w16sdtdh wp14">
   <w:endnote w:type="separator" w:id="-1">
     <w:p>
       <w:pPr>
@@ -14111,7 +14469,7 @@
 </file>
 
 <file path=word/footnotes.xml><?xml version="1.0" encoding="utf-8"?>
-<w:footnotes xmlns:wpc="http://schemas.microsoft.com/office/word/2010/wordprocessingCanvas" xmlns:cx="http://schemas.microsoft.com/office/drawing/2014/chartex" xmlns:cx1="http://schemas.microsoft.com/office/drawing/2015/9/8/chartex" xmlns:cx2="http://schemas.microsoft.com/office/drawing/2015/10/21/chartex" xmlns:cx3="http://schemas.microsoft.com/office/drawing/2016/5/9/chartex" xmlns:cx4="http://schemas.microsoft.com/office/drawing/2016/5/10/chartex" xmlns:cx5="http://schemas.microsoft.com/office/drawing/2016/5/11/chartex" xmlns:cx6="http://schemas.microsoft.com/office/drawing/2016/5/12/chartex" xmlns:cx7="http://schemas.microsoft.com/office/drawing/2016/5/13/chartex" xmlns:cx8="http://schemas.microsoft.com/office/drawing/2016/5/14/chartex" xmlns:mc="http://schemas.openxmlformats.org/markup-compatibility/2006" xmlns:aink="http://schemas.microsoft.com/office/drawing/2016/ink" xmlns:am3d="http://schemas.microsoft.com/office/drawing/2017/model3d" xmlns:o="urn:schemas-microsoft-com:office:office" xmlns:oel="http://schemas.microsoft.com/office/2019/extlst" xmlns:r="http://schemas.openxmlformats.org/officeDocument/2006/relationships" xmlns:m="http://schemas.openxmlformats.org/officeDocument/2006/math" xmlns:v="urn:schemas-microsoft-com:vml" xmlns:wp14="http://schemas.microsoft.com/office/word/2010/wordprocessingDrawing" xmlns:wp="http://schemas.openxmlformats.org/drawingml/2006/wordprocessingDrawing" xmlns:w10="urn:schemas-microsoft-com:office:word" xmlns:w="http://schemas.openxmlformats.org/wordprocessingml/2006/main" xmlns:w14="http://schemas.microsoft.com/office/word/2010/wordml" xmlns:w15="http://schemas.microsoft.com/office/word/2012/wordml" xmlns:w16cex="http://schemas.microsoft.com/office/word/2018/wordml/cex" xmlns:w16cid="http://schemas.microsoft.com/office/word/2016/wordml/cid" xmlns:w16="http://schemas.microsoft.com/office/word/2018/wordml" xmlns:w16du="http://schemas.microsoft.com/office/word/2023/wordml/word16du" xmlns:w16sdtdh="http://schemas.microsoft.com/office/word/2020/wordml/sdtdatahash" xmlns:w16sdtfl="http://schemas.microsoft.com/office/word/2024/wordml/sdtformatlock" xmlns:w16se="http://schemas.microsoft.com/office/word/2015/wordml/symex" xmlns:wpg="http://schemas.microsoft.com/office/word/2010/wordprocessingGroup" xmlns:wpi="http://schemas.microsoft.com/office/word/2010/wordprocessingInk" xmlns:wne="http://schemas.microsoft.com/office/word/2006/wordml" xmlns:wps="http://schemas.microsoft.com/office/word/2010/wordprocessingShape" mc:Ignorable="w14 w15 w16se w16cid w16 w16cex w16sdtdh w16sdtfl w16du wp14">
+<w:footnotes xmlns:wpc="http://schemas.microsoft.com/office/word/2010/wordprocessingCanvas" xmlns:cx="http://schemas.microsoft.com/office/drawing/2014/chartex" xmlns:cx1="http://schemas.microsoft.com/office/drawing/2015/9/8/chartex" xmlns:cx2="http://schemas.microsoft.com/office/drawing/2015/10/21/chartex" xmlns:cx3="http://schemas.microsoft.com/office/drawing/2016/5/9/chartex" xmlns:cx4="http://schemas.microsoft.com/office/drawing/2016/5/10/chartex" xmlns:cx5="http://schemas.microsoft.com/office/drawing/2016/5/11/chartex" xmlns:cx6="http://schemas.microsoft.com/office/drawing/2016/5/12/chartex" xmlns:cx7="http://schemas.microsoft.com/office/drawing/2016/5/13/chartex" xmlns:cx8="http://schemas.microsoft.com/office/drawing/2016/5/14/chartex" xmlns:mc="http://schemas.openxmlformats.org/markup-compatibility/2006" xmlns:aink="http://schemas.microsoft.com/office/drawing/2016/ink" xmlns:am3d="http://schemas.microsoft.com/office/drawing/2017/model3d" xmlns:o="urn:schemas-microsoft-com:office:office" xmlns:r="http://schemas.openxmlformats.org/officeDocument/2006/relationships" xmlns:m="http://schemas.openxmlformats.org/officeDocument/2006/math" xmlns:v="urn:schemas-microsoft-com:vml" xmlns:wp14="http://schemas.microsoft.com/office/word/2010/wordprocessingDrawing" xmlns:wp="http://schemas.openxmlformats.org/drawingml/2006/wordprocessingDrawing" xmlns:w10="urn:schemas-microsoft-com:office:word" xmlns:w="http://schemas.openxmlformats.org/wordprocessingml/2006/main" xmlns:w14="http://schemas.microsoft.com/office/word/2010/wordml" xmlns:w15="http://schemas.microsoft.com/office/word/2012/wordml" xmlns:w16cex="http://schemas.microsoft.com/office/word/2018/wordml/cex" xmlns:w16cid="http://schemas.microsoft.com/office/word/2016/wordml/cid" xmlns:w16="http://schemas.microsoft.com/office/word/2018/wordml" xmlns:w16sdtdh="http://schemas.microsoft.com/office/word/2020/wordml/sdtdatahash" xmlns:w16se="http://schemas.microsoft.com/office/word/2015/wordml/symex" xmlns:wpg="http://schemas.microsoft.com/office/word/2010/wordprocessingGroup" xmlns:wpi="http://schemas.microsoft.com/office/word/2010/wordprocessingInk" xmlns:wne="http://schemas.microsoft.com/office/word/2006/wordml" xmlns:wps="http://schemas.microsoft.com/office/word/2010/wordprocessingShape" mc:Ignorable="w14 w15 w16se w16cid w16 w16cex w16sdtdh wp14">
   <w:footnote w:type="separator" w:id="-1">
     <w:p>
       <w:pPr>
@@ -14136,7 +14494,7 @@
 </file>
 
 <file path=word/numbering.xml><?xml version="1.0" encoding="utf-8"?>
-<w:numbering xmlns:wpc="http://schemas.microsoft.com/office/word/2010/wordprocessingCanvas" xmlns:cx="http://schemas.microsoft.com/office/drawing/2014/chartex" xmlns:cx1="http://schemas.microsoft.com/office/drawing/2015/9/8/chartex" xmlns:cx2="http://schemas.microsoft.com/office/drawing/2015/10/21/chartex" xmlns:cx3="http://schemas.microsoft.com/office/drawing/2016/5/9/chartex" xmlns:cx4="http://schemas.microsoft.com/office/drawing/2016/5/10/chartex" xmlns:cx5="http://schemas.microsoft.com/office/drawing/2016/5/11/chartex" xmlns:cx6="http://schemas.microsoft.com/office/drawing/2016/5/12/chartex" xmlns:cx7="http://schemas.microsoft.com/office/drawing/2016/5/13/chartex" xmlns:cx8="http://schemas.microsoft.com/office/drawing/2016/5/14/chartex" xmlns:mc="http://schemas.openxmlformats.org/markup-compatibility/2006" xmlns:aink="http://schemas.microsoft.com/office/drawing/2016/ink" xmlns:am3d="http://schemas.microsoft.com/office/drawing/2017/model3d" xmlns:o="urn:schemas-microsoft-com:office:office" xmlns:oel="http://schemas.microsoft.com/office/2019/extlst" xmlns:r="http://schemas.openxmlformats.org/officeDocument/2006/relationships" xmlns:m="http://schemas.openxmlformats.org/officeDocument/2006/math" xmlns:v="urn:schemas-microsoft-com:vml" xmlns:wp14="http://schemas.microsoft.com/office/word/2010/wordprocessingDrawing" xmlns:wp="http://schemas.openxmlformats.org/drawingml/2006/wordprocessingDrawing" xmlns:w10="urn:schemas-microsoft-com:office:word" xmlns:w="http://schemas.openxmlformats.org/wordprocessingml/2006/main" xmlns:w14="http://schemas.microsoft.com/office/word/2010/wordml" xmlns:w15="http://schemas.microsoft.com/office/word/2012/wordml" xmlns:w16cex="http://schemas.microsoft.com/office/word/2018/wordml/cex" xmlns:w16cid="http://schemas.microsoft.com/office/word/2016/wordml/cid" xmlns:w16="http://schemas.microsoft.com/office/word/2018/wordml" xmlns:w16du="http://schemas.microsoft.com/office/word/2023/wordml/word16du" xmlns:w16sdtdh="http://schemas.microsoft.com/office/word/2020/wordml/sdtdatahash" xmlns:w16sdtfl="http://schemas.microsoft.com/office/word/2024/wordml/sdtformatlock" xmlns:w16se="http://schemas.microsoft.com/office/word/2015/wordml/symex" xmlns:wpg="http://schemas.microsoft.com/office/word/2010/wordprocessingGroup" xmlns:wpi="http://schemas.microsoft.com/office/word/2010/wordprocessingInk" xmlns:wne="http://schemas.microsoft.com/office/word/2006/wordml" xmlns:wps="http://schemas.microsoft.com/office/word/2010/wordprocessingShape" mc:Ignorable="w14 w15 w16se w16cid w16 w16cex w16sdtdh w16sdtfl w16du wp14">
+<w:numbering xmlns:wpc="http://schemas.microsoft.com/office/word/2010/wordprocessingCanvas" xmlns:cx="http://schemas.microsoft.com/office/drawing/2014/chartex" xmlns:cx1="http://schemas.microsoft.com/office/drawing/2015/9/8/chartex" xmlns:cx2="http://schemas.microsoft.com/office/drawing/2015/10/21/chartex" xmlns:cx3="http://schemas.microsoft.com/office/drawing/2016/5/9/chartex" xmlns:cx4="http://schemas.microsoft.com/office/drawing/2016/5/10/chartex" xmlns:cx5="http://schemas.microsoft.com/office/drawing/2016/5/11/chartex" xmlns:cx6="http://schemas.microsoft.com/office/drawing/2016/5/12/chartex" xmlns:cx7="http://schemas.microsoft.com/office/drawing/2016/5/13/chartex" xmlns:cx8="http://schemas.microsoft.com/office/drawing/2016/5/14/chartex" xmlns:mc="http://schemas.openxmlformats.org/markup-compatibility/2006" xmlns:aink="http://schemas.microsoft.com/office/drawing/2016/ink" xmlns:am3d="http://schemas.microsoft.com/office/drawing/2017/model3d" xmlns:o="urn:schemas-microsoft-com:office:office" xmlns:r="http://schemas.openxmlformats.org/officeDocument/2006/relationships" xmlns:m="http://schemas.openxmlformats.org/officeDocument/2006/math" xmlns:v="urn:schemas-microsoft-com:vml" xmlns:wp14="http://schemas.microsoft.com/office/word/2010/wordprocessingDrawing" xmlns:wp="http://schemas.openxmlformats.org/drawingml/2006/wordprocessingDrawing" xmlns:w10="urn:schemas-microsoft-com:office:word" xmlns:w="http://schemas.openxmlformats.org/wordprocessingml/2006/main" xmlns:w14="http://schemas.microsoft.com/office/word/2010/wordml" xmlns:w15="http://schemas.microsoft.com/office/word/2012/wordml" xmlns:w16cex="http://schemas.microsoft.com/office/word/2018/wordml/cex" xmlns:w16cid="http://schemas.microsoft.com/office/word/2016/wordml/cid" xmlns:w16="http://schemas.microsoft.com/office/word/2018/wordml" xmlns:w16sdtdh="http://schemas.microsoft.com/office/word/2020/wordml/sdtdatahash" xmlns:w16se="http://schemas.microsoft.com/office/word/2015/wordml/symex" xmlns:wpg="http://schemas.microsoft.com/office/word/2010/wordprocessingGroup" xmlns:wpi="http://schemas.microsoft.com/office/word/2010/wordprocessingInk" xmlns:wne="http://schemas.microsoft.com/office/word/2006/wordml" xmlns:wps="http://schemas.microsoft.com/office/word/2010/wordprocessingShape" mc:Ignorable="w14 w15 w16se w16cid w16 w16cex w16sdtdh wp14">
   <w:abstractNum w:abstractNumId="0" w15:restartNumberingAfterBreak="0">
     <w:nsid w:val="3B5743A5"/>
     <w:multiLevelType w:val="multilevel"/>
@@ -14498,17 +14856,17 @@
       </w:rPr>
     </w:lvl>
   </w:abstractNum>
-  <w:num w:numId="1" w16cid:durableId="960110217">
+  <w:num w:numId="1">
     <w:abstractNumId w:val="1"/>
   </w:num>
-  <w:num w:numId="2" w16cid:durableId="952325137">
+  <w:num w:numId="2">
     <w:abstractNumId w:val="0"/>
   </w:num>
 </w:numbering>
 </file>
 
 <file path=word/styles.xml><?xml version="1.0" encoding="utf-8"?>
-<w:styles xmlns:mc="http://schemas.openxmlformats.org/markup-compatibility/2006" xmlns:r="http://schemas.openxmlformats.org/officeDocument/2006/relationships" xmlns:w="http://schemas.openxmlformats.org/wordprocessingml/2006/main" xmlns:w14="http://schemas.microsoft.com/office/word/2010/wordml" xmlns:w15="http://schemas.microsoft.com/office/word/2012/wordml" xmlns:w16cex="http://schemas.microsoft.com/office/word/2018/wordml/cex" xmlns:w16cid="http://schemas.microsoft.com/office/word/2016/wordml/cid" xmlns:w16="http://schemas.microsoft.com/office/word/2018/wordml" xmlns:w16du="http://schemas.microsoft.com/office/word/2023/wordml/word16du" xmlns:w16sdtdh="http://schemas.microsoft.com/office/word/2020/wordml/sdtdatahash" xmlns:w16sdtfl="http://schemas.microsoft.com/office/word/2024/wordml/sdtformatlock" xmlns:w16se="http://schemas.microsoft.com/office/word/2015/wordml/symex" mc:Ignorable="w14 w15 w16se w16cid w16 w16cex w16sdtdh w16sdtfl w16du">
+<w:styles xmlns:mc="http://schemas.openxmlformats.org/markup-compatibility/2006" xmlns:r="http://schemas.openxmlformats.org/officeDocument/2006/relationships" xmlns:w="http://schemas.openxmlformats.org/wordprocessingml/2006/main" xmlns:w14="http://schemas.microsoft.com/office/word/2010/wordml" xmlns:w15="http://schemas.microsoft.com/office/word/2012/wordml" xmlns:w16cex="http://schemas.microsoft.com/office/word/2018/wordml/cex" xmlns:w16cid="http://schemas.microsoft.com/office/word/2016/wordml/cid" xmlns:w16="http://schemas.microsoft.com/office/word/2018/wordml" xmlns:w16sdtdh="http://schemas.microsoft.com/office/word/2020/wordml/sdtdatahash" xmlns:w16se="http://schemas.microsoft.com/office/word/2015/wordml/symex" mc:Ignorable="w14 w15 w16se w16cid w16 w16cex w16sdtdh">
   <w:docDefaults>
     <w:rPrDefault>
       <w:rPr>
@@ -14923,12 +15281,12 @@
     <w:link w:val="Ttulo1Char"/>
     <w:uiPriority w:val="9"/>
     <w:qFormat/>
+    <w:rsid w:val="0019649B"/>
     <w:pPr>
       <w:keepNext/>
       <w:keepLines/>
       <w:spacing w:after="159"/>
-      <w:ind w:left="1946" w:hanging="10"/>
-      <w:jc w:val="center"/>
+      <w:ind w:left="718" w:hanging="10"/>
       <w:outlineLvl w:val="0"/>
     </w:pPr>
     <w:rPr>
@@ -15025,6 +15383,8 @@
   <w:style w:type="character" w:customStyle="1" w:styleId="Ttulo1Char">
     <w:name w:val="Título 1 Char"/>
     <w:link w:val="Ttulo1"/>
+    <w:uiPriority w:val="9"/>
+    <w:rsid w:val="0019649B"/>
     <w:rPr>
       <w:rFonts w:ascii="Arial" w:eastAsia="Arial" w:hAnsi="Arial" w:cs="Arial"/>
       <w:b/>
@@ -15140,7 +15500,6 @@
     <w:pPr>
       <w:spacing w:before="240" w:after="0"/>
       <w:ind w:left="0" w:firstLine="0"/>
-      <w:jc w:val="left"/>
       <w:outlineLvl w:val="9"/>
     </w:pPr>
     <w:rPr>

</xml_diff>

<commit_message>
Atualiza documentação do sistema
</commit_message>
<xml_diff>
--- a/docs/DocumentacaoSistema.docx
+++ b/docs/DocumentacaoSistema.docx
@@ -1,6 +1,6 @@
 
 <file path=word/document.xml><?xml version="1.0" encoding="utf-8"?>
-<w:document xmlns:wpc="http://schemas.microsoft.com/office/word/2010/wordprocessingCanvas" xmlns:cx="http://schemas.microsoft.com/office/drawing/2014/chartex" xmlns:cx1="http://schemas.microsoft.com/office/drawing/2015/9/8/chartex" xmlns:cx2="http://schemas.microsoft.com/office/drawing/2015/10/21/chartex" xmlns:cx3="http://schemas.microsoft.com/office/drawing/2016/5/9/chartex" xmlns:cx4="http://schemas.microsoft.com/office/drawing/2016/5/10/chartex" xmlns:cx5="http://schemas.microsoft.com/office/drawing/2016/5/11/chartex" xmlns:cx6="http://schemas.microsoft.com/office/drawing/2016/5/12/chartex" xmlns:cx7="http://schemas.microsoft.com/office/drawing/2016/5/13/chartex" xmlns:cx8="http://schemas.microsoft.com/office/drawing/2016/5/14/chartex" xmlns:mc="http://schemas.openxmlformats.org/markup-compatibility/2006" xmlns:aink="http://schemas.microsoft.com/office/drawing/2016/ink" xmlns:am3d="http://schemas.microsoft.com/office/drawing/2017/model3d" xmlns:o="urn:schemas-microsoft-com:office:office" xmlns:r="http://schemas.openxmlformats.org/officeDocument/2006/relationships" xmlns:m="http://schemas.openxmlformats.org/officeDocument/2006/math" xmlns:v="urn:schemas-microsoft-com:vml" xmlns:wp14="http://schemas.microsoft.com/office/word/2010/wordprocessingDrawing" xmlns:wp="http://schemas.openxmlformats.org/drawingml/2006/wordprocessingDrawing" xmlns:w10="urn:schemas-microsoft-com:office:word" xmlns:w="http://schemas.openxmlformats.org/wordprocessingml/2006/main" xmlns:w14="http://schemas.microsoft.com/office/word/2010/wordml" xmlns:w15="http://schemas.microsoft.com/office/word/2012/wordml" xmlns:w16cex="http://schemas.microsoft.com/office/word/2018/wordml/cex" xmlns:w16cid="http://schemas.microsoft.com/office/word/2016/wordml/cid" xmlns:w16="http://schemas.microsoft.com/office/word/2018/wordml" xmlns:w16sdtdh="http://schemas.microsoft.com/office/word/2020/wordml/sdtdatahash" xmlns:w16se="http://schemas.microsoft.com/office/word/2015/wordml/symex" xmlns:wpg="http://schemas.microsoft.com/office/word/2010/wordprocessingGroup" xmlns:wpi="http://schemas.microsoft.com/office/word/2010/wordprocessingInk" xmlns:wne="http://schemas.microsoft.com/office/word/2006/wordml" xmlns:wps="http://schemas.microsoft.com/office/word/2010/wordprocessingShape" mc:Ignorable="w14 w15 w16se w16cid w16 w16cex w16sdtdh wp14">
+<w:document xmlns:wpc="http://schemas.microsoft.com/office/word/2010/wordprocessingCanvas" xmlns:cx="http://schemas.microsoft.com/office/drawing/2014/chartex" xmlns:cx1="http://schemas.microsoft.com/office/drawing/2015/9/8/chartex" xmlns:cx2="http://schemas.microsoft.com/office/drawing/2015/10/21/chartex" xmlns:cx3="http://schemas.microsoft.com/office/drawing/2016/5/9/chartex" xmlns:cx4="http://schemas.microsoft.com/office/drawing/2016/5/10/chartex" xmlns:cx5="http://schemas.microsoft.com/office/drawing/2016/5/11/chartex" xmlns:cx6="http://schemas.microsoft.com/office/drawing/2016/5/12/chartex" xmlns:cx7="http://schemas.microsoft.com/office/drawing/2016/5/13/chartex" xmlns:cx8="http://schemas.microsoft.com/office/drawing/2016/5/14/chartex" xmlns:mc="http://schemas.openxmlformats.org/markup-compatibility/2006" xmlns:aink="http://schemas.microsoft.com/office/drawing/2016/ink" xmlns:am3d="http://schemas.microsoft.com/office/drawing/2017/model3d" xmlns:o="urn:schemas-microsoft-com:office:office" xmlns:oel="http://schemas.microsoft.com/office/2019/extlst" xmlns:r="http://schemas.openxmlformats.org/officeDocument/2006/relationships" xmlns:m="http://schemas.openxmlformats.org/officeDocument/2006/math" xmlns:v="urn:schemas-microsoft-com:vml" xmlns:wp14="http://schemas.microsoft.com/office/word/2010/wordprocessingDrawing" xmlns:wp="http://schemas.openxmlformats.org/drawingml/2006/wordprocessingDrawing" xmlns:w10="urn:schemas-microsoft-com:office:word" xmlns:w="http://schemas.openxmlformats.org/wordprocessingml/2006/main" xmlns:w14="http://schemas.microsoft.com/office/word/2010/wordml" xmlns:w15="http://schemas.microsoft.com/office/word/2012/wordml" xmlns:w16cex="http://schemas.microsoft.com/office/word/2018/wordml/cex" xmlns:w16cid="http://schemas.microsoft.com/office/word/2016/wordml/cid" xmlns:w16="http://schemas.microsoft.com/office/word/2018/wordml" xmlns:w16du="http://schemas.microsoft.com/office/word/2023/wordml/word16du" xmlns:w16sdtdh="http://schemas.microsoft.com/office/word/2020/wordml/sdtdatahash" xmlns:w16sdtfl="http://schemas.microsoft.com/office/word/2024/wordml/sdtformatlock" xmlns:w16se="http://schemas.microsoft.com/office/word/2015/wordml/symex" xmlns:wpg="http://schemas.microsoft.com/office/word/2010/wordprocessingGroup" xmlns:wpi="http://schemas.microsoft.com/office/word/2010/wordprocessingInk" xmlns:wne="http://schemas.microsoft.com/office/word/2006/wordml" xmlns:wps="http://schemas.microsoft.com/office/word/2010/wordprocessingShape" mc:Ignorable="w14 w15 w16se w16cid w16 w16cex w16sdtdh w16sdtfl w16du wp14">
   <w:body>
     <w:p>
       <w:pPr>
@@ -669,7 +669,9 @@
               <w:rFonts w:asciiTheme="minorHAnsi" w:eastAsiaTheme="minorEastAsia" w:hAnsiTheme="minorHAnsi" w:cstheme="minorBidi"/>
               <w:noProof/>
               <w:color w:val="auto"/>
-              <w:sz w:val="22"/>
+              <w:kern w:val="2"/>
+              <w:szCs w:val="24"/>
+              <w14:ligatures w14:val="standardContextual"/>
             </w:rPr>
           </w:pPr>
           <w:r>
@@ -681,7 +683,7 @@
           <w:r>
             <w:fldChar w:fldCharType="separate"/>
           </w:r>
-          <w:hyperlink w:anchor="_Toc233893997" w:history="1">
+          <w:hyperlink w:anchor="_Toc234146042" w:history="1">
             <w:r>
               <w:rPr>
                 <w:rStyle w:val="Hyperlink"/>
@@ -708,7 +710,7 @@
                 <w:noProof/>
                 <w:webHidden/>
               </w:rPr>
-              <w:instrText xml:space="preserve"> PAGEREF _Toc233893997 \h </w:instrText>
+              <w:instrText xml:space="preserve"> PAGEREF _Toc234146042 \h </w:instrText>
             </w:r>
             <w:r>
               <w:rPr>
@@ -749,10 +751,12 @@
               <w:rFonts w:asciiTheme="minorHAnsi" w:eastAsiaTheme="minorEastAsia" w:hAnsiTheme="minorHAnsi" w:cstheme="minorBidi"/>
               <w:noProof/>
               <w:color w:val="auto"/>
-              <w:sz w:val="22"/>
+              <w:kern w:val="2"/>
+              <w:szCs w:val="24"/>
+              <w14:ligatures w14:val="standardContextual"/>
             </w:rPr>
           </w:pPr>
-          <w:hyperlink w:anchor="_Toc233893998" w:history="1">
+          <w:hyperlink w:anchor="_Toc234146043" w:history="1">
             <w:r>
               <w:rPr>
                 <w:rStyle w:val="Hyperlink"/>
@@ -779,7 +783,7 @@
                 <w:noProof/>
                 <w:webHidden/>
               </w:rPr>
-              <w:instrText xml:space="preserve"> PAGEREF _Toc233893998 \h </w:instrText>
+              <w:instrText xml:space="preserve"> PAGEREF _Toc234146043 \h </w:instrText>
             </w:r>
             <w:r>
               <w:rPr>
@@ -820,10 +824,12 @@
               <w:rFonts w:asciiTheme="minorHAnsi" w:eastAsiaTheme="minorEastAsia" w:hAnsiTheme="minorHAnsi" w:cstheme="minorBidi"/>
               <w:noProof/>
               <w:color w:val="auto"/>
-              <w:sz w:val="22"/>
+              <w:kern w:val="2"/>
+              <w:szCs w:val="24"/>
+              <w14:ligatures w14:val="standardContextual"/>
             </w:rPr>
           </w:pPr>
-          <w:hyperlink w:anchor="_Toc233893999" w:history="1">
+          <w:hyperlink w:anchor="_Toc234146044" w:history="1">
             <w:r>
               <w:rPr>
                 <w:rStyle w:val="Hyperlink"/>
@@ -850,7 +856,7 @@
                 <w:noProof/>
                 <w:webHidden/>
               </w:rPr>
-              <w:instrText xml:space="preserve"> PAGEREF _Toc233893999 \h </w:instrText>
+              <w:instrText xml:space="preserve"> PAGEREF _Toc234146044 \h </w:instrText>
             </w:r>
             <w:r>
               <w:rPr>
@@ -891,10 +897,12 @@
               <w:rFonts w:asciiTheme="minorHAnsi" w:eastAsiaTheme="minorEastAsia" w:hAnsiTheme="minorHAnsi" w:cstheme="minorBidi"/>
               <w:noProof/>
               <w:color w:val="auto"/>
-              <w:sz w:val="22"/>
+              <w:kern w:val="2"/>
+              <w:szCs w:val="24"/>
+              <w14:ligatures w14:val="standardContextual"/>
             </w:rPr>
           </w:pPr>
-          <w:hyperlink w:anchor="_Toc233894000" w:history="1">
+          <w:hyperlink w:anchor="_Toc234146045" w:history="1">
             <w:r>
               <w:rPr>
                 <w:rStyle w:val="Hyperlink"/>
@@ -921,7 +929,7 @@
                 <w:noProof/>
                 <w:webHidden/>
               </w:rPr>
-              <w:instrText xml:space="preserve"> PAGEREF _Toc233894000 \h </w:instrText>
+              <w:instrText xml:space="preserve"> PAGEREF _Toc234146045 \h </w:instrText>
             </w:r>
             <w:r>
               <w:rPr>
@@ -962,10 +970,12 @@
               <w:rFonts w:asciiTheme="minorHAnsi" w:eastAsiaTheme="minorEastAsia" w:hAnsiTheme="minorHAnsi" w:cstheme="minorBidi"/>
               <w:noProof/>
               <w:color w:val="auto"/>
-              <w:sz w:val="22"/>
+              <w:kern w:val="2"/>
+              <w:szCs w:val="24"/>
+              <w14:ligatures w14:val="standardContextual"/>
             </w:rPr>
           </w:pPr>
-          <w:hyperlink w:anchor="_Toc233894001" w:history="1">
+          <w:hyperlink w:anchor="_Toc234146046" w:history="1">
             <w:r>
               <w:rPr>
                 <w:rStyle w:val="Hyperlink"/>
@@ -992,7 +1002,7 @@
                 <w:noProof/>
                 <w:webHidden/>
               </w:rPr>
-              <w:instrText xml:space="preserve"> PAGEREF _Toc233894001 \h </w:instrText>
+              <w:instrText xml:space="preserve"> PAGEREF _Toc234146046 \h </w:instrText>
             </w:r>
             <w:r>
               <w:rPr>
@@ -1012,7 +1022,7 @@
                 <w:noProof/>
                 <w:webHidden/>
               </w:rPr>
-              <w:t>7</w:t>
+              <w:t>8</w:t>
             </w:r>
             <w:r>
               <w:rPr>
@@ -1033,10 +1043,12 @@
               <w:rFonts w:asciiTheme="minorHAnsi" w:eastAsiaTheme="minorEastAsia" w:hAnsiTheme="minorHAnsi" w:cstheme="minorBidi"/>
               <w:noProof/>
               <w:color w:val="auto"/>
-              <w:sz w:val="22"/>
+              <w:kern w:val="2"/>
+              <w:szCs w:val="24"/>
+              <w14:ligatures w14:val="standardContextual"/>
             </w:rPr>
           </w:pPr>
-          <w:hyperlink w:anchor="_Toc233894002" w:history="1">
+          <w:hyperlink w:anchor="_Toc234146047" w:history="1">
             <w:r>
               <w:rPr>
                 <w:rStyle w:val="Hyperlink"/>
@@ -1063,7 +1075,7 @@
                 <w:noProof/>
                 <w:webHidden/>
               </w:rPr>
-              <w:instrText xml:space="preserve"> PAGEREF _Toc233894002 \h </w:instrText>
+              <w:instrText xml:space="preserve"> PAGEREF _Toc234146047 \h </w:instrText>
             </w:r>
             <w:r>
               <w:rPr>
@@ -1083,7 +1095,7 @@
                 <w:noProof/>
                 <w:webHidden/>
               </w:rPr>
-              <w:t>8</w:t>
+              <w:t>9</w:t>
             </w:r>
             <w:r>
               <w:rPr>
@@ -1104,10 +1116,12 @@
               <w:rFonts w:asciiTheme="minorHAnsi" w:eastAsiaTheme="minorEastAsia" w:hAnsiTheme="minorHAnsi" w:cstheme="minorBidi"/>
               <w:noProof/>
               <w:color w:val="auto"/>
-              <w:sz w:val="22"/>
+              <w:kern w:val="2"/>
+              <w:szCs w:val="24"/>
+              <w14:ligatures w14:val="standardContextual"/>
             </w:rPr>
           </w:pPr>
-          <w:hyperlink w:anchor="_Toc233894003" w:history="1">
+          <w:hyperlink w:anchor="_Toc234146048" w:history="1">
             <w:r>
               <w:rPr>
                 <w:rStyle w:val="Hyperlink"/>
@@ -1134,7 +1148,7 @@
                 <w:noProof/>
                 <w:webHidden/>
               </w:rPr>
-              <w:instrText xml:space="preserve"> PAGEREF _Toc233894003 \h </w:instrText>
+              <w:instrText xml:space="preserve"> PAGEREF _Toc234146048 \h </w:instrText>
             </w:r>
             <w:r>
               <w:rPr>
@@ -1154,7 +1168,7 @@
                 <w:noProof/>
                 <w:webHidden/>
               </w:rPr>
-              <w:t>8</w:t>
+              <w:t>9</w:t>
             </w:r>
             <w:r>
               <w:rPr>
@@ -1175,10 +1189,12 @@
               <w:rFonts w:asciiTheme="minorHAnsi" w:eastAsiaTheme="minorEastAsia" w:hAnsiTheme="minorHAnsi" w:cstheme="minorBidi"/>
               <w:noProof/>
               <w:color w:val="auto"/>
-              <w:sz w:val="22"/>
+              <w:kern w:val="2"/>
+              <w:szCs w:val="24"/>
+              <w14:ligatures w14:val="standardContextual"/>
             </w:rPr>
           </w:pPr>
-          <w:hyperlink w:anchor="_Toc233894004" w:history="1">
+          <w:hyperlink w:anchor="_Toc234146049" w:history="1">
             <w:r>
               <w:rPr>
                 <w:rStyle w:val="Hyperlink"/>
@@ -1205,7 +1221,7 @@
                 <w:noProof/>
                 <w:webHidden/>
               </w:rPr>
-              <w:instrText xml:space="preserve"> PAGEREF _Toc233894004 \h </w:instrText>
+              <w:instrText xml:space="preserve"> PAGEREF _Toc234146049 \h </w:instrText>
             </w:r>
             <w:r>
               <w:rPr>
@@ -1225,7 +1241,7 @@
                 <w:noProof/>
                 <w:webHidden/>
               </w:rPr>
-              <w:t>9</w:t>
+              <w:t>10</w:t>
             </w:r>
             <w:r>
               <w:rPr>
@@ -1246,10 +1262,12 @@
               <w:rFonts w:asciiTheme="minorHAnsi" w:eastAsiaTheme="minorEastAsia" w:hAnsiTheme="minorHAnsi" w:cstheme="minorBidi"/>
               <w:noProof/>
               <w:color w:val="auto"/>
-              <w:sz w:val="22"/>
+              <w:kern w:val="2"/>
+              <w:szCs w:val="24"/>
+              <w14:ligatures w14:val="standardContextual"/>
             </w:rPr>
           </w:pPr>
-          <w:hyperlink w:anchor="_Toc233894005" w:history="1">
+          <w:hyperlink w:anchor="_Toc234146050" w:history="1">
             <w:r>
               <w:rPr>
                 <w:rStyle w:val="Hyperlink"/>
@@ -1276,7 +1294,7 @@
                 <w:noProof/>
                 <w:webHidden/>
               </w:rPr>
-              <w:instrText xml:space="preserve"> PAGEREF _Toc233894005 \h </w:instrText>
+              <w:instrText xml:space="preserve"> PAGEREF _Toc234146050 \h </w:instrText>
             </w:r>
             <w:r>
               <w:rPr>
@@ -1296,7 +1314,7 @@
                 <w:noProof/>
                 <w:webHidden/>
               </w:rPr>
-              <w:t>9</w:t>
+              <w:t>10</w:t>
             </w:r>
             <w:r>
               <w:rPr>
@@ -1317,10 +1335,12 @@
               <w:rFonts w:asciiTheme="minorHAnsi" w:eastAsiaTheme="minorEastAsia" w:hAnsiTheme="minorHAnsi" w:cstheme="minorBidi"/>
               <w:noProof/>
               <w:color w:val="auto"/>
-              <w:sz w:val="22"/>
+              <w:kern w:val="2"/>
+              <w:szCs w:val="24"/>
+              <w14:ligatures w14:val="standardContextual"/>
             </w:rPr>
           </w:pPr>
-          <w:hyperlink w:anchor="_Toc233894006" w:history="1">
+          <w:hyperlink w:anchor="_Toc234146051" w:history="1">
             <w:r>
               <w:rPr>
                 <w:rStyle w:val="Hyperlink"/>
@@ -1347,7 +1367,7 @@
                 <w:noProof/>
                 <w:webHidden/>
               </w:rPr>
-              <w:instrText xml:space="preserve"> PAGEREF _Toc233894006 \h </w:instrText>
+              <w:instrText xml:space="preserve"> PAGEREF _Toc234146051 \h </w:instrText>
             </w:r>
             <w:r>
               <w:rPr>
@@ -1367,7 +1387,7 @@
                 <w:noProof/>
                 <w:webHidden/>
               </w:rPr>
-              <w:t>10</w:t>
+              <w:t>11</w:t>
             </w:r>
             <w:r>
               <w:rPr>
@@ -1388,10 +1408,12 @@
               <w:rFonts w:asciiTheme="minorHAnsi" w:eastAsiaTheme="minorEastAsia" w:hAnsiTheme="minorHAnsi" w:cstheme="minorBidi"/>
               <w:noProof/>
               <w:color w:val="auto"/>
-              <w:sz w:val="22"/>
+              <w:kern w:val="2"/>
+              <w:szCs w:val="24"/>
+              <w14:ligatures w14:val="standardContextual"/>
             </w:rPr>
           </w:pPr>
-          <w:hyperlink w:anchor="_Toc233894007" w:history="1">
+          <w:hyperlink w:anchor="_Toc234146052" w:history="1">
             <w:r>
               <w:rPr>
                 <w:rStyle w:val="Hyperlink"/>
@@ -1418,7 +1440,7 @@
                 <w:noProof/>
                 <w:webHidden/>
               </w:rPr>
-              <w:instrText xml:space="preserve"> PAGEREF _Toc233894007 \h </w:instrText>
+              <w:instrText xml:space="preserve"> PAGEREF _Toc234146052 \h </w:instrText>
             </w:r>
             <w:r>
               <w:rPr>
@@ -1438,7 +1460,7 @@
                 <w:noProof/>
                 <w:webHidden/>
               </w:rPr>
-              <w:t>10</w:t>
+              <w:t>11</w:t>
             </w:r>
             <w:r>
               <w:rPr>
@@ -1459,10 +1481,12 @@
               <w:rFonts w:asciiTheme="minorHAnsi" w:eastAsiaTheme="minorEastAsia" w:hAnsiTheme="minorHAnsi" w:cstheme="minorBidi"/>
               <w:noProof/>
               <w:color w:val="auto"/>
-              <w:sz w:val="22"/>
+              <w:kern w:val="2"/>
+              <w:szCs w:val="24"/>
+              <w14:ligatures w14:val="standardContextual"/>
             </w:rPr>
           </w:pPr>
-          <w:hyperlink w:anchor="_Toc233894008" w:history="1">
+          <w:hyperlink w:anchor="_Toc234146053" w:history="1">
             <w:r>
               <w:rPr>
                 <w:rStyle w:val="Hyperlink"/>
@@ -1489,7 +1513,7 @@
                 <w:noProof/>
                 <w:webHidden/>
               </w:rPr>
-              <w:instrText xml:space="preserve"> PAGEREF _Toc233894008 \h </w:instrText>
+              <w:instrText xml:space="preserve"> PAGEREF _Toc234146053 \h </w:instrText>
             </w:r>
             <w:r>
               <w:rPr>
@@ -1530,16 +1554,18 @@
               <w:rFonts w:asciiTheme="minorHAnsi" w:eastAsiaTheme="minorEastAsia" w:hAnsiTheme="minorHAnsi" w:cstheme="minorBidi"/>
               <w:noProof/>
               <w:color w:val="auto"/>
-              <w:sz w:val="22"/>
+              <w:kern w:val="2"/>
+              <w:szCs w:val="24"/>
+              <w14:ligatures w14:val="standardContextual"/>
             </w:rPr>
           </w:pPr>
-          <w:hyperlink w:anchor="_Toc233894009" w:history="1">
+          <w:hyperlink w:anchor="_Toc234146054" w:history="1">
             <w:r>
               <w:rPr>
                 <w:rStyle w:val="Hyperlink"/>
                 <w:noProof/>
               </w:rPr>
-              <w:t>2.5 BANCO DE DADOS</w:t>
+              <w:t>2.4.7 CAMADA CONFIG</w:t>
             </w:r>
             <w:r>
               <w:rPr>
@@ -1560,7 +1586,7 @@
                 <w:noProof/>
                 <w:webHidden/>
               </w:rPr>
-              <w:instrText xml:space="preserve"> PAGEREF _Toc233894009 \h </w:instrText>
+              <w:instrText xml:space="preserve"> PAGEREF _Toc234146054 \h </w:instrText>
             </w:r>
             <w:r>
               <w:rPr>
@@ -1580,7 +1606,7 @@
                 <w:noProof/>
                 <w:webHidden/>
               </w:rPr>
-              <w:t>11</w:t>
+              <w:t>12</w:t>
             </w:r>
             <w:r>
               <w:rPr>
@@ -1601,16 +1627,18 @@
               <w:rFonts w:asciiTheme="minorHAnsi" w:eastAsiaTheme="minorEastAsia" w:hAnsiTheme="minorHAnsi" w:cstheme="minorBidi"/>
               <w:noProof/>
               <w:color w:val="auto"/>
-              <w:sz w:val="22"/>
+              <w:kern w:val="2"/>
+              <w:szCs w:val="24"/>
+              <w14:ligatures w14:val="standardContextual"/>
             </w:rPr>
           </w:pPr>
-          <w:hyperlink w:anchor="_Toc233894010" w:history="1">
+          <w:hyperlink w:anchor="_Toc234146055" w:history="1">
             <w:r>
               <w:rPr>
                 <w:rStyle w:val="Hyperlink"/>
                 <w:noProof/>
               </w:rPr>
-              <w:t>2.5.1 TABELA PERFIL</w:t>
+              <w:t>2.5 BANCO DE DADOS</w:t>
             </w:r>
             <w:r>
               <w:rPr>
@@ -1631,7 +1659,7 @@
                 <w:noProof/>
                 <w:webHidden/>
               </w:rPr>
-              <w:instrText xml:space="preserve"> PAGEREF _Toc233894010 \h </w:instrText>
+              <w:instrText xml:space="preserve"> PAGEREF _Toc234146055 \h </w:instrText>
             </w:r>
             <w:r>
               <w:rPr>
@@ -1672,16 +1700,18 @@
               <w:rFonts w:asciiTheme="minorHAnsi" w:eastAsiaTheme="minorEastAsia" w:hAnsiTheme="minorHAnsi" w:cstheme="minorBidi"/>
               <w:noProof/>
               <w:color w:val="auto"/>
-              <w:sz w:val="22"/>
+              <w:kern w:val="2"/>
+              <w:szCs w:val="24"/>
+              <w14:ligatures w14:val="standardContextual"/>
             </w:rPr>
           </w:pPr>
-          <w:hyperlink w:anchor="_Toc233894011" w:history="1">
+          <w:hyperlink w:anchor="_Toc234146056" w:history="1">
             <w:r>
               <w:rPr>
                 <w:rStyle w:val="Hyperlink"/>
                 <w:noProof/>
               </w:rPr>
-              <w:t>2.5.2 TABELA USUÁRIO</w:t>
+              <w:t>2.5.1 TABELA PERFIL</w:t>
             </w:r>
             <w:r>
               <w:rPr>
@@ -1702,7 +1732,7 @@
                 <w:noProof/>
                 <w:webHidden/>
               </w:rPr>
-              <w:instrText xml:space="preserve"> PAGEREF _Toc233894011 \h </w:instrText>
+              <w:instrText xml:space="preserve"> PAGEREF _Toc234146056 \h </w:instrText>
             </w:r>
             <w:r>
               <w:rPr>
@@ -1722,7 +1752,7 @@
                 <w:noProof/>
                 <w:webHidden/>
               </w:rPr>
-              <w:t>13</w:t>
+              <w:t>14</w:t>
             </w:r>
             <w:r>
               <w:rPr>
@@ -1743,16 +1773,18 @@
               <w:rFonts w:asciiTheme="minorHAnsi" w:eastAsiaTheme="minorEastAsia" w:hAnsiTheme="minorHAnsi" w:cstheme="minorBidi"/>
               <w:noProof/>
               <w:color w:val="auto"/>
-              <w:sz w:val="22"/>
+              <w:kern w:val="2"/>
+              <w:szCs w:val="24"/>
+              <w14:ligatures w14:val="standardContextual"/>
             </w:rPr>
           </w:pPr>
-          <w:hyperlink w:anchor="_Toc233894012" w:history="1">
+          <w:hyperlink w:anchor="_Toc234146057" w:history="1">
             <w:r>
               <w:rPr>
                 <w:rStyle w:val="Hyperlink"/>
                 <w:noProof/>
               </w:rPr>
-              <w:t>2.5.3 TABELA STATUS_PRODUTO</w:t>
+              <w:t>2.5.2 TABELA USUÁRIO</w:t>
             </w:r>
             <w:r>
               <w:rPr>
@@ -1773,7 +1805,7 @@
                 <w:noProof/>
                 <w:webHidden/>
               </w:rPr>
-              <w:instrText xml:space="preserve"> PAGEREF _Toc233894012 \h </w:instrText>
+              <w:instrText xml:space="preserve"> PAGEREF _Toc234146057 \h </w:instrText>
             </w:r>
             <w:r>
               <w:rPr>
@@ -1793,7 +1825,7 @@
                 <w:noProof/>
                 <w:webHidden/>
               </w:rPr>
-              <w:t>13</w:t>
+              <w:t>14</w:t>
             </w:r>
             <w:r>
               <w:rPr>
@@ -1814,16 +1846,18 @@
               <w:rFonts w:asciiTheme="minorHAnsi" w:eastAsiaTheme="minorEastAsia" w:hAnsiTheme="minorHAnsi" w:cstheme="minorBidi"/>
               <w:noProof/>
               <w:color w:val="auto"/>
-              <w:sz w:val="22"/>
+              <w:kern w:val="2"/>
+              <w:szCs w:val="24"/>
+              <w14:ligatures w14:val="standardContextual"/>
             </w:rPr>
           </w:pPr>
-          <w:hyperlink w:anchor="_Toc233894013" w:history="1">
+          <w:hyperlink w:anchor="_Toc234146058" w:history="1">
             <w:r>
               <w:rPr>
                 <w:rStyle w:val="Hyperlink"/>
                 <w:noProof/>
               </w:rPr>
-              <w:t>2.5.4 TABELA PRODUTO</w:t>
+              <w:t>2.5.3 TABELA STATUS_VERSAO_PRODUTO</w:t>
             </w:r>
             <w:r>
               <w:rPr>
@@ -1844,7 +1878,7 @@
                 <w:noProof/>
                 <w:webHidden/>
               </w:rPr>
-              <w:instrText xml:space="preserve"> PAGEREF _Toc233894013 \h </w:instrText>
+              <w:instrText xml:space="preserve"> PAGEREF _Toc234146058 \h </w:instrText>
             </w:r>
             <w:r>
               <w:rPr>
@@ -1885,16 +1919,18 @@
               <w:rFonts w:asciiTheme="minorHAnsi" w:eastAsiaTheme="minorEastAsia" w:hAnsiTheme="minorHAnsi" w:cstheme="minorBidi"/>
               <w:noProof/>
               <w:color w:val="auto"/>
-              <w:sz w:val="22"/>
+              <w:kern w:val="2"/>
+              <w:szCs w:val="24"/>
+              <w14:ligatures w14:val="standardContextual"/>
             </w:rPr>
           </w:pPr>
-          <w:hyperlink w:anchor="_Toc233894014" w:history="1">
+          <w:hyperlink w:anchor="_Toc234146059" w:history="1">
             <w:r>
               <w:rPr>
                 <w:rStyle w:val="Hyperlink"/>
                 <w:noProof/>
               </w:rPr>
-              <w:t>2.5.5 TABELA ESTOQUE</w:t>
+              <w:t>2.5.4 TABELA PRODUTO</w:t>
             </w:r>
             <w:r>
               <w:rPr>
@@ -1915,7 +1951,7 @@
                 <w:noProof/>
                 <w:webHidden/>
               </w:rPr>
-              <w:instrText xml:space="preserve"> PAGEREF _Toc233894014 \h </w:instrText>
+              <w:instrText xml:space="preserve"> PAGEREF _Toc234146059 \h </w:instrText>
             </w:r>
             <w:r>
               <w:rPr>
@@ -1935,7 +1971,7 @@
                 <w:noProof/>
                 <w:webHidden/>
               </w:rPr>
-              <w:t>14</w:t>
+              <w:t>15</w:t>
             </w:r>
             <w:r>
               <w:rPr>
@@ -1956,16 +1992,18 @@
               <w:rFonts w:asciiTheme="minorHAnsi" w:eastAsiaTheme="minorEastAsia" w:hAnsiTheme="minorHAnsi" w:cstheme="minorBidi"/>
               <w:noProof/>
               <w:color w:val="auto"/>
-              <w:sz w:val="22"/>
+              <w:kern w:val="2"/>
+              <w:szCs w:val="24"/>
+              <w14:ligatures w14:val="standardContextual"/>
             </w:rPr>
           </w:pPr>
-          <w:hyperlink w:anchor="_Toc233894015" w:history="1">
+          <w:hyperlink w:anchor="_Toc234146060" w:history="1">
             <w:r>
               <w:rPr>
                 <w:rStyle w:val="Hyperlink"/>
                 <w:noProof/>
               </w:rPr>
-              <w:t>2.5.6 TABELA RECEITA</w:t>
+              <w:t>2.5.5 TABELA ESTOQUE</w:t>
             </w:r>
             <w:r>
               <w:rPr>
@@ -1986,7 +2024,7 @@
                 <w:noProof/>
                 <w:webHidden/>
               </w:rPr>
-              <w:instrText xml:space="preserve"> PAGEREF _Toc233894015 \h </w:instrText>
+              <w:instrText xml:space="preserve"> PAGEREF _Toc234146060 \h </w:instrText>
             </w:r>
             <w:r>
               <w:rPr>
@@ -2027,16 +2065,18 @@
               <w:rFonts w:asciiTheme="minorHAnsi" w:eastAsiaTheme="minorEastAsia" w:hAnsiTheme="minorHAnsi" w:cstheme="minorBidi"/>
               <w:noProof/>
               <w:color w:val="auto"/>
-              <w:sz w:val="22"/>
+              <w:kern w:val="2"/>
+              <w:szCs w:val="24"/>
+              <w14:ligatures w14:val="standardContextual"/>
             </w:rPr>
           </w:pPr>
-          <w:hyperlink w:anchor="_Toc233894016" w:history="1">
+          <w:hyperlink w:anchor="_Toc234146061" w:history="1">
             <w:r>
               <w:rPr>
                 <w:rStyle w:val="Hyperlink"/>
                 <w:noProof/>
               </w:rPr>
-              <w:t>2.5.7 TABELA VERSAO_RECEITA</w:t>
+              <w:t>2.5.6 TABELA RECEITA</w:t>
             </w:r>
             <w:r>
               <w:rPr>
@@ -2057,7 +2097,7 @@
                 <w:noProof/>
                 <w:webHidden/>
               </w:rPr>
-              <w:instrText xml:space="preserve"> PAGEREF _Toc233894016 \h </w:instrText>
+              <w:instrText xml:space="preserve"> PAGEREF _Toc234146061 \h </w:instrText>
             </w:r>
             <w:r>
               <w:rPr>
@@ -2077,7 +2117,7 @@
                 <w:noProof/>
                 <w:webHidden/>
               </w:rPr>
-              <w:t>15</w:t>
+              <w:t>16</w:t>
             </w:r>
             <w:r>
               <w:rPr>
@@ -2098,16 +2138,18 @@
               <w:rFonts w:asciiTheme="minorHAnsi" w:eastAsiaTheme="minorEastAsia" w:hAnsiTheme="minorHAnsi" w:cstheme="minorBidi"/>
               <w:noProof/>
               <w:color w:val="auto"/>
-              <w:sz w:val="22"/>
+              <w:kern w:val="2"/>
+              <w:szCs w:val="24"/>
+              <w14:ligatures w14:val="standardContextual"/>
             </w:rPr>
           </w:pPr>
-          <w:hyperlink w:anchor="_Toc233894017" w:history="1">
+          <w:hyperlink w:anchor="_Toc234146062" w:history="1">
             <w:r>
               <w:rPr>
                 <w:rStyle w:val="Hyperlink"/>
                 <w:noProof/>
               </w:rPr>
-              <w:t>2.5.8 TABELA TESTE</w:t>
+              <w:t>2.5.7 TABELA VERSAO_RECEITA</w:t>
             </w:r>
             <w:r>
               <w:rPr>
@@ -2128,7 +2170,7 @@
                 <w:noProof/>
                 <w:webHidden/>
               </w:rPr>
-              <w:instrText xml:space="preserve"> PAGEREF _Toc233894017 \h </w:instrText>
+              <w:instrText xml:space="preserve"> PAGEREF _Toc234146062 \h </w:instrText>
             </w:r>
             <w:r>
               <w:rPr>
@@ -2169,16 +2211,18 @@
               <w:rFonts w:asciiTheme="minorHAnsi" w:eastAsiaTheme="minorEastAsia" w:hAnsiTheme="minorHAnsi" w:cstheme="minorBidi"/>
               <w:noProof/>
               <w:color w:val="auto"/>
-              <w:sz w:val="22"/>
+              <w:kern w:val="2"/>
+              <w:szCs w:val="24"/>
+              <w14:ligatures w14:val="standardContextual"/>
             </w:rPr>
           </w:pPr>
-          <w:hyperlink w:anchor="_Toc233894018" w:history="1">
+          <w:hyperlink w:anchor="_Toc234146063" w:history="1">
             <w:r>
               <w:rPr>
                 <w:rStyle w:val="Hyperlink"/>
                 <w:noProof/>
               </w:rPr>
-              <w:t>2.5.9 TABELA HISTÓRICO</w:t>
+              <w:t>2.5.8 TABELA TESTE</w:t>
             </w:r>
             <w:r>
               <w:rPr>
@@ -2199,7 +2243,7 @@
                 <w:noProof/>
                 <w:webHidden/>
               </w:rPr>
-              <w:instrText xml:space="preserve"> PAGEREF _Toc233894018 \h </w:instrText>
+              <w:instrText xml:space="preserve"> PAGEREF _Toc234146063 \h </w:instrText>
             </w:r>
             <w:r>
               <w:rPr>
@@ -2219,7 +2263,7 @@
                 <w:noProof/>
                 <w:webHidden/>
               </w:rPr>
-              <w:t>16</w:t>
+              <w:t>17</w:t>
             </w:r>
             <w:r>
               <w:rPr>
@@ -2240,16 +2284,18 @@
               <w:rFonts w:asciiTheme="minorHAnsi" w:eastAsiaTheme="minorEastAsia" w:hAnsiTheme="minorHAnsi" w:cstheme="minorBidi"/>
               <w:noProof/>
               <w:color w:val="auto"/>
-              <w:sz w:val="22"/>
+              <w:kern w:val="2"/>
+              <w:szCs w:val="24"/>
+              <w14:ligatures w14:val="standardContextual"/>
             </w:rPr>
           </w:pPr>
-          <w:hyperlink w:anchor="_Toc233894019" w:history="1">
+          <w:hyperlink w:anchor="_Toc234146064" w:history="1">
             <w:r>
               <w:rPr>
                 <w:rStyle w:val="Hyperlink"/>
                 <w:noProof/>
               </w:rPr>
-              <w:t>2.5.10 RELACIONAMENTOS</w:t>
+              <w:t>2.5.9 TABELA HISTÓRICO</w:t>
             </w:r>
             <w:r>
               <w:rPr>
@@ -2270,7 +2316,7 @@
                 <w:noProof/>
                 <w:webHidden/>
               </w:rPr>
-              <w:instrText xml:space="preserve"> PAGEREF _Toc233894019 \h </w:instrText>
+              <w:instrText xml:space="preserve"> PAGEREF _Toc234146064 \h </w:instrText>
             </w:r>
             <w:r>
               <w:rPr>
@@ -2311,16 +2357,18 @@
               <w:rFonts w:asciiTheme="minorHAnsi" w:eastAsiaTheme="minorEastAsia" w:hAnsiTheme="minorHAnsi" w:cstheme="minorBidi"/>
               <w:noProof/>
               <w:color w:val="auto"/>
-              <w:sz w:val="22"/>
+              <w:kern w:val="2"/>
+              <w:szCs w:val="24"/>
+              <w14:ligatures w14:val="standardContextual"/>
             </w:rPr>
           </w:pPr>
-          <w:hyperlink w:anchor="_Toc233894020" w:history="1">
+          <w:hyperlink w:anchor="_Toc234146065" w:history="1">
             <w:r>
               <w:rPr>
                 <w:rStyle w:val="Hyperlink"/>
                 <w:noProof/>
               </w:rPr>
-              <w:t>2.6 ESTRUTURA DA API</w:t>
+              <w:t>2.5.10 RELACIONAMENTOS</w:t>
             </w:r>
             <w:r>
               <w:rPr>
@@ -2341,7 +2389,7 @@
                 <w:noProof/>
                 <w:webHidden/>
               </w:rPr>
-              <w:instrText xml:space="preserve"> PAGEREF _Toc233894020 \h </w:instrText>
+              <w:instrText xml:space="preserve"> PAGEREF _Toc234146065 \h </w:instrText>
             </w:r>
             <w:r>
               <w:rPr>
@@ -2382,16 +2430,18 @@
               <w:rFonts w:asciiTheme="minorHAnsi" w:eastAsiaTheme="minorEastAsia" w:hAnsiTheme="minorHAnsi" w:cstheme="minorBidi"/>
               <w:noProof/>
               <w:color w:val="auto"/>
-              <w:sz w:val="22"/>
+              <w:kern w:val="2"/>
+              <w:szCs w:val="24"/>
+              <w14:ligatures w14:val="standardContextual"/>
             </w:rPr>
           </w:pPr>
-          <w:hyperlink w:anchor="_Toc233894021" w:history="1">
+          <w:hyperlink w:anchor="_Toc234146066" w:history="1">
             <w:r>
               <w:rPr>
                 <w:rStyle w:val="Hyperlink"/>
                 <w:noProof/>
               </w:rPr>
-              <w:t>2.6.1 MÉTODOS HTTP</w:t>
+              <w:t>2.6 ESTRUTURA DA API</w:t>
             </w:r>
             <w:r>
               <w:rPr>
@@ -2412,7 +2462,7 @@
                 <w:noProof/>
                 <w:webHidden/>
               </w:rPr>
-              <w:instrText xml:space="preserve"> PAGEREF _Toc233894021 \h </w:instrText>
+              <w:instrText xml:space="preserve"> PAGEREF _Toc234146066 \h </w:instrText>
             </w:r>
             <w:r>
               <w:rPr>
@@ -2453,16 +2503,18 @@
               <w:rFonts w:asciiTheme="minorHAnsi" w:eastAsiaTheme="minorEastAsia" w:hAnsiTheme="minorHAnsi" w:cstheme="minorBidi"/>
               <w:noProof/>
               <w:color w:val="auto"/>
-              <w:sz w:val="22"/>
+              <w:kern w:val="2"/>
+              <w:szCs w:val="24"/>
+              <w14:ligatures w14:val="standardContextual"/>
             </w:rPr>
           </w:pPr>
-          <w:hyperlink w:anchor="_Toc233894022" w:history="1">
+          <w:hyperlink w:anchor="_Toc234146067" w:history="1">
             <w:r>
               <w:rPr>
                 <w:rStyle w:val="Hyperlink"/>
                 <w:noProof/>
               </w:rPr>
-              <w:t>2.6.2 USUARIO CONTROLLER</w:t>
+              <w:t>2.6.1 MÉTODOS HTTP</w:t>
             </w:r>
             <w:r>
               <w:rPr>
@@ -2483,7 +2535,7 @@
                 <w:noProof/>
                 <w:webHidden/>
               </w:rPr>
-              <w:instrText xml:space="preserve"> PAGEREF _Toc233894022 \h </w:instrText>
+              <w:instrText xml:space="preserve"> PAGEREF _Toc234146067 \h </w:instrText>
             </w:r>
             <w:r>
               <w:rPr>
@@ -2503,7 +2555,7 @@
                 <w:noProof/>
                 <w:webHidden/>
               </w:rPr>
-              <w:t>19</w:t>
+              <w:t>20</w:t>
             </w:r>
             <w:r>
               <w:rPr>
@@ -2524,16 +2576,18 @@
               <w:rFonts w:asciiTheme="minorHAnsi" w:eastAsiaTheme="minorEastAsia" w:hAnsiTheme="minorHAnsi" w:cstheme="minorBidi"/>
               <w:noProof/>
               <w:color w:val="auto"/>
-              <w:sz w:val="22"/>
+              <w:kern w:val="2"/>
+              <w:szCs w:val="24"/>
+              <w14:ligatures w14:val="standardContextual"/>
             </w:rPr>
           </w:pPr>
-          <w:hyperlink w:anchor="_Toc233894023" w:history="1">
+          <w:hyperlink w:anchor="_Toc234146068" w:history="1">
             <w:r>
               <w:rPr>
                 <w:rStyle w:val="Hyperlink"/>
                 <w:noProof/>
               </w:rPr>
-              <w:t>2.6.3 PERFIL CONTROLLER</w:t>
+              <w:t>2.6.2 USUARIO CONTROLLER</w:t>
             </w:r>
             <w:r>
               <w:rPr>
@@ -2554,7 +2608,7 @@
                 <w:noProof/>
                 <w:webHidden/>
               </w:rPr>
-              <w:instrText xml:space="preserve"> PAGEREF _Toc233894023 \h </w:instrText>
+              <w:instrText xml:space="preserve"> PAGEREF _Toc234146068 \h </w:instrText>
             </w:r>
             <w:r>
               <w:rPr>
@@ -2574,7 +2628,7 @@
                 <w:noProof/>
                 <w:webHidden/>
               </w:rPr>
-              <w:t>20</w:t>
+              <w:t>21</w:t>
             </w:r>
             <w:r>
               <w:rPr>
@@ -2595,16 +2649,18 @@
               <w:rFonts w:asciiTheme="minorHAnsi" w:eastAsiaTheme="minorEastAsia" w:hAnsiTheme="minorHAnsi" w:cstheme="minorBidi"/>
               <w:noProof/>
               <w:color w:val="auto"/>
-              <w:sz w:val="22"/>
+              <w:kern w:val="2"/>
+              <w:szCs w:val="24"/>
+              <w14:ligatures w14:val="standardContextual"/>
             </w:rPr>
           </w:pPr>
-          <w:hyperlink w:anchor="_Toc233894024" w:history="1">
+          <w:hyperlink w:anchor="_Toc234146069" w:history="1">
             <w:r>
               <w:rPr>
                 <w:rStyle w:val="Hyperlink"/>
                 <w:noProof/>
               </w:rPr>
-              <w:t>2.6.4 PRODUTO CONTROLLER</w:t>
+              <w:t>2.6.3 PERFIL CONTROLLER</w:t>
             </w:r>
             <w:r>
               <w:rPr>
@@ -2625,7 +2681,7 @@
                 <w:noProof/>
                 <w:webHidden/>
               </w:rPr>
-              <w:instrText xml:space="preserve"> PAGEREF _Toc233894024 \h </w:instrText>
+              <w:instrText xml:space="preserve"> PAGEREF _Toc234146069 \h </w:instrText>
             </w:r>
             <w:r>
               <w:rPr>
@@ -2645,7 +2701,7 @@
                 <w:noProof/>
                 <w:webHidden/>
               </w:rPr>
-              <w:t>20</w:t>
+              <w:t>21</w:t>
             </w:r>
             <w:r>
               <w:rPr>
@@ -2666,16 +2722,18 @@
               <w:rFonts w:asciiTheme="minorHAnsi" w:eastAsiaTheme="minorEastAsia" w:hAnsiTheme="minorHAnsi" w:cstheme="minorBidi"/>
               <w:noProof/>
               <w:color w:val="auto"/>
-              <w:sz w:val="22"/>
+              <w:kern w:val="2"/>
+              <w:szCs w:val="24"/>
+              <w14:ligatures w14:val="standardContextual"/>
             </w:rPr>
           </w:pPr>
-          <w:hyperlink w:anchor="_Toc233894025" w:history="1">
+          <w:hyperlink w:anchor="_Toc234146070" w:history="1">
             <w:r>
               <w:rPr>
                 <w:rStyle w:val="Hyperlink"/>
                 <w:noProof/>
               </w:rPr>
-              <w:t>2.6.5 StatusProduto CONTROLLER</w:t>
+              <w:t>2.6.4 PRODUTO CONTROLLER</w:t>
             </w:r>
             <w:r>
               <w:rPr>
@@ -2696,7 +2754,7 @@
                 <w:noProof/>
                 <w:webHidden/>
               </w:rPr>
-              <w:instrText xml:space="preserve"> PAGEREF _Toc233894025 \h </w:instrText>
+              <w:instrText xml:space="preserve"> PAGEREF _Toc234146070 \h </w:instrText>
             </w:r>
             <w:r>
               <w:rPr>
@@ -2716,7 +2774,7 @@
                 <w:noProof/>
                 <w:webHidden/>
               </w:rPr>
-              <w:t>21</w:t>
+              <w:t>22</w:t>
             </w:r>
             <w:r>
               <w:rPr>
@@ -2737,16 +2795,18 @@
               <w:rFonts w:asciiTheme="minorHAnsi" w:eastAsiaTheme="minorEastAsia" w:hAnsiTheme="minorHAnsi" w:cstheme="minorBidi"/>
               <w:noProof/>
               <w:color w:val="auto"/>
-              <w:sz w:val="22"/>
+              <w:kern w:val="2"/>
+              <w:szCs w:val="24"/>
+              <w14:ligatures w14:val="standardContextual"/>
             </w:rPr>
           </w:pPr>
-          <w:hyperlink w:anchor="_Toc233894026" w:history="1">
+          <w:hyperlink w:anchor="_Toc234146071" w:history="1">
             <w:r>
               <w:rPr>
                 <w:rStyle w:val="Hyperlink"/>
                 <w:noProof/>
               </w:rPr>
-              <w:t>2.6.6 ESTOQUE CONTROLLER</w:t>
+              <w:t>2.6.5 StatusProduto CONTROLLER</w:t>
             </w:r>
             <w:r>
               <w:rPr>
@@ -2767,7 +2827,7 @@
                 <w:noProof/>
                 <w:webHidden/>
               </w:rPr>
-              <w:instrText xml:space="preserve"> PAGEREF _Toc233894026 \h </w:instrText>
+              <w:instrText xml:space="preserve"> PAGEREF _Toc234146071 \h </w:instrText>
             </w:r>
             <w:r>
               <w:rPr>
@@ -2808,16 +2868,18 @@
               <w:rFonts w:asciiTheme="minorHAnsi" w:eastAsiaTheme="minorEastAsia" w:hAnsiTheme="minorHAnsi" w:cstheme="minorBidi"/>
               <w:noProof/>
               <w:color w:val="auto"/>
-              <w:sz w:val="22"/>
+              <w:kern w:val="2"/>
+              <w:szCs w:val="24"/>
+              <w14:ligatures w14:val="standardContextual"/>
             </w:rPr>
           </w:pPr>
-          <w:hyperlink w:anchor="_Toc233894027" w:history="1">
+          <w:hyperlink w:anchor="_Toc234146072" w:history="1">
             <w:r>
               <w:rPr>
                 <w:rStyle w:val="Hyperlink"/>
                 <w:noProof/>
               </w:rPr>
-              <w:t>2.6.7 RECEITA CONTROLLER</w:t>
+              <w:t>2.6.6 ESTOQUE CONTROLLER</w:t>
             </w:r>
             <w:r>
               <w:rPr>
@@ -2838,7 +2900,7 @@
                 <w:noProof/>
                 <w:webHidden/>
               </w:rPr>
-              <w:instrText xml:space="preserve"> PAGEREF _Toc233894027 \h </w:instrText>
+              <w:instrText xml:space="preserve"> PAGEREF _Toc234146072 \h </w:instrText>
             </w:r>
             <w:r>
               <w:rPr>
@@ -2858,7 +2920,7 @@
                 <w:noProof/>
                 <w:webHidden/>
               </w:rPr>
-              <w:t>22</w:t>
+              <w:t>23</w:t>
             </w:r>
             <w:r>
               <w:rPr>
@@ -2879,16 +2941,18 @@
               <w:rFonts w:asciiTheme="minorHAnsi" w:eastAsiaTheme="minorEastAsia" w:hAnsiTheme="minorHAnsi" w:cstheme="minorBidi"/>
               <w:noProof/>
               <w:color w:val="auto"/>
-              <w:sz w:val="22"/>
+              <w:kern w:val="2"/>
+              <w:szCs w:val="24"/>
+              <w14:ligatures w14:val="standardContextual"/>
             </w:rPr>
           </w:pPr>
-          <w:hyperlink w:anchor="_Toc233894028" w:history="1">
+          <w:hyperlink w:anchor="_Toc234146073" w:history="1">
             <w:r>
               <w:rPr>
                 <w:rStyle w:val="Hyperlink"/>
                 <w:noProof/>
               </w:rPr>
-              <w:t>2.6.8 VersaoReceita CONTROLLER</w:t>
+              <w:t>2.6.7 RECEITA CONTROLLER</w:t>
             </w:r>
             <w:r>
               <w:rPr>
@@ -2909,7 +2973,7 @@
                 <w:noProof/>
                 <w:webHidden/>
               </w:rPr>
-              <w:instrText xml:space="preserve"> PAGEREF _Toc233894028 \h </w:instrText>
+              <w:instrText xml:space="preserve"> PAGEREF _Toc234146073 \h </w:instrText>
             </w:r>
             <w:r>
               <w:rPr>
@@ -2929,7 +2993,7 @@
                 <w:noProof/>
                 <w:webHidden/>
               </w:rPr>
-              <w:t>23</w:t>
+              <w:t>24</w:t>
             </w:r>
             <w:r>
               <w:rPr>
@@ -2950,16 +3014,18 @@
               <w:rFonts w:asciiTheme="minorHAnsi" w:eastAsiaTheme="minorEastAsia" w:hAnsiTheme="minorHAnsi" w:cstheme="minorBidi"/>
               <w:noProof/>
               <w:color w:val="auto"/>
-              <w:sz w:val="22"/>
+              <w:kern w:val="2"/>
+              <w:szCs w:val="24"/>
+              <w14:ligatures w14:val="standardContextual"/>
             </w:rPr>
           </w:pPr>
-          <w:hyperlink w:anchor="_Toc233894029" w:history="1">
+          <w:hyperlink w:anchor="_Toc234146074" w:history="1">
             <w:r>
               <w:rPr>
                 <w:rStyle w:val="Hyperlink"/>
                 <w:noProof/>
               </w:rPr>
-              <w:t>2.6.9 TESTE CONTROLER</w:t>
+              <w:t>2.6.8 VersaoReceita CONTROLLER</w:t>
             </w:r>
             <w:r>
               <w:rPr>
@@ -2980,7 +3046,7 @@
                 <w:noProof/>
                 <w:webHidden/>
               </w:rPr>
-              <w:instrText xml:space="preserve"> PAGEREF _Toc233894029 \h </w:instrText>
+              <w:instrText xml:space="preserve"> PAGEREF _Toc234146074 \h </w:instrText>
             </w:r>
             <w:r>
               <w:rPr>
@@ -3000,7 +3066,7 @@
                 <w:noProof/>
                 <w:webHidden/>
               </w:rPr>
-              <w:t>23</w:t>
+              <w:t>24</w:t>
             </w:r>
             <w:r>
               <w:rPr>
@@ -3021,16 +3087,18 @@
               <w:rFonts w:asciiTheme="minorHAnsi" w:eastAsiaTheme="minorEastAsia" w:hAnsiTheme="minorHAnsi" w:cstheme="minorBidi"/>
               <w:noProof/>
               <w:color w:val="auto"/>
-              <w:sz w:val="22"/>
+              <w:kern w:val="2"/>
+              <w:szCs w:val="24"/>
+              <w14:ligatures w14:val="standardContextual"/>
             </w:rPr>
           </w:pPr>
-          <w:hyperlink w:anchor="_Toc233894030" w:history="1">
+          <w:hyperlink w:anchor="_Toc234146075" w:history="1">
             <w:r>
               <w:rPr>
                 <w:rStyle w:val="Hyperlink"/>
                 <w:noProof/>
               </w:rPr>
-              <w:t>2.6.10 HISTORICO CONTROLLER</w:t>
+              <w:t>2.6.9 TESTE CONTROLER</w:t>
             </w:r>
             <w:r>
               <w:rPr>
@@ -3051,7 +3119,7 @@
                 <w:noProof/>
                 <w:webHidden/>
               </w:rPr>
-              <w:instrText xml:space="preserve"> PAGEREF _Toc233894030 \h </w:instrText>
+              <w:instrText xml:space="preserve"> PAGEREF _Toc234146075 \h </w:instrText>
             </w:r>
             <w:r>
               <w:rPr>
@@ -3071,7 +3139,7 @@
                 <w:noProof/>
                 <w:webHidden/>
               </w:rPr>
-              <w:t>24</w:t>
+              <w:t>25</w:t>
             </w:r>
             <w:r>
               <w:rPr>
@@ -3092,16 +3160,18 @@
               <w:rFonts w:asciiTheme="minorHAnsi" w:eastAsiaTheme="minorEastAsia" w:hAnsiTheme="minorHAnsi" w:cstheme="minorBidi"/>
               <w:noProof/>
               <w:color w:val="auto"/>
-              <w:sz w:val="22"/>
+              <w:kern w:val="2"/>
+              <w:szCs w:val="24"/>
+              <w14:ligatures w14:val="standardContextual"/>
             </w:rPr>
           </w:pPr>
-          <w:hyperlink w:anchor="_Toc233894031" w:history="1">
+          <w:hyperlink w:anchor="_Toc234146076" w:history="1">
             <w:r>
               <w:rPr>
                 <w:rStyle w:val="Hyperlink"/>
                 <w:noProof/>
               </w:rPr>
-              <w:t>2.7 TRATAMENTO DE EXCEÇÕES</w:t>
+              <w:t>2.6.10 HISTORICO CONTROLLER</w:t>
             </w:r>
             <w:r>
               <w:rPr>
@@ -3122,7 +3192,7 @@
                 <w:noProof/>
                 <w:webHidden/>
               </w:rPr>
-              <w:instrText xml:space="preserve"> PAGEREF _Toc233894031 \h </w:instrText>
+              <w:instrText xml:space="preserve"> PAGEREF _Toc234146076 \h </w:instrText>
             </w:r>
             <w:r>
               <w:rPr>
@@ -3142,7 +3212,7 @@
                 <w:noProof/>
                 <w:webHidden/>
               </w:rPr>
-              <w:t>24</w:t>
+              <w:t>25</w:t>
             </w:r>
             <w:r>
               <w:rPr>
@@ -3163,16 +3233,18 @@
               <w:rFonts w:asciiTheme="minorHAnsi" w:eastAsiaTheme="minorEastAsia" w:hAnsiTheme="minorHAnsi" w:cstheme="minorBidi"/>
               <w:noProof/>
               <w:color w:val="auto"/>
-              <w:sz w:val="22"/>
+              <w:kern w:val="2"/>
+              <w:szCs w:val="24"/>
+              <w14:ligatures w14:val="standardContextual"/>
             </w:rPr>
           </w:pPr>
-          <w:hyperlink w:anchor="_Toc233894032" w:history="1">
+          <w:hyperlink w:anchor="_Toc234146077" w:history="1">
             <w:r>
               <w:rPr>
                 <w:rStyle w:val="Hyperlink"/>
                 <w:noProof/>
               </w:rPr>
-              <w:t>2.7.1 GlobalExceptionHandler</w:t>
+              <w:t>2.6.11 AUTH CONTROLLER</w:t>
             </w:r>
             <w:r>
               <w:rPr>
@@ -3193,7 +3265,7 @@
                 <w:noProof/>
                 <w:webHidden/>
               </w:rPr>
-              <w:instrText xml:space="preserve"> PAGEREF _Toc233894032 \h </w:instrText>
+              <w:instrText xml:space="preserve"> PAGEREF _Toc234146077 \h </w:instrText>
             </w:r>
             <w:r>
               <w:rPr>
@@ -3213,7 +3285,7 @@
                 <w:noProof/>
                 <w:webHidden/>
               </w:rPr>
-              <w:t>25</w:t>
+              <w:t>26</w:t>
             </w:r>
             <w:r>
               <w:rPr>
@@ -3234,16 +3306,18 @@
               <w:rFonts w:asciiTheme="minorHAnsi" w:eastAsiaTheme="minorEastAsia" w:hAnsiTheme="minorHAnsi" w:cstheme="minorBidi"/>
               <w:noProof/>
               <w:color w:val="auto"/>
-              <w:sz w:val="22"/>
+              <w:kern w:val="2"/>
+              <w:szCs w:val="24"/>
+              <w14:ligatures w14:val="standardContextual"/>
             </w:rPr>
           </w:pPr>
-          <w:hyperlink w:anchor="_Toc233894033" w:history="1">
+          <w:hyperlink w:anchor="_Toc234146078" w:history="1">
             <w:r>
               <w:rPr>
                 <w:rStyle w:val="Hyperlink"/>
                 <w:noProof/>
               </w:rPr>
-              <w:t>2.7.2 ErrorResponse</w:t>
+              <w:t>2.7 TRATAMENTO DE EXCEÇÕES</w:t>
             </w:r>
             <w:r>
               <w:rPr>
@@ -3264,7 +3338,7 @@
                 <w:noProof/>
                 <w:webHidden/>
               </w:rPr>
-              <w:instrText xml:space="preserve"> PAGEREF _Toc233894033 \h </w:instrText>
+              <w:instrText xml:space="preserve"> PAGEREF _Toc234146078 \h </w:instrText>
             </w:r>
             <w:r>
               <w:rPr>
@@ -3284,7 +3358,7 @@
                 <w:noProof/>
                 <w:webHidden/>
               </w:rPr>
-              <w:t>25</w:t>
+              <w:t>26</w:t>
             </w:r>
             <w:r>
               <w:rPr>
@@ -3305,16 +3379,18 @@
               <w:rFonts w:asciiTheme="minorHAnsi" w:eastAsiaTheme="minorEastAsia" w:hAnsiTheme="minorHAnsi" w:cstheme="minorBidi"/>
               <w:noProof/>
               <w:color w:val="auto"/>
-              <w:sz w:val="22"/>
+              <w:kern w:val="2"/>
+              <w:szCs w:val="24"/>
+              <w14:ligatures w14:val="standardContextual"/>
             </w:rPr>
           </w:pPr>
-          <w:hyperlink w:anchor="_Toc233894034" w:history="1">
+          <w:hyperlink w:anchor="_Toc234146079" w:history="1">
             <w:r>
               <w:rPr>
                 <w:rStyle w:val="Hyperlink"/>
                 <w:noProof/>
               </w:rPr>
-              <w:t>2.7.3 EXCEÇÕES PERSONALIZADAS</w:t>
+              <w:t>2.7.1 GlobalExceptionHandler</w:t>
             </w:r>
             <w:r>
               <w:rPr>
@@ -3335,7 +3411,7 @@
                 <w:noProof/>
                 <w:webHidden/>
               </w:rPr>
-              <w:instrText xml:space="preserve"> PAGEREF _Toc233894034 \h </w:instrText>
+              <w:instrText xml:space="preserve"> PAGEREF _Toc234146079 \h </w:instrText>
             </w:r>
             <w:r>
               <w:rPr>
@@ -3376,16 +3452,18 @@
               <w:rFonts w:asciiTheme="minorHAnsi" w:eastAsiaTheme="minorEastAsia" w:hAnsiTheme="minorHAnsi" w:cstheme="minorBidi"/>
               <w:noProof/>
               <w:color w:val="auto"/>
-              <w:sz w:val="22"/>
+              <w:kern w:val="2"/>
+              <w:szCs w:val="24"/>
+              <w14:ligatures w14:val="standardContextual"/>
             </w:rPr>
           </w:pPr>
-          <w:hyperlink w:anchor="_Toc233894035" w:history="1">
+          <w:hyperlink w:anchor="_Toc234146080" w:history="1">
             <w:r>
               <w:rPr>
                 <w:rStyle w:val="Hyperlink"/>
                 <w:noProof/>
               </w:rPr>
-              <w:t>2.7.4 FLUXO DO TRATAMENTO DE EXCEÇÕES</w:t>
+              <w:t>2.7.2 ErrorResponse</w:t>
             </w:r>
             <w:r>
               <w:rPr>
@@ -3406,7 +3484,7 @@
                 <w:noProof/>
                 <w:webHidden/>
               </w:rPr>
-              <w:instrText xml:space="preserve"> PAGEREF _Toc233894035 \h </w:instrText>
+              <w:instrText xml:space="preserve"> PAGEREF _Toc234146080 \h </w:instrText>
             </w:r>
             <w:r>
               <w:rPr>
@@ -3447,15 +3525,163 @@
               <w:rFonts w:asciiTheme="minorHAnsi" w:eastAsiaTheme="minorEastAsia" w:hAnsiTheme="minorHAnsi" w:cstheme="minorBidi"/>
               <w:noProof/>
               <w:color w:val="auto"/>
-              <w:sz w:val="22"/>
+              <w:kern w:val="2"/>
+              <w:szCs w:val="24"/>
+              <w14:ligatures w14:val="standardContextual"/>
             </w:rPr>
           </w:pPr>
-          <w:hyperlink w:anchor="_Toc233894036" w:history="1">
+          <w:hyperlink w:anchor="_Toc234146081" w:history="1">
             <w:r>
               <w:rPr>
                 <w:rStyle w:val="Hyperlink"/>
                 <w:noProof/>
               </w:rPr>
+              <w:t>2.7.3 EXCEÇÕES PERSONALIZADAS</w:t>
+            </w:r>
+            <w:r>
+              <w:rPr>
+                <w:noProof/>
+                <w:webHidden/>
+              </w:rPr>
+              <w:tab/>
+            </w:r>
+            <w:r>
+              <w:rPr>
+                <w:noProof/>
+                <w:webHidden/>
+              </w:rPr>
+              <w:fldChar w:fldCharType="begin"/>
+            </w:r>
+            <w:r>
+              <w:rPr>
+                <w:noProof/>
+                <w:webHidden/>
+              </w:rPr>
+              <w:instrText xml:space="preserve"> PAGEREF _Toc234146081 \h </w:instrText>
+            </w:r>
+            <w:r>
+              <w:rPr>
+                <w:noProof/>
+                <w:webHidden/>
+              </w:rPr>
+            </w:r>
+            <w:r>
+              <w:rPr>
+                <w:noProof/>
+                <w:webHidden/>
+              </w:rPr>
+              <w:fldChar w:fldCharType="separate"/>
+            </w:r>
+            <w:r>
+              <w:rPr>
+                <w:noProof/>
+                <w:webHidden/>
+              </w:rPr>
+              <w:t>27</w:t>
+            </w:r>
+            <w:r>
+              <w:rPr>
+                <w:noProof/>
+                <w:webHidden/>
+              </w:rPr>
+              <w:fldChar w:fldCharType="end"/>
+            </w:r>
+          </w:hyperlink>
+        </w:p>
+        <w:p>
+          <w:pPr>
+            <w:pStyle w:val="Sumrio2"/>
+            <w:tabs>
+              <w:tab w:val="right" w:leader="dot" w:pos="9060"/>
+            </w:tabs>
+            <w:rPr>
+              <w:rFonts w:asciiTheme="minorHAnsi" w:eastAsiaTheme="minorEastAsia" w:hAnsiTheme="minorHAnsi" w:cstheme="minorBidi"/>
+              <w:noProof/>
+              <w:color w:val="auto"/>
+              <w:kern w:val="2"/>
+              <w:szCs w:val="24"/>
+              <w14:ligatures w14:val="standardContextual"/>
+            </w:rPr>
+          </w:pPr>
+          <w:hyperlink w:anchor="_Toc234146082" w:history="1">
+            <w:r>
+              <w:rPr>
+                <w:rStyle w:val="Hyperlink"/>
+                <w:noProof/>
+              </w:rPr>
+              <w:t>2.7.4 FLUXO DO TRATAMENTO DE EXCEÇÕES</w:t>
+            </w:r>
+            <w:r>
+              <w:rPr>
+                <w:noProof/>
+                <w:webHidden/>
+              </w:rPr>
+              <w:tab/>
+            </w:r>
+            <w:r>
+              <w:rPr>
+                <w:noProof/>
+                <w:webHidden/>
+              </w:rPr>
+              <w:fldChar w:fldCharType="begin"/>
+            </w:r>
+            <w:r>
+              <w:rPr>
+                <w:noProof/>
+                <w:webHidden/>
+              </w:rPr>
+              <w:instrText xml:space="preserve"> PAGEREF _Toc234146082 \h </w:instrText>
+            </w:r>
+            <w:r>
+              <w:rPr>
+                <w:noProof/>
+                <w:webHidden/>
+              </w:rPr>
+            </w:r>
+            <w:r>
+              <w:rPr>
+                <w:noProof/>
+                <w:webHidden/>
+              </w:rPr>
+              <w:fldChar w:fldCharType="separate"/>
+            </w:r>
+            <w:r>
+              <w:rPr>
+                <w:noProof/>
+                <w:webHidden/>
+              </w:rPr>
+              <w:t>28</w:t>
+            </w:r>
+            <w:r>
+              <w:rPr>
+                <w:noProof/>
+                <w:webHidden/>
+              </w:rPr>
+              <w:fldChar w:fldCharType="end"/>
+            </w:r>
+          </w:hyperlink>
+        </w:p>
+        <w:p>
+          <w:pPr>
+            <w:pStyle w:val="Sumrio2"/>
+            <w:tabs>
+              <w:tab w:val="right" w:leader="dot" w:pos="9060"/>
+            </w:tabs>
+            <w:rPr>
+              <w:rFonts w:asciiTheme="minorHAnsi" w:eastAsiaTheme="minorEastAsia" w:hAnsiTheme="minorHAnsi" w:cstheme="minorBidi"/>
+              <w:noProof/>
+              <w:color w:val="auto"/>
+              <w:kern w:val="2"/>
+              <w:szCs w:val="24"/>
+              <w14:ligatures w14:val="standardContextual"/>
+            </w:rPr>
+          </w:pPr>
+          <w:hyperlink w:anchor="_Toc234146083" w:history="1">
+            <w:r>
+              <w:rPr>
+                <w:rStyle w:val="Hyperlink"/>
+                <w:noProof/>
+              </w:rPr>
               <w:t>2.7.5 EXEMPLO DE RESPOSTA</w:t>
             </w:r>
             <w:r>
@@ -3477,7 +3703,7 @@
                 <w:noProof/>
                 <w:webHidden/>
               </w:rPr>
-              <w:instrText xml:space="preserve"> PAGEREF _Toc233894036 \h </w:instrText>
+              <w:instrText xml:space="preserve"> PAGEREF _Toc234146083 \h </w:instrText>
             </w:r>
             <w:r>
               <w:rPr>
@@ -3497,7 +3723,7 @@
                 <w:noProof/>
                 <w:webHidden/>
               </w:rPr>
-              <w:t>28</w:t>
+              <w:t>29</w:t>
             </w:r>
             <w:r>
               <w:rPr>
@@ -3518,16 +3744,18 @@
               <w:rFonts w:asciiTheme="minorHAnsi" w:eastAsiaTheme="minorEastAsia" w:hAnsiTheme="minorHAnsi" w:cstheme="minorBidi"/>
               <w:noProof/>
               <w:color w:val="auto"/>
-              <w:sz w:val="22"/>
+              <w:kern w:val="2"/>
+              <w:szCs w:val="24"/>
+              <w14:ligatures w14:val="standardContextual"/>
             </w:rPr>
           </w:pPr>
-          <w:hyperlink w:anchor="_Toc233894037" w:history="1">
+          <w:hyperlink w:anchor="_Toc234146084" w:history="1">
             <w:r>
               <w:rPr>
                 <w:rStyle w:val="Hyperlink"/>
                 <w:noProof/>
               </w:rPr>
-              <w:t>3. MANUAL DE INSTALAÇÃO E EXECUÇÃO</w:t>
+              <w:t>3. MANUAL DE INSTALAÇÃO E EXECUÇÃO (BACKEND)</w:t>
             </w:r>
             <w:r>
               <w:rPr>
@@ -3548,7 +3776,7 @@
                 <w:noProof/>
                 <w:webHidden/>
               </w:rPr>
-              <w:instrText xml:space="preserve"> PAGEREF _Toc233894037 \h </w:instrText>
+              <w:instrText xml:space="preserve"> PAGEREF _Toc234146084 \h </w:instrText>
             </w:r>
             <w:r>
               <w:rPr>
@@ -3568,7 +3796,7 @@
                 <w:noProof/>
                 <w:webHidden/>
               </w:rPr>
-              <w:t>28</w:t>
+              <w:t>30</w:t>
             </w:r>
             <w:r>
               <w:rPr>
@@ -3638,7 +3866,7 @@
         <w:spacing w:after="0"/>
         <w:ind w:left="-5"/>
       </w:pPr>
-      <w:bookmarkStart w:id="0" w:name="_Toc233893997"/>
+      <w:bookmarkStart w:id="0" w:name="_Toc234146042"/>
       <w:r>
         <w:t>1. INTRODUÇÃO</w:t>
       </w:r>
@@ -3728,7 +3956,7 @@
         <w:spacing w:after="0"/>
         <w:ind w:left="-5"/>
       </w:pPr>
-      <w:bookmarkStart w:id="1" w:name="_Toc233893998"/>
+      <w:bookmarkStart w:id="1" w:name="_Toc234146043"/>
       <w:r>
         <w:t>2. DESENVOLVIMENTO</w:t>
       </w:r>
@@ -3751,7 +3979,7 @@
         <w:pStyle w:val="Ttulo2"/>
         <w:ind w:left="5"/>
       </w:pPr>
-      <w:bookmarkStart w:id="2" w:name="_Toc233893999"/>
+      <w:bookmarkStart w:id="2" w:name="_Toc234146044"/>
       <w:r>
         <w:t>2.1 OBJETIVO DO SISTEMA</w:t>
       </w:r>
@@ -3882,7 +4110,7 @@
         <w:pStyle w:val="Ttulo2"/>
         <w:ind w:left="5"/>
       </w:pPr>
-      <w:bookmarkStart w:id="3" w:name="_Toc233894000"/>
+      <w:bookmarkStart w:id="3" w:name="_Toc234146045"/>
       <w:r>
         <w:lastRenderedPageBreak/>
         <w:t>2.2 TECNOLOGIAS UTILIZADAS</w:t>
@@ -3968,7 +4196,7 @@
         </w:tc>
         <w:tc>
           <w:tcPr>
-            <w:tcW w:w="5943" w:type="dxa"/>
+            <w:tcW w:w="5942" w:type="dxa"/>
             <w:tcBorders>
               <w:top w:val="single" w:sz="4" w:space="0" w:color="000000"/>
               <w:left w:val="single" w:sz="4" w:space="0" w:color="000000"/>
@@ -4018,7 +4246,7 @@
         </w:tc>
         <w:tc>
           <w:tcPr>
-            <w:tcW w:w="5943" w:type="dxa"/>
+            <w:tcW w:w="5942" w:type="dxa"/>
             <w:tcBorders>
               <w:top w:val="single" w:sz="4" w:space="0" w:color="000000"/>
               <w:left w:val="single" w:sz="4" w:space="0" w:color="000000"/>
@@ -4072,7 +4300,7 @@
         </w:tc>
         <w:tc>
           <w:tcPr>
-            <w:tcW w:w="5943" w:type="dxa"/>
+            <w:tcW w:w="5942" w:type="dxa"/>
             <w:tcBorders>
               <w:top w:val="single" w:sz="4" w:space="0" w:color="000000"/>
               <w:left w:val="single" w:sz="4" w:space="0" w:color="000000"/>
@@ -4118,7 +4346,7 @@
         </w:tc>
         <w:tc>
           <w:tcPr>
-            <w:tcW w:w="5943" w:type="dxa"/>
+            <w:tcW w:w="5942" w:type="dxa"/>
             <w:tcBorders>
               <w:top w:val="single" w:sz="4" w:space="0" w:color="000000"/>
               <w:left w:val="single" w:sz="4" w:space="0" w:color="000000"/>
@@ -4169,7 +4397,7 @@
         </w:tc>
         <w:tc>
           <w:tcPr>
-            <w:tcW w:w="5943" w:type="dxa"/>
+            <w:tcW w:w="5942" w:type="dxa"/>
             <w:tcBorders>
               <w:top w:val="single" w:sz="4" w:space="0" w:color="000000"/>
               <w:left w:val="single" w:sz="4" w:space="0" w:color="000000"/>
@@ -4215,7 +4443,7 @@
         </w:tc>
         <w:tc>
           <w:tcPr>
-            <w:tcW w:w="5943" w:type="dxa"/>
+            <w:tcW w:w="5942" w:type="dxa"/>
             <w:tcBorders>
               <w:top w:val="single" w:sz="4" w:space="0" w:color="000000"/>
               <w:left w:val="single" w:sz="4" w:space="0" w:color="000000"/>
@@ -4261,7 +4489,7 @@
         </w:tc>
         <w:tc>
           <w:tcPr>
-            <w:tcW w:w="5943" w:type="dxa"/>
+            <w:tcW w:w="5942" w:type="dxa"/>
             <w:tcBorders>
               <w:top w:val="single" w:sz="4" w:space="0" w:color="000000"/>
               <w:left w:val="single" w:sz="4" w:space="0" w:color="000000"/>
@@ -4312,7 +4540,7 @@
         </w:tc>
         <w:tc>
           <w:tcPr>
-            <w:tcW w:w="5943" w:type="dxa"/>
+            <w:tcW w:w="5942" w:type="dxa"/>
             <w:tcBorders>
               <w:top w:val="single" w:sz="4" w:space="0" w:color="000000"/>
               <w:left w:val="single" w:sz="4" w:space="0" w:color="000000"/>
@@ -4374,7 +4602,7 @@
         </w:tc>
         <w:tc>
           <w:tcPr>
-            <w:tcW w:w="5943" w:type="dxa"/>
+            <w:tcW w:w="5942" w:type="dxa"/>
             <w:tcBorders>
               <w:top w:val="single" w:sz="4" w:space="0" w:color="000000"/>
               <w:left w:val="single" w:sz="4" w:space="0" w:color="000000"/>
@@ -4433,7 +4661,7 @@
         </w:tc>
         <w:tc>
           <w:tcPr>
-            <w:tcW w:w="5943" w:type="dxa"/>
+            <w:tcW w:w="5942" w:type="dxa"/>
             <w:tcBorders>
               <w:top w:val="single" w:sz="4" w:space="0" w:color="000000"/>
               <w:left w:val="single" w:sz="4" w:space="0" w:color="000000"/>
@@ -4479,7 +4707,7 @@
         </w:tc>
         <w:tc>
           <w:tcPr>
-            <w:tcW w:w="5943" w:type="dxa"/>
+            <w:tcW w:w="5942" w:type="dxa"/>
             <w:tcBorders>
               <w:top w:val="single" w:sz="4" w:space="0" w:color="000000"/>
               <w:left w:val="single" w:sz="4" w:space="0" w:color="000000"/>
@@ -4530,7 +4758,7 @@
         </w:tc>
         <w:tc>
           <w:tcPr>
-            <w:tcW w:w="5943" w:type="dxa"/>
+            <w:tcW w:w="5942" w:type="dxa"/>
             <w:tcBorders>
               <w:top w:val="single" w:sz="4" w:space="0" w:color="000000"/>
               <w:left w:val="single" w:sz="4" w:space="0" w:color="000000"/>
@@ -4557,6 +4785,53 @@
           </w:p>
         </w:tc>
       </w:tr>
+      <w:tr>
+        <w:trPr>
+          <w:trHeight w:val="895"/>
+        </w:trPr>
+        <w:tc>
+          <w:tcPr>
+            <w:tcW w:w="3122" w:type="dxa"/>
+            <w:tcBorders>
+              <w:top w:val="single" w:sz="4" w:space="0" w:color="000000"/>
+              <w:left w:val="single" w:sz="4" w:space="0" w:color="000000"/>
+              <w:bottom w:val="single" w:sz="4" w:space="0" w:color="000000"/>
+              <w:right w:val="single" w:sz="4" w:space="0" w:color="000000"/>
+            </w:tcBorders>
+          </w:tcPr>
+          <w:p>
+            <w:pPr>
+              <w:spacing w:after="0"/>
+              <w:ind w:left="111" w:right="0" w:firstLine="0"/>
+              <w:jc w:val="center"/>
+            </w:pPr>
+            <w:r>
+              <w:lastRenderedPageBreak/>
+              <w:t>Railway</w:t>
+            </w:r>
+          </w:p>
+        </w:tc>
+        <w:tc>
+          <w:tcPr>
+            <w:tcW w:w="5942" w:type="dxa"/>
+            <w:tcBorders>
+              <w:top w:val="single" w:sz="4" w:space="0" w:color="000000"/>
+              <w:left w:val="single" w:sz="4" w:space="0" w:color="000000"/>
+              <w:bottom w:val="single" w:sz="4" w:space="0" w:color="000000"/>
+              <w:right w:val="single" w:sz="4" w:space="0" w:color="000000"/>
+            </w:tcBorders>
+          </w:tcPr>
+          <w:p>
+            <w:pPr>
+              <w:spacing w:after="0"/>
+              <w:ind w:left="0" w:right="0" w:firstLine="0"/>
+            </w:pPr>
+            <w:r>
+              <w:t>Plataforma utilizada para hospedagem da API e do banco de dados MySQL</w:t>
+            </w:r>
+          </w:p>
+        </w:tc>
+      </w:tr>
     </w:tbl>
     <w:p>
       <w:pPr>
@@ -4578,6 +4853,16 @@
     </w:p>
     <w:p>
       <w:pPr>
+        <w:spacing w:after="160"/>
+        <w:ind w:left="0" w:right="0" w:firstLine="0"/>
+        <w:jc w:val="left"/>
+      </w:pPr>
+      <w:r>
+        <w:br w:type="page"/>
+      </w:r>
+    </w:p>
+    <w:p>
+      <w:pPr>
         <w:spacing w:after="0"/>
         <w:ind w:left="0" w:right="0" w:firstLine="0"/>
       </w:pPr>
@@ -4590,7 +4875,7 @@
       <w:pPr>
         <w:pStyle w:val="Ttulo2"/>
       </w:pPr>
-      <w:bookmarkStart w:id="4" w:name="_Toc233894001"/>
+      <w:bookmarkStart w:id="4" w:name="_Toc234146046"/>
       <w:r>
         <w:t>2.3 REQUISITOS DO SISTEMA</w:t>
       </w:r>
@@ -4990,7 +5275,7 @@
       <w:pPr>
         <w:pStyle w:val="Ttulo2"/>
       </w:pPr>
-      <w:bookmarkStart w:id="5" w:name="_Toc233894002"/>
+      <w:bookmarkStart w:id="5" w:name="_Toc234146047"/>
       <w:r>
         <w:lastRenderedPageBreak/>
         <w:t xml:space="preserve">2.4 </w:t>
@@ -5168,7 +5453,7 @@
       <w:pPr>
         <w:pStyle w:val="Ttulo2"/>
       </w:pPr>
-      <w:bookmarkStart w:id="6" w:name="_Toc233894003"/>
+      <w:bookmarkStart w:id="6" w:name="_Toc234146048"/>
       <w:r>
         <w:t xml:space="preserve">2.4.1 </w:t>
       </w:r>
@@ -5265,7 +5550,7 @@
       <w:pPr>
         <w:pStyle w:val="Ttulo2"/>
       </w:pPr>
-      <w:bookmarkStart w:id="7" w:name="_Toc233894004"/>
+      <w:bookmarkStart w:id="7" w:name="_Toc234146049"/>
       <w:r>
         <w:lastRenderedPageBreak/>
         <w:t xml:space="preserve">2.4.2 </w:t>
@@ -5496,7 +5781,7 @@
       <w:pPr>
         <w:pStyle w:val="Ttulo2"/>
       </w:pPr>
-      <w:bookmarkStart w:id="8" w:name="_Toc233894005"/>
+      <w:bookmarkStart w:id="8" w:name="_Toc234146050"/>
       <w:r>
         <w:t xml:space="preserve">2.4.3 </w:t>
       </w:r>
@@ -5643,7 +5928,7 @@
       <w:pPr>
         <w:pStyle w:val="Ttulo2"/>
       </w:pPr>
-      <w:bookmarkStart w:id="9" w:name="_Toc233894006"/>
+      <w:bookmarkStart w:id="9" w:name="_Toc234146051"/>
       <w:r>
         <w:lastRenderedPageBreak/>
         <w:t xml:space="preserve">2.4.4 </w:t>
@@ -5740,7 +6025,7 @@
       <w:pPr>
         <w:pStyle w:val="Ttulo2"/>
       </w:pPr>
-      <w:bookmarkStart w:id="10" w:name="_Toc233894007"/>
+      <w:bookmarkStart w:id="10" w:name="_Toc234146052"/>
       <w:r>
         <w:t xml:space="preserve">2.4.5 </w:t>
       </w:r>
@@ -5834,71 +6119,13 @@
         <w:spacing w:after="157"/>
         <w:ind w:left="0" w:right="0" w:firstLine="0"/>
       </w:pPr>
-      <w:r>
-        <w:t xml:space="preserve"> </w:t>
-      </w:r>
-    </w:p>
-    <w:p>
-      <w:pPr>
-        <w:spacing w:after="162"/>
-        <w:ind w:left="0" w:right="0" w:firstLine="0"/>
-      </w:pPr>
-      <w:r>
-        <w:t xml:space="preserve"> </w:t>
-      </w:r>
-    </w:p>
-    <w:p>
-      <w:pPr>
-        <w:spacing w:after="157"/>
-        <w:ind w:left="0" w:right="0" w:firstLine="0"/>
-      </w:pPr>
-      <w:r>
-        <w:t xml:space="preserve"> </w:t>
-      </w:r>
-    </w:p>
-    <w:p>
-      <w:pPr>
-        <w:spacing w:after="162"/>
-        <w:ind w:left="0" w:right="0" w:firstLine="0"/>
-      </w:pPr>
-      <w:r>
-        <w:t xml:space="preserve"> </w:t>
-      </w:r>
-    </w:p>
-    <w:p>
-      <w:pPr>
-        <w:spacing w:after="157"/>
-        <w:ind w:left="0" w:right="0" w:firstLine="0"/>
-      </w:pPr>
-      <w:r>
-        <w:t xml:space="preserve"> </w:t>
-      </w:r>
-    </w:p>
-    <w:p>
-      <w:pPr>
-        <w:spacing w:after="162"/>
-        <w:ind w:left="0" w:right="0" w:firstLine="0"/>
-      </w:pPr>
-      <w:r>
-        <w:t xml:space="preserve"> </w:t>
-      </w:r>
-    </w:p>
-    <w:p>
-      <w:pPr>
-        <w:spacing w:after="137"/>
-        <w:ind w:left="0" w:right="0" w:firstLine="0"/>
-      </w:pPr>
-      <w:r>
-        <w:t xml:space="preserve"> </w:t>
-      </w:r>
     </w:p>
     <w:p>
       <w:pPr>
         <w:pStyle w:val="Ttulo2"/>
       </w:pPr>
-      <w:bookmarkStart w:id="11" w:name="_Toc233894008"/>
-      <w:r>
-        <w:lastRenderedPageBreak/>
+      <w:bookmarkStart w:id="11" w:name="_Toc234146053"/>
+      <w:r>
         <w:t xml:space="preserve">2.4.6 </w:t>
       </w:r>
       <w:r>
@@ -5963,7 +6190,11 @@
       </w:r>
       <w:proofErr w:type="spellEnd"/>
       <w:r>
-        <w:t xml:space="preserve">, ela é encaminhada para a camada Service, onde são verificadas condições como existência de registros, validação das informações fornecidas e consistência dos dados antes que qualquer operação seja executada. </w:t>
+        <w:t xml:space="preserve">, ela é encaminhada para a camada Service, onde são verificadas condições como existência de registros, </w:t>
+      </w:r>
+      <w:r>
+        <w:lastRenderedPageBreak/>
+        <w:t xml:space="preserve">validação das informações fornecidas e consistência dos dados antes que qualquer operação seja executada. </w:t>
       </w:r>
     </w:p>
     <w:p>
@@ -6012,11 +6243,124 @@
       <w:pPr>
         <w:pStyle w:val="Ttulo2"/>
       </w:pPr>
-      <w:bookmarkStart w:id="12" w:name="_Toc233894009"/>
+      <w:bookmarkStart w:id="12" w:name="_Toc234146054"/>
+      <w:r>
+        <w:t>2.4.7 CAMADA CONFIG</w:t>
+      </w:r>
+      <w:bookmarkEnd w:id="12"/>
+    </w:p>
+    <w:p/>
+    <w:p>
+      <w:r>
+        <w:tab/>
+      </w:r>
+      <w:r>
+        <w:tab/>
+      </w:r>
+      <w:r>
+        <w:t xml:space="preserve">A camada </w:t>
+      </w:r>
+      <w:proofErr w:type="spellStart"/>
+      <w:r>
+        <w:rPr>
+          <w:b/>
+          <w:bCs/>
+        </w:rPr>
+        <w:t>Config</w:t>
+      </w:r>
+      <w:proofErr w:type="spellEnd"/>
+      <w:r>
+        <w:t xml:space="preserve"> é responsável pela configuração geral da aplicação, concentrando definições técnicas e comportamentos que serão utilizados pelo sistema como um todo. É nela que são definidos componentes essenciais do Spring, como configurações de segurança, CORS, </w:t>
+      </w:r>
+      <w:proofErr w:type="spellStart"/>
+      <w:r>
+        <w:t>beans</w:t>
+      </w:r>
+      <w:proofErr w:type="spellEnd"/>
+      <w:r>
+        <w:t xml:space="preserve"> personalizados e outras configurações globais que controlam o funcionamento da aplicação.</w:t>
+      </w:r>
+    </w:p>
+    <w:p>
+      <w:pPr>
+        <w:ind w:firstLine="698"/>
+      </w:pPr>
+      <w:r>
+        <w:t>Essa camada não contém regras de negócio, mas sim regras estruturais e de infraestrutura, garantindo que o sistema funcione corretamente e de forma padronizada. Por exemplo, nela podem ser configurados filtros de segurança, codificação de senhas, configuração de autenticação, integração com bibliotecas externas e definição de políticas de acesso à API.</w:t>
+      </w:r>
+    </w:p>
+    <w:p>
+      <w:pPr>
+        <w:ind w:firstLine="698"/>
+      </w:pPr>
+      <w:r>
+        <w:t xml:space="preserve">Sempre que o Spring precisa de um comportamento personalizado ou de um objeto gerenciado globalmente, ele é declarado na camada </w:t>
+      </w:r>
+      <w:proofErr w:type="spellStart"/>
+      <w:r>
+        <w:rPr>
+          <w:b/>
+          <w:bCs/>
+        </w:rPr>
+        <w:t>Config</w:t>
+      </w:r>
+      <w:proofErr w:type="spellEnd"/>
+      <w:r>
+        <w:t xml:space="preserve"> através de anotações como @Configuration e @Bean. Esses componentes são então injetados automaticamente em outras partes da aplicação, como </w:t>
+      </w:r>
+      <w:r>
+        <w:rPr>
+          <w:b/>
+          <w:bCs/>
+        </w:rPr>
+        <w:t>Services</w:t>
+      </w:r>
+      <w:r>
+        <w:t xml:space="preserve"> e </w:t>
+      </w:r>
+      <w:proofErr w:type="spellStart"/>
+      <w:r>
+        <w:rPr>
+          <w:b/>
+          <w:bCs/>
+        </w:rPr>
+        <w:t>Controllers</w:t>
+      </w:r>
+      <w:proofErr w:type="spellEnd"/>
+      <w:r>
+        <w:t>.</w:t>
+      </w:r>
+    </w:p>
+    <w:p>
+      <w:pPr>
+        <w:ind w:firstLine="698"/>
+      </w:pPr>
+      <w:r>
+        <w:t>Sua utilização torna o projeto mais organizado e modular, separando claramente a configuração do sistema da lógica de negócio, o que facilita a manutenção, escalabilidade e entendimento da aplicação.</w:t>
+      </w:r>
+    </w:p>
+    <w:p/>
+    <w:p>
+      <w:pPr>
+        <w:spacing w:after="161" w:line="260" w:lineRule="auto"/>
+        <w:ind w:left="-15" w:right="168" w:firstLine="701"/>
+      </w:pPr>
+    </w:p>
+    <w:p>
+      <w:pPr>
+        <w:spacing w:after="161" w:line="260" w:lineRule="auto"/>
+        <w:ind w:left="-15" w:right="168" w:firstLine="701"/>
+      </w:pPr>
+    </w:p>
+    <w:p>
+      <w:pPr>
+        <w:pStyle w:val="Ttulo2"/>
+      </w:pPr>
+      <w:bookmarkStart w:id="13" w:name="_Toc234146055"/>
       <w:r>
         <w:t>2.5 BANCO DE DADOS</w:t>
       </w:r>
-      <w:bookmarkEnd w:id="12"/>
+      <w:bookmarkEnd w:id="13"/>
     </w:p>
     <w:p/>
     <w:p>
@@ -6039,6 +6383,7 @@
     </w:p>
     <w:p>
       <w:r>
+        <w:lastRenderedPageBreak/>
         <w:tab/>
       </w:r>
       <w:r>
@@ -6076,8 +6421,12 @@
     <w:p/>
     <w:p/>
     <w:p>
-      <w:r>
-        <w:lastRenderedPageBreak/>
+      <w:pPr>
+        <w:ind w:left="0" w:firstLine="0"/>
+      </w:pPr>
+    </w:p>
+    <w:p>
+      <w:r>
         <w:tab/>
       </w:r>
       <w:r>
@@ -6218,6 +6567,7 @@
     </w:p>
     <w:p>
       <w:pPr>
+        <w:jc w:val="right"/>
         <w:rPr>
           <w:sz w:val="20"/>
           <w:szCs w:val="20"/>
@@ -6228,11 +6578,12 @@
       <w:pPr>
         <w:pStyle w:val="Ttulo2"/>
       </w:pPr>
-      <w:bookmarkStart w:id="13" w:name="_Toc233894010"/>
-      <w:r>
+      <w:bookmarkStart w:id="14" w:name="_Toc234146056"/>
+      <w:r>
+        <w:lastRenderedPageBreak/>
         <w:t>2.5.1 TABELA PERFIL</w:t>
       </w:r>
-      <w:bookmarkEnd w:id="13"/>
+      <w:bookmarkEnd w:id="14"/>
     </w:p>
     <w:p/>
     <w:p>
@@ -6454,12 +6805,11 @@
       <w:pPr>
         <w:pStyle w:val="Ttulo2"/>
       </w:pPr>
-      <w:bookmarkStart w:id="14" w:name="_Toc233894011"/>
-      <w:r>
-        <w:lastRenderedPageBreak/>
+      <w:bookmarkStart w:id="15" w:name="_Toc234146057"/>
+      <w:r>
         <w:t>2.5.2 TABELA USUÁRIO</w:t>
       </w:r>
-      <w:bookmarkEnd w:id="14"/>
+      <w:bookmarkEnd w:id="15"/>
     </w:p>
     <w:p/>
     <w:p>
@@ -6818,15 +7168,19 @@
       <w:pPr>
         <w:pStyle w:val="Ttulo2"/>
       </w:pPr>
-      <w:bookmarkStart w:id="15" w:name="_Toc233894012"/>
-      <w:r>
-        <w:t>2.5.3 TABELA STATUS_PRODUTO</w:t>
-      </w:r>
-      <w:bookmarkEnd w:id="15"/>
+      <w:bookmarkStart w:id="16" w:name="_Toc234146058"/>
+      <w:r>
+        <w:t>2.5.3 TABEL</w:t>
+      </w:r>
+      <w:r>
+        <w:t>A STATUS_VERSAO_PRODUTO</w:t>
+      </w:r>
+      <w:bookmarkEnd w:id="16"/>
     </w:p>
     <w:p/>
     <w:p>
       <w:r>
+        <w:lastRenderedPageBreak/>
         <w:tab/>
       </w:r>
       <w:r>
@@ -6835,15 +7189,36 @@
       <w:r>
         <w:t xml:space="preserve">A tabela </w:t>
       </w:r>
+      <w:proofErr w:type="spellStart"/>
       <w:r>
         <w:rPr>
           <w:b/>
           <w:bCs/>
         </w:rPr>
-        <w:t>Status_Produto</w:t>
-      </w:r>
-      <w:r>
-        <w:t xml:space="preserve"> armazena os possíveis estados em que um produto pode se encontrar durante seu ciclo de desenvolvimento.</w:t>
+        <w:t>Status_Versao_Produto</w:t>
+      </w:r>
+      <w:proofErr w:type="spellEnd"/>
+      <w:r>
+        <w:rPr>
+          <w:b/>
+          <w:bCs/>
+        </w:rPr>
+        <w:t xml:space="preserve"> </w:t>
+      </w:r>
+      <w:r>
+        <w:t>armazena os possíveis estados em que um</w:t>
+      </w:r>
+      <w:r>
+        <w:t>a</w:t>
+      </w:r>
+      <w:r>
+        <w:t xml:space="preserve"> </w:t>
+      </w:r>
+      <w:r>
+        <w:t>versão da receita</w:t>
+      </w:r>
+      <w:r>
+        <w:t xml:space="preserve"> pode se encontrar durante seu ciclo de desenvolvimento.</w:t>
       </w:r>
     </w:p>
     <w:p>
@@ -6854,7 +7229,13 @@
         <w:tab/>
       </w:r>
       <w:r>
-        <w:t>Essa separação evita a repetição de informações dentro da tabela de produtos e facilita a inclusão de novos status caso seja necessário futuramente.</w:t>
+        <w:t xml:space="preserve">Essa separação evita a repetição de informações dentro da tabela de </w:t>
+      </w:r>
+      <w:r>
+        <w:t>versão receita</w:t>
+      </w:r>
+      <w:r>
+        <w:t xml:space="preserve"> e facilita a inclusão de novos status caso seja necessário futuramente.</w:t>
       </w:r>
     </w:p>
     <w:p>
@@ -7046,7 +7427,13 @@
               <w:ind w:left="0" w:firstLine="0"/>
             </w:pPr>
             <w:r>
-              <w:t>Nome do status do produto.</w:t>
+              <w:t>Nome do status d</w:t>
+            </w:r>
+            <w:r>
+              <w:t>a versão</w:t>
+            </w:r>
+            <w:r>
+              <w:t>.</w:t>
             </w:r>
           </w:p>
         </w:tc>
@@ -7059,12 +7446,11 @@
       <w:pPr>
         <w:pStyle w:val="Ttulo2"/>
       </w:pPr>
-      <w:bookmarkStart w:id="16" w:name="_Toc233894013"/>
-      <w:r>
-        <w:lastRenderedPageBreak/>
+      <w:bookmarkStart w:id="17" w:name="_Toc234146059"/>
+      <w:r>
         <w:t>2.5.4 TABELA PRODUTO</w:t>
       </w:r>
-      <w:bookmarkEnd w:id="16"/>
+      <w:bookmarkEnd w:id="17"/>
     </w:p>
     <w:p/>
     <w:p>
@@ -7126,7 +7512,7 @@
       <w:tr>
         <w:tc>
           <w:tcPr>
-            <w:tcW w:w="2112" w:type="dxa"/>
+            <w:tcW w:w="2098" w:type="dxa"/>
           </w:tcPr>
           <w:p>
             <w:pPr>
@@ -7148,7 +7534,7 @@
         </w:tc>
         <w:tc>
           <w:tcPr>
-            <w:tcW w:w="2409" w:type="dxa"/>
+            <w:tcW w:w="2402" w:type="dxa"/>
           </w:tcPr>
           <w:p>
             <w:pPr>
@@ -7170,7 +7556,7 @@
         </w:tc>
         <w:tc>
           <w:tcPr>
-            <w:tcW w:w="4604" w:type="dxa"/>
+            <w:tcW w:w="4550" w:type="dxa"/>
           </w:tcPr>
           <w:p>
             <w:pPr>
@@ -7194,7 +7580,7 @@
       <w:tr>
         <w:tc>
           <w:tcPr>
-            <w:tcW w:w="2112" w:type="dxa"/>
+            <w:tcW w:w="2098" w:type="dxa"/>
           </w:tcPr>
           <w:p>
             <w:pPr>
@@ -7208,7 +7594,7 @@
         </w:tc>
         <w:tc>
           <w:tcPr>
-            <w:tcW w:w="2409" w:type="dxa"/>
+            <w:tcW w:w="2402" w:type="dxa"/>
           </w:tcPr>
           <w:p>
             <w:pPr>
@@ -7221,7 +7607,7 @@
         </w:tc>
         <w:tc>
           <w:tcPr>
-            <w:tcW w:w="4604" w:type="dxa"/>
+            <w:tcW w:w="4550" w:type="dxa"/>
           </w:tcPr>
           <w:p>
             <w:pPr>
@@ -7236,21 +7622,24 @@
       <w:tr>
         <w:tc>
           <w:tcPr>
-            <w:tcW w:w="2112" w:type="dxa"/>
-          </w:tcPr>
-          <w:p>
-            <w:pPr>
-              <w:ind w:left="0" w:firstLine="0"/>
-              <w:jc w:val="center"/>
-            </w:pPr>
-            <w:r>
-              <w:t>nome</w:t>
-            </w:r>
-          </w:p>
-        </w:tc>
-        <w:tc>
-          <w:tcPr>
-            <w:tcW w:w="2409" w:type="dxa"/>
+            <w:tcW w:w="2098" w:type="dxa"/>
+          </w:tcPr>
+          <w:p>
+            <w:pPr>
+              <w:ind w:left="0" w:firstLine="0"/>
+              <w:jc w:val="center"/>
+            </w:pPr>
+            <w:r>
+              <w:t>N</w:t>
+            </w:r>
+            <w:r>
+              <w:t>ome</w:t>
+            </w:r>
+          </w:p>
+        </w:tc>
+        <w:tc>
+          <w:tcPr>
+            <w:tcW w:w="2402" w:type="dxa"/>
           </w:tcPr>
           <w:p>
             <w:pPr>
@@ -7268,7 +7657,7 @@
         </w:tc>
         <w:tc>
           <w:tcPr>
-            <w:tcW w:w="4604" w:type="dxa"/>
+            <w:tcW w:w="4550" w:type="dxa"/>
           </w:tcPr>
           <w:p>
             <w:pPr>
@@ -7283,41 +7672,46 @@
       <w:tr>
         <w:tc>
           <w:tcPr>
-            <w:tcW w:w="2112" w:type="dxa"/>
-          </w:tcPr>
-          <w:p>
-            <w:pPr>
-              <w:ind w:left="0" w:firstLine="0"/>
-              <w:jc w:val="center"/>
-            </w:pPr>
-            <w:r>
-              <w:t xml:space="preserve"> descrição</w:t>
-            </w:r>
-          </w:p>
-        </w:tc>
-        <w:tc>
-          <w:tcPr>
-            <w:tcW w:w="2409" w:type="dxa"/>
-          </w:tcPr>
-          <w:p>
-            <w:pPr>
-              <w:ind w:left="0" w:firstLine="0"/>
-            </w:pPr>
-            <w:r>
-              <w:t>TEXT</w:t>
-            </w:r>
-          </w:p>
-        </w:tc>
-        <w:tc>
-          <w:tcPr>
-            <w:tcW w:w="4604" w:type="dxa"/>
-          </w:tcPr>
-          <w:p>
-            <w:pPr>
-              <w:ind w:left="0" w:firstLine="0"/>
-            </w:pPr>
-            <w:r>
-              <w:t>Descrição do produto.</w:t>
+            <w:tcW w:w="2098" w:type="dxa"/>
+          </w:tcPr>
+          <w:p>
+            <w:pPr>
+              <w:ind w:left="0" w:firstLine="0"/>
+              <w:jc w:val="center"/>
+            </w:pPr>
+            <w:r>
+              <w:t>Categoria</w:t>
+            </w:r>
+          </w:p>
+        </w:tc>
+        <w:tc>
+          <w:tcPr>
+            <w:tcW w:w="2402" w:type="dxa"/>
+          </w:tcPr>
+          <w:p>
+            <w:pPr>
+              <w:ind w:left="0" w:firstLine="0"/>
+            </w:pPr>
+            <w:proofErr w:type="gramStart"/>
+            <w:r>
+              <w:t>VARCHAR(</w:t>
+            </w:r>
+            <w:proofErr w:type="gramEnd"/>
+            <w:r>
+              <w:t>100)</w:t>
+            </w:r>
+          </w:p>
+        </w:tc>
+        <w:tc>
+          <w:tcPr>
+            <w:tcW w:w="4550" w:type="dxa"/>
+          </w:tcPr>
+          <w:p>
+            <w:pPr>
+              <w:ind w:left="0" w:firstLine="0"/>
+            </w:pPr>
+            <w:r>
+              <w:t>Categoria do produto</w:t>
             </w:r>
           </w:p>
         </w:tc>
@@ -7325,41 +7719,41 @@
       <w:tr>
         <w:tc>
           <w:tcPr>
-            <w:tcW w:w="2112" w:type="dxa"/>
-          </w:tcPr>
-          <w:p>
-            <w:pPr>
-              <w:ind w:left="0" w:firstLine="0"/>
-              <w:jc w:val="center"/>
-            </w:pPr>
-            <w:r>
-              <w:t>idStatus</w:t>
-            </w:r>
-          </w:p>
-        </w:tc>
-        <w:tc>
-          <w:tcPr>
-            <w:tcW w:w="2409" w:type="dxa"/>
-          </w:tcPr>
-          <w:p>
-            <w:pPr>
-              <w:ind w:left="0" w:firstLine="0"/>
-            </w:pPr>
-            <w:r>
-              <w:t>INT</w:t>
-            </w:r>
-          </w:p>
-        </w:tc>
-        <w:tc>
-          <w:tcPr>
-            <w:tcW w:w="4604" w:type="dxa"/>
-          </w:tcPr>
-          <w:p>
-            <w:pPr>
-              <w:ind w:left="0" w:firstLine="0"/>
-            </w:pPr>
-            <w:r>
-              <w:t>Status atual do produto.</w:t>
+            <w:tcW w:w="2098" w:type="dxa"/>
+          </w:tcPr>
+          <w:p>
+            <w:pPr>
+              <w:ind w:left="0" w:firstLine="0"/>
+              <w:jc w:val="center"/>
+            </w:pPr>
+            <w:r>
+              <w:t xml:space="preserve"> descrição</w:t>
+            </w:r>
+          </w:p>
+        </w:tc>
+        <w:tc>
+          <w:tcPr>
+            <w:tcW w:w="2402" w:type="dxa"/>
+          </w:tcPr>
+          <w:p>
+            <w:pPr>
+              <w:ind w:left="0" w:firstLine="0"/>
+            </w:pPr>
+            <w:r>
+              <w:t>TEXT</w:t>
+            </w:r>
+          </w:p>
+        </w:tc>
+        <w:tc>
+          <w:tcPr>
+            <w:tcW w:w="4550" w:type="dxa"/>
+          </w:tcPr>
+          <w:p>
+            <w:pPr>
+              <w:ind w:left="0" w:firstLine="0"/>
+            </w:pPr>
+            <w:r>
+              <w:t>Descrição do produto.</w:t>
             </w:r>
           </w:p>
         </w:tc>
@@ -7367,7 +7761,49 @@
       <w:tr>
         <w:tc>
           <w:tcPr>
-            <w:tcW w:w="2112" w:type="dxa"/>
+            <w:tcW w:w="2098" w:type="dxa"/>
+          </w:tcPr>
+          <w:p>
+            <w:pPr>
+              <w:ind w:left="0" w:firstLine="0"/>
+              <w:jc w:val="center"/>
+            </w:pPr>
+            <w:r>
+              <w:t>idStatus</w:t>
+            </w:r>
+          </w:p>
+        </w:tc>
+        <w:tc>
+          <w:tcPr>
+            <w:tcW w:w="2402" w:type="dxa"/>
+          </w:tcPr>
+          <w:p>
+            <w:pPr>
+              <w:ind w:left="0" w:firstLine="0"/>
+            </w:pPr>
+            <w:r>
+              <w:t>INT</w:t>
+            </w:r>
+          </w:p>
+        </w:tc>
+        <w:tc>
+          <w:tcPr>
+            <w:tcW w:w="4550" w:type="dxa"/>
+          </w:tcPr>
+          <w:p>
+            <w:pPr>
+              <w:ind w:left="0" w:firstLine="0"/>
+            </w:pPr>
+            <w:r>
+              <w:t>Status atual do produto.</w:t>
+            </w:r>
+          </w:p>
+        </w:tc>
+      </w:tr>
+      <w:tr>
+        <w:tc>
+          <w:tcPr>
+            <w:tcW w:w="2098" w:type="dxa"/>
           </w:tcPr>
           <w:p>
             <w:pPr>
@@ -7381,7 +7817,7 @@
         </w:tc>
         <w:tc>
           <w:tcPr>
-            <w:tcW w:w="2409" w:type="dxa"/>
+            <w:tcW w:w="2402" w:type="dxa"/>
           </w:tcPr>
           <w:p>
             <w:pPr>
@@ -7394,7 +7830,7 @@
         </w:tc>
         <w:tc>
           <w:tcPr>
-            <w:tcW w:w="4604" w:type="dxa"/>
+            <w:tcW w:w="4550" w:type="dxa"/>
           </w:tcPr>
           <w:p>
             <w:pPr>
@@ -7412,11 +7848,11 @@
       <w:pPr>
         <w:pStyle w:val="Ttulo2"/>
       </w:pPr>
-      <w:bookmarkStart w:id="17" w:name="_Toc233894014"/>
+      <w:bookmarkStart w:id="18" w:name="_Toc234146060"/>
       <w:r>
         <w:t>2.5.5 TABELA ESTOQUE</w:t>
       </w:r>
-      <w:bookmarkEnd w:id="17"/>
+      <w:bookmarkEnd w:id="18"/>
     </w:p>
     <w:p/>
     <w:p>
@@ -7440,6 +7876,7 @@
     </w:p>
     <w:p>
       <w:r>
+        <w:lastRenderedPageBreak/>
         <w:tab/>
       </w:r>
       <w:r>
@@ -7482,7 +7919,7 @@
       <w:tr>
         <w:tc>
           <w:tcPr>
-            <w:tcW w:w="2395" w:type="dxa"/>
+            <w:tcW w:w="2389" w:type="dxa"/>
           </w:tcPr>
           <w:p>
             <w:pPr>
@@ -7504,7 +7941,7 @@
         </w:tc>
         <w:tc>
           <w:tcPr>
-            <w:tcW w:w="2410" w:type="dxa"/>
+            <w:tcW w:w="2393" w:type="dxa"/>
           </w:tcPr>
           <w:p>
             <w:pPr>
@@ -7526,7 +7963,7 @@
         </w:tc>
         <w:tc>
           <w:tcPr>
-            <w:tcW w:w="4320" w:type="dxa"/>
+            <w:tcW w:w="4268" w:type="dxa"/>
           </w:tcPr>
           <w:p>
             <w:pPr>
@@ -7550,7 +7987,7 @@
       <w:tr>
         <w:tc>
           <w:tcPr>
-            <w:tcW w:w="2395" w:type="dxa"/>
+            <w:tcW w:w="2389" w:type="dxa"/>
           </w:tcPr>
           <w:p>
             <w:pPr>
@@ -7564,7 +8001,7 @@
         </w:tc>
         <w:tc>
           <w:tcPr>
-            <w:tcW w:w="2410" w:type="dxa"/>
+            <w:tcW w:w="2393" w:type="dxa"/>
           </w:tcPr>
           <w:p>
             <w:pPr>
@@ -7577,7 +8014,7 @@
         </w:tc>
         <w:tc>
           <w:tcPr>
-            <w:tcW w:w="4320" w:type="dxa"/>
+            <w:tcW w:w="4268" w:type="dxa"/>
           </w:tcPr>
           <w:p>
             <w:pPr>
@@ -7592,7 +8029,7 @@
       <w:tr>
         <w:tc>
           <w:tcPr>
-            <w:tcW w:w="2395" w:type="dxa"/>
+            <w:tcW w:w="2389" w:type="dxa"/>
           </w:tcPr>
           <w:p>
             <w:pPr>
@@ -7606,7 +8043,7 @@
         </w:tc>
         <w:tc>
           <w:tcPr>
-            <w:tcW w:w="2410" w:type="dxa"/>
+            <w:tcW w:w="2393" w:type="dxa"/>
           </w:tcPr>
           <w:p>
             <w:pPr>
@@ -7619,7 +8056,7 @@
         </w:tc>
         <w:tc>
           <w:tcPr>
-            <w:tcW w:w="4320" w:type="dxa"/>
+            <w:tcW w:w="4268" w:type="dxa"/>
           </w:tcPr>
           <w:p>
             <w:pPr>
@@ -7634,41 +8071,46 @@
       <w:tr>
         <w:tc>
           <w:tcPr>
-            <w:tcW w:w="2395" w:type="dxa"/>
-          </w:tcPr>
-          <w:p>
-            <w:pPr>
-              <w:ind w:left="0" w:firstLine="0"/>
-              <w:jc w:val="center"/>
-            </w:pPr>
-            <w:r>
-              <w:t>qtd_minima</w:t>
-            </w:r>
-          </w:p>
-        </w:tc>
-        <w:tc>
-          <w:tcPr>
-            <w:tcW w:w="2410" w:type="dxa"/>
-          </w:tcPr>
-          <w:p>
-            <w:pPr>
-              <w:ind w:left="0" w:firstLine="0"/>
-            </w:pPr>
-            <w:r>
-              <w:t>INT</w:t>
-            </w:r>
-          </w:p>
-        </w:tc>
-        <w:tc>
-          <w:tcPr>
-            <w:tcW w:w="4320" w:type="dxa"/>
-          </w:tcPr>
-          <w:p>
-            <w:pPr>
-              <w:ind w:left="0" w:firstLine="0"/>
-            </w:pPr>
-            <w:r>
-              <w:t>Quantidade mínima do produto.</w:t>
+            <w:tcW w:w="2389" w:type="dxa"/>
+          </w:tcPr>
+          <w:p>
+            <w:pPr>
+              <w:ind w:left="0" w:firstLine="0"/>
+              <w:jc w:val="center"/>
+            </w:pPr>
+            <w:r>
+              <w:t>lote</w:t>
+            </w:r>
+          </w:p>
+        </w:tc>
+        <w:tc>
+          <w:tcPr>
+            <w:tcW w:w="2393" w:type="dxa"/>
+          </w:tcPr>
+          <w:p>
+            <w:pPr>
+              <w:ind w:left="0" w:firstLine="0"/>
+            </w:pPr>
+            <w:proofErr w:type="gramStart"/>
+            <w:r>
+              <w:t>VARCHAR(</w:t>
+            </w:r>
+            <w:proofErr w:type="gramEnd"/>
+            <w:r>
+              <w:t>100)</w:t>
+            </w:r>
+          </w:p>
+        </w:tc>
+        <w:tc>
+          <w:tcPr>
+            <w:tcW w:w="4268" w:type="dxa"/>
+          </w:tcPr>
+          <w:p>
+            <w:pPr>
+              <w:ind w:left="0" w:firstLine="0"/>
+            </w:pPr>
+            <w:r>
+              <w:t>Lote do produto que está no estoque.</w:t>
             </w:r>
           </w:p>
         </w:tc>
@@ -7676,41 +8118,43 @@
       <w:tr>
         <w:tc>
           <w:tcPr>
-            <w:tcW w:w="2395" w:type="dxa"/>
-          </w:tcPr>
-          <w:p>
-            <w:pPr>
-              <w:ind w:left="0" w:firstLine="0"/>
-              <w:jc w:val="center"/>
-            </w:pPr>
-            <w:r>
-              <w:t>quantidade</w:t>
-            </w:r>
-          </w:p>
-        </w:tc>
-        <w:tc>
-          <w:tcPr>
-            <w:tcW w:w="2410" w:type="dxa"/>
-          </w:tcPr>
-          <w:p>
-            <w:pPr>
-              <w:ind w:left="0" w:firstLine="0"/>
-            </w:pPr>
-            <w:r>
-              <w:t>INT</w:t>
-            </w:r>
-          </w:p>
-        </w:tc>
-        <w:tc>
-          <w:tcPr>
-            <w:tcW w:w="4320" w:type="dxa"/>
-          </w:tcPr>
-          <w:p>
-            <w:pPr>
-              <w:ind w:left="0" w:firstLine="0"/>
-            </w:pPr>
-            <w:r>
-              <w:t>Quantidade disponível.</w:t>
+            <w:tcW w:w="2389" w:type="dxa"/>
+          </w:tcPr>
+          <w:p>
+            <w:pPr>
+              <w:ind w:left="0" w:firstLine="0"/>
+              <w:jc w:val="center"/>
+            </w:pPr>
+            <w:proofErr w:type="spellStart"/>
+            <w:r>
+              <w:t>data_validade</w:t>
+            </w:r>
+            <w:proofErr w:type="spellEnd"/>
+          </w:p>
+        </w:tc>
+        <w:tc>
+          <w:tcPr>
+            <w:tcW w:w="2393" w:type="dxa"/>
+          </w:tcPr>
+          <w:p>
+            <w:pPr>
+              <w:ind w:left="0" w:firstLine="0"/>
+            </w:pPr>
+            <w:r>
+              <w:t>DATE</w:t>
+            </w:r>
+          </w:p>
+        </w:tc>
+        <w:tc>
+          <w:tcPr>
+            <w:tcW w:w="4268" w:type="dxa"/>
+          </w:tcPr>
+          <w:p>
+            <w:pPr>
+              <w:ind w:left="0" w:firstLine="0"/>
+            </w:pPr>
+            <w:r>
+              <w:t>Data de validade do lote.</w:t>
             </w:r>
           </w:p>
         </w:tc>
@@ -7718,7 +8162,137 @@
       <w:tr>
         <w:tc>
           <w:tcPr>
-            <w:tcW w:w="2395" w:type="dxa"/>
+            <w:tcW w:w="2389" w:type="dxa"/>
+          </w:tcPr>
+          <w:p>
+            <w:pPr>
+              <w:ind w:left="0" w:firstLine="0"/>
+              <w:jc w:val="center"/>
+            </w:pPr>
+            <w:proofErr w:type="spellStart"/>
+            <w:r>
+              <w:t>data_fabricacao</w:t>
+            </w:r>
+            <w:proofErr w:type="spellEnd"/>
+          </w:p>
+        </w:tc>
+        <w:tc>
+          <w:tcPr>
+            <w:tcW w:w="2393" w:type="dxa"/>
+          </w:tcPr>
+          <w:p>
+            <w:pPr>
+              <w:ind w:left="0" w:firstLine="0"/>
+            </w:pPr>
+            <w:r>
+              <w:t>DATE</w:t>
+            </w:r>
+          </w:p>
+        </w:tc>
+        <w:tc>
+          <w:tcPr>
+            <w:tcW w:w="4268" w:type="dxa"/>
+          </w:tcPr>
+          <w:p>
+            <w:pPr>
+              <w:ind w:left="0" w:firstLine="0"/>
+            </w:pPr>
+            <w:r>
+              <w:t>Data de fabricação do lote.</w:t>
+            </w:r>
+          </w:p>
+        </w:tc>
+      </w:tr>
+      <w:tr>
+        <w:tc>
+          <w:tcPr>
+            <w:tcW w:w="2389" w:type="dxa"/>
+          </w:tcPr>
+          <w:p>
+            <w:pPr>
+              <w:ind w:left="0" w:firstLine="0"/>
+              <w:jc w:val="center"/>
+            </w:pPr>
+            <w:proofErr w:type="spellStart"/>
+            <w:r>
+              <w:t>qtd_minima</w:t>
+            </w:r>
+            <w:proofErr w:type="spellEnd"/>
+          </w:p>
+        </w:tc>
+        <w:tc>
+          <w:tcPr>
+            <w:tcW w:w="2393" w:type="dxa"/>
+          </w:tcPr>
+          <w:p>
+            <w:pPr>
+              <w:ind w:left="0" w:firstLine="0"/>
+            </w:pPr>
+            <w:r>
+              <w:t>INT</w:t>
+            </w:r>
+          </w:p>
+        </w:tc>
+        <w:tc>
+          <w:tcPr>
+            <w:tcW w:w="4268" w:type="dxa"/>
+          </w:tcPr>
+          <w:p>
+            <w:pPr>
+              <w:ind w:left="0" w:firstLine="0"/>
+            </w:pPr>
+            <w:r>
+              <w:t>Quantidade mínima do produto.</w:t>
+            </w:r>
+          </w:p>
+        </w:tc>
+      </w:tr>
+      <w:tr>
+        <w:tc>
+          <w:tcPr>
+            <w:tcW w:w="2389" w:type="dxa"/>
+          </w:tcPr>
+          <w:p>
+            <w:pPr>
+              <w:ind w:left="0" w:firstLine="0"/>
+              <w:jc w:val="center"/>
+            </w:pPr>
+            <w:r>
+              <w:t>quantidade</w:t>
+            </w:r>
+          </w:p>
+        </w:tc>
+        <w:tc>
+          <w:tcPr>
+            <w:tcW w:w="2393" w:type="dxa"/>
+          </w:tcPr>
+          <w:p>
+            <w:pPr>
+              <w:ind w:left="0" w:firstLine="0"/>
+            </w:pPr>
+            <w:r>
+              <w:t>INT</w:t>
+            </w:r>
+          </w:p>
+        </w:tc>
+        <w:tc>
+          <w:tcPr>
+            <w:tcW w:w="4268" w:type="dxa"/>
+          </w:tcPr>
+          <w:p>
+            <w:pPr>
+              <w:ind w:left="0" w:firstLine="0"/>
+            </w:pPr>
+            <w:r>
+              <w:t>Quantidade disponível.</w:t>
+            </w:r>
+          </w:p>
+        </w:tc>
+      </w:tr>
+      <w:tr>
+        <w:tc>
+          <w:tcPr>
+            <w:tcW w:w="2389" w:type="dxa"/>
           </w:tcPr>
           <w:p>
             <w:pPr>
@@ -7732,7 +8306,7 @@
         </w:tc>
         <w:tc>
           <w:tcPr>
-            <w:tcW w:w="2410" w:type="dxa"/>
+            <w:tcW w:w="2393" w:type="dxa"/>
           </w:tcPr>
           <w:p>
             <w:pPr>
@@ -7745,7 +8319,7 @@
         </w:tc>
         <w:tc>
           <w:tcPr>
-            <w:tcW w:w="4320" w:type="dxa"/>
+            <w:tcW w:w="4268" w:type="dxa"/>
           </w:tcPr>
           <w:p>
             <w:pPr>
@@ -7764,12 +8338,11 @@
       <w:pPr>
         <w:pStyle w:val="Ttulo2"/>
       </w:pPr>
-      <w:bookmarkStart w:id="18" w:name="_Toc233894015"/>
-      <w:r>
-        <w:lastRenderedPageBreak/>
+      <w:bookmarkStart w:id="19" w:name="_Toc234146061"/>
+      <w:r>
         <w:t>2.5.6 TABELA RECEITA</w:t>
       </w:r>
-      <w:bookmarkEnd w:id="18"/>
+      <w:bookmarkEnd w:id="19"/>
     </w:p>
     <w:p/>
     <w:p>
@@ -8034,15 +8607,16 @@
       <w:pPr>
         <w:pStyle w:val="Ttulo2"/>
       </w:pPr>
-      <w:bookmarkStart w:id="19" w:name="_Toc233894016"/>
+      <w:bookmarkStart w:id="20" w:name="_Toc234146062"/>
       <w:r>
         <w:t>2.5.7 TABELA VERSAO_RECEITA</w:t>
       </w:r>
-      <w:bookmarkEnd w:id="19"/>
+      <w:bookmarkEnd w:id="20"/>
     </w:p>
     <w:p/>
     <w:p>
       <w:r>
+        <w:lastRenderedPageBreak/>
         <w:tab/>
       </w:r>
       <w:r>
@@ -8100,7 +8674,7 @@
       <w:tr>
         <w:tc>
           <w:tcPr>
-            <w:tcW w:w="2253" w:type="dxa"/>
+            <w:tcW w:w="2248" w:type="dxa"/>
           </w:tcPr>
           <w:p>
             <w:pPr>
@@ -8122,7 +8696,7 @@
         </w:tc>
         <w:tc>
           <w:tcPr>
-            <w:tcW w:w="2127" w:type="dxa"/>
+            <w:tcW w:w="2108" w:type="dxa"/>
           </w:tcPr>
           <w:p>
             <w:pPr>
@@ -8144,7 +8718,7 @@
         </w:tc>
         <w:tc>
           <w:tcPr>
-            <w:tcW w:w="4745" w:type="dxa"/>
+            <w:tcW w:w="4694" w:type="dxa"/>
           </w:tcPr>
           <w:p>
             <w:pPr>
@@ -8168,7 +8742,7 @@
       <w:tr>
         <w:tc>
           <w:tcPr>
-            <w:tcW w:w="2253" w:type="dxa"/>
+            <w:tcW w:w="2248" w:type="dxa"/>
           </w:tcPr>
           <w:p>
             <w:pPr>
@@ -8182,7 +8756,7 @@
         </w:tc>
         <w:tc>
           <w:tcPr>
-            <w:tcW w:w="2127" w:type="dxa"/>
+            <w:tcW w:w="2108" w:type="dxa"/>
           </w:tcPr>
           <w:p>
             <w:pPr>
@@ -8195,7 +8769,7 @@
         </w:tc>
         <w:tc>
           <w:tcPr>
-            <w:tcW w:w="4745" w:type="dxa"/>
+            <w:tcW w:w="4694" w:type="dxa"/>
           </w:tcPr>
           <w:p>
             <w:pPr>
@@ -8210,7 +8784,7 @@
       <w:tr>
         <w:tc>
           <w:tcPr>
-            <w:tcW w:w="2253" w:type="dxa"/>
+            <w:tcW w:w="2248" w:type="dxa"/>
           </w:tcPr>
           <w:p>
             <w:pPr>
@@ -8224,7 +8798,7 @@
         </w:tc>
         <w:tc>
           <w:tcPr>
-            <w:tcW w:w="2127" w:type="dxa"/>
+            <w:tcW w:w="2108" w:type="dxa"/>
           </w:tcPr>
           <w:p>
             <w:pPr>
@@ -8237,7 +8811,7 @@
         </w:tc>
         <w:tc>
           <w:tcPr>
-            <w:tcW w:w="4745" w:type="dxa"/>
+            <w:tcW w:w="4694" w:type="dxa"/>
           </w:tcPr>
           <w:p>
             <w:pPr>
@@ -8252,7 +8826,7 @@
       <w:tr>
         <w:tc>
           <w:tcPr>
-            <w:tcW w:w="2253" w:type="dxa"/>
+            <w:tcW w:w="2248" w:type="dxa"/>
           </w:tcPr>
           <w:p>
             <w:pPr>
@@ -8266,7 +8840,7 @@
         </w:tc>
         <w:tc>
           <w:tcPr>
-            <w:tcW w:w="2127" w:type="dxa"/>
+            <w:tcW w:w="2108" w:type="dxa"/>
           </w:tcPr>
           <w:p>
             <w:pPr>
@@ -8279,7 +8853,7 @@
         </w:tc>
         <w:tc>
           <w:tcPr>
-            <w:tcW w:w="4745" w:type="dxa"/>
+            <w:tcW w:w="4694" w:type="dxa"/>
           </w:tcPr>
           <w:p>
             <w:pPr>
@@ -8294,7 +8868,7 @@
       <w:tr>
         <w:tc>
           <w:tcPr>
-            <w:tcW w:w="2253" w:type="dxa"/>
+            <w:tcW w:w="2248" w:type="dxa"/>
           </w:tcPr>
           <w:p>
             <w:pPr>
@@ -8308,7 +8882,7 @@
         </w:tc>
         <w:tc>
           <w:tcPr>
-            <w:tcW w:w="2127" w:type="dxa"/>
+            <w:tcW w:w="2108" w:type="dxa"/>
           </w:tcPr>
           <w:p>
             <w:pPr>
@@ -8321,7 +8895,7 @@
         </w:tc>
         <w:tc>
           <w:tcPr>
-            <w:tcW w:w="4745" w:type="dxa"/>
+            <w:tcW w:w="4694" w:type="dxa"/>
           </w:tcPr>
           <w:p>
             <w:pPr>
@@ -8329,27 +8903,70 @@
             </w:pPr>
             <w:r>
               <w:t>Receita relacionada à versão.</w:t>
+            </w:r>
+          </w:p>
+        </w:tc>
+      </w:tr>
+      <w:tr>
+        <w:tc>
+          <w:tcPr>
+            <w:tcW w:w="2248" w:type="dxa"/>
+          </w:tcPr>
+          <w:p>
+            <w:pPr>
+              <w:ind w:left="0" w:firstLine="0"/>
+              <w:jc w:val="center"/>
+            </w:pPr>
+            <w:proofErr w:type="spellStart"/>
+            <w:r>
+              <w:t>idStatus</w:t>
+            </w:r>
+            <w:proofErr w:type="spellEnd"/>
+          </w:p>
+        </w:tc>
+        <w:tc>
+          <w:tcPr>
+            <w:tcW w:w="2108" w:type="dxa"/>
+          </w:tcPr>
+          <w:p>
+            <w:pPr>
+              <w:ind w:left="0" w:firstLine="0"/>
+            </w:pPr>
+            <w:r>
+              <w:t>INT</w:t>
+            </w:r>
+          </w:p>
+        </w:tc>
+        <w:tc>
+          <w:tcPr>
+            <w:tcW w:w="4694" w:type="dxa"/>
+          </w:tcPr>
+          <w:p>
+            <w:pPr>
+              <w:ind w:left="0" w:firstLine="0"/>
+            </w:pPr>
+            <w:r>
+              <w:t>Status relacionado à versão.</w:t>
             </w:r>
           </w:p>
         </w:tc>
       </w:tr>
     </w:tbl>
     <w:p/>
-    <w:p/>
-    <w:p/>
-    <w:p/>
-    <w:p/>
-    <w:p/>
+    <w:p>
+      <w:pPr>
+        <w:ind w:left="0" w:firstLine="0"/>
+      </w:pPr>
+    </w:p>
     <w:p>
       <w:pPr>
         <w:pStyle w:val="Ttulo2"/>
       </w:pPr>
-      <w:bookmarkStart w:id="20" w:name="_Toc233894017"/>
-      <w:r>
-        <w:lastRenderedPageBreak/>
+      <w:bookmarkStart w:id="21" w:name="_Toc234146063"/>
+      <w:r>
         <w:t>2.5.8 TABELA TESTE</w:t>
       </w:r>
-      <w:bookmarkEnd w:id="20"/>
+      <w:bookmarkEnd w:id="21"/>
     </w:p>
     <w:p/>
     <w:p>
@@ -8697,15 +9314,16 @@
       <w:pPr>
         <w:pStyle w:val="Ttulo2"/>
       </w:pPr>
-      <w:bookmarkStart w:id="21" w:name="_Toc233894018"/>
+      <w:bookmarkStart w:id="22" w:name="_Toc234146064"/>
       <w:r>
         <w:t>2.5.9 TABELA HISTÓRICO</w:t>
       </w:r>
-      <w:bookmarkEnd w:id="21"/>
+      <w:bookmarkEnd w:id="22"/>
     </w:p>
     <w:p/>
     <w:p>
       <w:r>
+        <w:lastRenderedPageBreak/>
         <w:tab/>
       </w:r>
       <w:r>
@@ -9016,7 +9634,6 @@
               <w:jc w:val="center"/>
             </w:pPr>
             <w:r>
-              <w:lastRenderedPageBreak/>
               <w:t>idUsuario</w:t>
             </w:r>
           </w:p>
@@ -9055,11 +9672,11 @@
       <w:pPr>
         <w:pStyle w:val="Ttulo2"/>
       </w:pPr>
-      <w:bookmarkStart w:id="22" w:name="_Toc233894019"/>
+      <w:bookmarkStart w:id="23" w:name="_Toc234146065"/>
       <w:r>
         <w:t>2.5.10 RELACIONAMENTOS</w:t>
       </w:r>
-      <w:bookmarkEnd w:id="22"/>
+      <w:bookmarkEnd w:id="23"/>
     </w:p>
     <w:p/>
     <w:p>
@@ -9160,10 +9777,54 @@
           <w:b/>
           <w:bCs/>
         </w:rPr>
-        <w:t>Status do Produto</w:t>
-      </w:r>
-      <w:r>
-        <w:t xml:space="preserve"> pode estar associado a diversos </w:t>
+        <w:t xml:space="preserve">Status </w:t>
+      </w:r>
+      <w:r>
+        <w:rPr>
+          <w:b/>
+          <w:bCs/>
+        </w:rPr>
+        <w:t xml:space="preserve">da Versão </w:t>
+      </w:r>
+      <w:r>
+        <w:t>pode estar associado a divers</w:t>
+      </w:r>
+      <w:r>
+        <w:t>a</w:t>
+      </w:r>
+      <w:r>
+        <w:t xml:space="preserve">s </w:t>
+      </w:r>
+      <w:r>
+        <w:rPr>
+          <w:b/>
+          <w:bCs/>
+        </w:rPr>
+        <w:t>Versões</w:t>
+      </w:r>
+      <w:r>
+        <w:t xml:space="preserve"> (1:N). </w:t>
+      </w:r>
+    </w:p>
+    <w:p>
+      <w:pPr>
+        <w:numPr>
+          <w:ilvl w:val="0"/>
+          <w:numId w:val="2"/>
+        </w:numPr>
+      </w:pPr>
+      <w:r>
+        <w:t xml:space="preserve">Um </w:t>
+      </w:r>
+      <w:r>
+        <w:rPr>
+          <w:b/>
+          <w:bCs/>
+        </w:rPr>
+        <w:t>Usuário</w:t>
+      </w:r>
+      <w:r>
+        <w:t xml:space="preserve"> pode cadastrar diversos </w:t>
       </w:r>
       <w:r>
         <w:rPr>
@@ -9191,20 +9852,20 @@
           <w:b/>
           <w:bCs/>
         </w:rPr>
-        <w:t>Usuário</w:t>
-      </w:r>
-      <w:r>
-        <w:t xml:space="preserve"> pode cadastrar diversos </w:t>
+        <w:t>Produto</w:t>
+      </w:r>
+      <w:r>
+        <w:t xml:space="preserve"> possui apenas um </w:t>
       </w:r>
       <w:r>
         <w:rPr>
           <w:b/>
           <w:bCs/>
         </w:rPr>
-        <w:t>Produtos</w:t>
-      </w:r>
-      <w:r>
-        <w:t xml:space="preserve"> (1:N). </w:t>
+        <w:t>Estoque</w:t>
+      </w:r>
+      <w:r>
+        <w:t xml:space="preserve"> (1:1). </w:t>
       </w:r>
     </w:p>
     <w:p>
@@ -9225,17 +9886,110 @@
         <w:t>Produto</w:t>
       </w:r>
       <w:r>
-        <w:t xml:space="preserve"> possui apenas um </w:t>
+        <w:t xml:space="preserve"> pode possuir diversas </w:t>
       </w:r>
       <w:r>
         <w:rPr>
           <w:b/>
           <w:bCs/>
         </w:rPr>
-        <w:t>Estoque</w:t>
-      </w:r>
-      <w:r>
-        <w:t xml:space="preserve"> (1:1). </w:t>
+        <w:t>Receitas</w:t>
+      </w:r>
+      <w:r>
+        <w:t xml:space="preserve"> (1:N). </w:t>
+      </w:r>
+    </w:p>
+    <w:p>
+      <w:pPr>
+        <w:numPr>
+          <w:ilvl w:val="0"/>
+          <w:numId w:val="2"/>
+        </w:numPr>
+      </w:pPr>
+      <w:r>
+        <w:t xml:space="preserve">Uma </w:t>
+      </w:r>
+      <w:r>
+        <w:rPr>
+          <w:b/>
+          <w:bCs/>
+        </w:rPr>
+        <w:t>Receita</w:t>
+      </w:r>
+      <w:r>
+        <w:t xml:space="preserve"> pode possuir diversas </w:t>
+      </w:r>
+      <w:r>
+        <w:rPr>
+          <w:b/>
+          <w:bCs/>
+        </w:rPr>
+        <w:t>Versões</w:t>
+      </w:r>
+      <w:r>
+        <w:t xml:space="preserve"> (1:N). </w:t>
+      </w:r>
+    </w:p>
+    <w:p>
+      <w:pPr>
+        <w:numPr>
+          <w:ilvl w:val="0"/>
+          <w:numId w:val="2"/>
+        </w:numPr>
+      </w:pPr>
+      <w:r>
+        <w:t xml:space="preserve">Uma </w:t>
+      </w:r>
+      <w:r>
+        <w:rPr>
+          <w:b/>
+          <w:bCs/>
+        </w:rPr>
+        <w:t>Versão da Receita</w:t>
+      </w:r>
+      <w:r>
+        <w:t xml:space="preserve"> pode possuir diversos </w:t>
+      </w:r>
+      <w:r>
+        <w:rPr>
+          <w:b/>
+          <w:bCs/>
+        </w:rPr>
+        <w:t>Testes</w:t>
+      </w:r>
+      <w:r>
+        <w:t xml:space="preserve"> (1:N). </w:t>
+      </w:r>
+    </w:p>
+    <w:p>
+      <w:pPr>
+        <w:numPr>
+          <w:ilvl w:val="0"/>
+          <w:numId w:val="2"/>
+        </w:numPr>
+      </w:pPr>
+      <w:r>
+        <w:t xml:space="preserve">Um </w:t>
+      </w:r>
+      <w:r>
+        <w:rPr>
+          <w:b/>
+          <w:bCs/>
+        </w:rPr>
+        <w:t>Usuário</w:t>
+      </w:r>
+      <w:r>
+        <w:t xml:space="preserve"> pode realizar diversos </w:t>
+      </w:r>
+      <w:r>
+        <w:rPr>
+          <w:b/>
+          <w:bCs/>
+        </w:rPr>
+        <w:t>Testes</w:t>
+      </w:r>
+      <w:r>
+        <w:t xml:space="preserve"> (1:N). </w:t>
       </w:r>
     </w:p>
     <w:p>
@@ -9256,14 +10010,14 @@
         <w:t>Produto</w:t>
       </w:r>
       <w:r>
-        <w:t xml:space="preserve"> pode possuir diversas </w:t>
+        <w:t xml:space="preserve"> pode possuir diversos registros no </w:t>
       </w:r>
       <w:r>
         <w:rPr>
           <w:b/>
           <w:bCs/>
         </w:rPr>
-        <w:t>Receitas</w:t>
+        <w:t>Histórico</w:t>
       </w:r>
       <w:r>
         <w:t xml:space="preserve"> (1:N). </w:t>
@@ -9277,68 +10031,7 @@
         </w:numPr>
       </w:pPr>
       <w:r>
-        <w:t xml:space="preserve">Uma </w:t>
-      </w:r>
-      <w:r>
-        <w:rPr>
-          <w:b/>
-          <w:bCs/>
-        </w:rPr>
-        <w:t>Receita</w:t>
-      </w:r>
-      <w:r>
-        <w:t xml:space="preserve"> pode possuir diversas </w:t>
-      </w:r>
-      <w:r>
-        <w:rPr>
-          <w:b/>
-          <w:bCs/>
-        </w:rPr>
-        <w:t>Versões</w:t>
-      </w:r>
-      <w:r>
-        <w:t xml:space="preserve"> (1:N). </w:t>
-      </w:r>
-    </w:p>
-    <w:p>
-      <w:pPr>
-        <w:numPr>
-          <w:ilvl w:val="0"/>
-          <w:numId w:val="2"/>
-        </w:numPr>
-      </w:pPr>
-      <w:r>
-        <w:t xml:space="preserve">Uma </w:t>
-      </w:r>
-      <w:r>
-        <w:rPr>
-          <w:b/>
-          <w:bCs/>
-        </w:rPr>
-        <w:t>Versão da Receita</w:t>
-      </w:r>
-      <w:r>
-        <w:t xml:space="preserve"> pode possuir diversos </w:t>
-      </w:r>
-      <w:r>
-        <w:rPr>
-          <w:b/>
-          <w:bCs/>
-        </w:rPr>
-        <w:t>Testes</w:t>
-      </w:r>
-      <w:r>
-        <w:t xml:space="preserve"> (1:N). </w:t>
-      </w:r>
-    </w:p>
-    <w:p>
-      <w:pPr>
-        <w:numPr>
-          <w:ilvl w:val="0"/>
-          <w:numId w:val="2"/>
-        </w:numPr>
-      </w:pPr>
-      <w:r>
+        <w:lastRenderedPageBreak/>
         <w:t xml:space="preserve">Um </w:t>
       </w:r>
       <w:r>
@@ -9349,38 +10042,7 @@
         <w:t>Usuário</w:t>
       </w:r>
       <w:r>
-        <w:t xml:space="preserve"> pode realizar diversos </w:t>
-      </w:r>
-      <w:r>
-        <w:rPr>
-          <w:b/>
-          <w:bCs/>
-        </w:rPr>
-        <w:t>Testes</w:t>
-      </w:r>
-      <w:r>
-        <w:t xml:space="preserve"> (1:N). </w:t>
-      </w:r>
-    </w:p>
-    <w:p>
-      <w:pPr>
-        <w:numPr>
-          <w:ilvl w:val="0"/>
-          <w:numId w:val="2"/>
-        </w:numPr>
-      </w:pPr>
-      <w:r>
-        <w:t xml:space="preserve">Um </w:t>
-      </w:r>
-      <w:r>
-        <w:rPr>
-          <w:b/>
-          <w:bCs/>
-        </w:rPr>
-        <w:t>Produto</w:t>
-      </w:r>
-      <w:r>
-        <w:t xml:space="preserve"> pode possuir diversos registros no </w:t>
+        <w:t xml:space="preserve"> pode gerar diversos registros no </w:t>
       </w:r>
       <w:r>
         <w:rPr>
@@ -9395,58 +10057,29 @@
     </w:p>
     <w:p>
       <w:pPr>
-        <w:numPr>
-          <w:ilvl w:val="0"/>
-          <w:numId w:val="2"/>
-        </w:numPr>
-      </w:pPr>
-      <w:r>
-        <w:t xml:space="preserve">Um </w:t>
-      </w:r>
-      <w:r>
+        <w:ind w:left="0" w:firstLine="0"/>
         <w:rPr>
-          <w:b/>
-          <w:bCs/>
+          <w:u w:val="single"/>
         </w:rPr>
-        <w:t>Usuário</w:t>
-      </w:r>
-      <w:r>
-        <w:t xml:space="preserve"> pode gerar diversos registros no </w:t>
-      </w:r>
-      <w:r>
+      </w:pPr>
+    </w:p>
+    <w:p>
+      <w:pPr>
+        <w:ind w:left="0" w:firstLine="0"/>
         <w:rPr>
-          <w:b/>
-          <w:bCs/>
+          <w:u w:val="single"/>
         </w:rPr>
-        <w:t>Histórico</w:t>
-      </w:r>
-      <w:r>
-        <w:t xml:space="preserve"> (1:N). </w:t>
-      </w:r>
-    </w:p>
-    <w:p/>
-    <w:p/>
-    <w:p/>
-    <w:p/>
-    <w:p/>
-    <w:p/>
-    <w:p/>
-    <w:p/>
-    <w:p/>
-    <w:p/>
-    <w:p/>
-    <w:p/>
-    <w:p/>
-    <w:p/>
+      </w:pPr>
+    </w:p>
     <w:p>
       <w:pPr>
         <w:pStyle w:val="Ttulo2"/>
       </w:pPr>
-      <w:bookmarkStart w:id="23" w:name="_Toc233894020"/>
+      <w:bookmarkStart w:id="24" w:name="_Toc234146066"/>
       <w:r>
         <w:t>2.6 ESTRUTURA DA API</w:t>
       </w:r>
-      <w:bookmarkEnd w:id="23"/>
+      <w:bookmarkEnd w:id="24"/>
     </w:p>
     <w:p/>
     <w:p>
@@ -9835,11 +10468,11 @@
       <w:pPr>
         <w:pStyle w:val="Ttulo2"/>
       </w:pPr>
-      <w:bookmarkStart w:id="24" w:name="_Toc233894021"/>
+      <w:bookmarkStart w:id="25" w:name="_Toc234146067"/>
       <w:r>
         <w:t>2.6.1 MÉTODOS HTTP</w:t>
       </w:r>
-      <w:bookmarkEnd w:id="24"/>
+      <w:bookmarkEnd w:id="25"/>
     </w:p>
     <w:p/>
     <w:p>
@@ -10051,11 +10684,11 @@
       <w:pPr>
         <w:pStyle w:val="Ttulo2"/>
       </w:pPr>
-      <w:bookmarkStart w:id="25" w:name="_Toc233894022"/>
+      <w:bookmarkStart w:id="26" w:name="_Toc234146068"/>
       <w:r>
         <w:t>2.6.2 USUARIO CONTROLLER</w:t>
       </w:r>
-      <w:bookmarkEnd w:id="25"/>
+      <w:bookmarkEnd w:id="26"/>
     </w:p>
     <w:p/>
     <w:p>
@@ -10465,7 +11098,7 @@
       <w:pPr>
         <w:pStyle w:val="Ttulo2"/>
       </w:pPr>
-      <w:bookmarkStart w:id="26" w:name="_Toc233894023"/>
+      <w:bookmarkStart w:id="27" w:name="_Toc234146069"/>
       <w:r>
         <w:t>2.6.</w:t>
       </w:r>
@@ -10475,7 +11108,7 @@
       <w:r>
         <w:t xml:space="preserve"> PERFIL CONTROLLER</w:t>
       </w:r>
-      <w:bookmarkEnd w:id="26"/>
+      <w:bookmarkEnd w:id="27"/>
       <w:r>
         <w:t xml:space="preserve"> </w:t>
       </w:r>
@@ -10842,7 +11475,7 @@
       <w:pPr>
         <w:pStyle w:val="Ttulo2"/>
       </w:pPr>
-      <w:bookmarkStart w:id="27" w:name="_Toc233894024"/>
+      <w:bookmarkStart w:id="28" w:name="_Toc234146070"/>
       <w:r>
         <w:t>2.6.</w:t>
       </w:r>
@@ -10852,7 +11485,7 @@
       <w:r>
         <w:t xml:space="preserve"> PRODUTO CONTROLLER</w:t>
       </w:r>
-      <w:bookmarkEnd w:id="27"/>
+      <w:bookmarkEnd w:id="28"/>
     </w:p>
     <w:p>
       <w:pPr>
@@ -11219,7 +11852,7 @@
       <w:pPr>
         <w:pStyle w:val="Ttulo2"/>
       </w:pPr>
-      <w:bookmarkStart w:id="28" w:name="_Toc233894025"/>
+      <w:bookmarkStart w:id="29" w:name="_Toc234146071"/>
       <w:r>
         <w:t>2.6.</w:t>
       </w:r>
@@ -11240,7 +11873,7 @@
       <w:r>
         <w:t xml:space="preserve"> CONTROLLER</w:t>
       </w:r>
-      <w:bookmarkEnd w:id="28"/>
+      <w:bookmarkEnd w:id="29"/>
     </w:p>
     <w:p/>
     <w:p>
@@ -11591,27 +12224,10 @@
       </w:tr>
     </w:tbl>
     <w:p/>
-    <w:p/>
-    <w:p/>
     <w:p>
       <w:pPr>
         <w:ind w:left="0" w:firstLine="0"/>
       </w:pPr>
-      <w:r>
-        <w:tab/>
-      </w:r>
-    </w:p>
-    <w:p>
-      <w:pPr>
-        <w:spacing w:after="161" w:line="360" w:lineRule="auto"/>
-        <w:ind w:right="168"/>
-      </w:pPr>
-    </w:p>
-    <w:p>
-      <w:pPr>
-        <w:spacing w:after="161" w:line="360" w:lineRule="auto"/>
-        <w:ind w:right="168"/>
-      </w:pPr>
     </w:p>
     <w:p>
       <w:pPr>
@@ -11622,12 +12238,7 @@
       <w:pPr>
         <w:pStyle w:val="Ttulo2"/>
       </w:pPr>
-    </w:p>
-    <w:p>
-      <w:pPr>
-        <w:pStyle w:val="Ttulo2"/>
-      </w:pPr>
-      <w:bookmarkStart w:id="29" w:name="_Toc233894026"/>
+      <w:bookmarkStart w:id="30" w:name="_Toc234146072"/>
       <w:r>
         <w:t>2.6.</w:t>
       </w:r>
@@ -11637,7 +12248,7 @@
       <w:r>
         <w:t xml:space="preserve"> ESTOQUE CONTROLLER</w:t>
       </w:r>
-      <w:bookmarkEnd w:id="29"/>
+      <w:bookmarkEnd w:id="30"/>
     </w:p>
     <w:p/>
     <w:p>
@@ -11764,6 +12375,7 @@
               <w:ind w:left="0" w:firstLine="0"/>
             </w:pPr>
             <w:r>
+              <w:lastRenderedPageBreak/>
               <w:t>GET</w:t>
             </w:r>
           </w:p>
@@ -11978,7 +12590,7 @@
       <w:pPr>
         <w:pStyle w:val="Ttulo2"/>
       </w:pPr>
-      <w:bookmarkStart w:id="30" w:name="_Toc233894027"/>
+      <w:bookmarkStart w:id="31" w:name="_Toc234146073"/>
       <w:r>
         <w:t>2.6.</w:t>
       </w:r>
@@ -11988,7 +12600,7 @@
       <w:r>
         <w:t xml:space="preserve"> RECEITA CONTROLLER</w:t>
       </w:r>
-      <w:bookmarkEnd w:id="30"/>
+      <w:bookmarkEnd w:id="31"/>
     </w:p>
     <w:p/>
     <w:p>
@@ -12341,9 +12953,8 @@
       <w:pPr>
         <w:pStyle w:val="Ttulo2"/>
       </w:pPr>
-      <w:bookmarkStart w:id="31" w:name="_Toc233894028"/>
-      <w:r>
-        <w:lastRenderedPageBreak/>
+      <w:bookmarkStart w:id="32" w:name="_Toc234146074"/>
+      <w:r>
         <w:t>2.6.</w:t>
       </w:r>
       <w:r>
@@ -12360,7 +12971,7 @@
       <w:r>
         <w:t xml:space="preserve"> CONTROLLER</w:t>
       </w:r>
-      <w:bookmarkEnd w:id="31"/>
+      <w:bookmarkEnd w:id="32"/>
     </w:p>
     <w:p>
       <w:pPr>
@@ -12490,6 +13101,7 @@
               <w:jc w:val="center"/>
             </w:pPr>
             <w:r>
+              <w:lastRenderedPageBreak/>
               <w:t>GET</w:t>
             </w:r>
           </w:p>
@@ -12750,7 +13362,7 @@
       <w:pPr>
         <w:pStyle w:val="Ttulo2"/>
       </w:pPr>
-      <w:bookmarkStart w:id="32" w:name="_Toc233894029"/>
+      <w:bookmarkStart w:id="33" w:name="_Toc234146075"/>
       <w:r>
         <w:t>2.6.</w:t>
       </w:r>
@@ -12760,7 +13372,7 @@
       <w:r>
         <w:t xml:space="preserve"> TESTE CONTROLER</w:t>
       </w:r>
-      <w:bookmarkEnd w:id="32"/>
+      <w:bookmarkEnd w:id="33"/>
     </w:p>
     <w:p/>
     <w:p>
@@ -13109,9 +13721,8 @@
       <w:pPr>
         <w:pStyle w:val="Ttulo2"/>
       </w:pPr>
-      <w:bookmarkStart w:id="33" w:name="_Toc233894030"/>
-      <w:r>
-        <w:lastRenderedPageBreak/>
+      <w:bookmarkStart w:id="34" w:name="_Toc234146076"/>
+      <w:r>
         <w:t>2.6.</w:t>
       </w:r>
       <w:r>
@@ -13120,7 +13731,7 @@
       <w:r>
         <w:t xml:space="preserve"> HISTORICO CONTROLLER</w:t>
       </w:r>
-      <w:bookmarkEnd w:id="33"/>
+      <w:bookmarkEnd w:id="34"/>
     </w:p>
     <w:p/>
     <w:p>
@@ -13195,6 +13806,7 @@
                 <w:b/>
                 <w:bCs/>
               </w:rPr>
+              <w:lastRenderedPageBreak/>
               <w:t>Método HTTP</w:t>
             </w:r>
           </w:p>
@@ -13512,11 +14124,219 @@
       <w:pPr>
         <w:pStyle w:val="Ttulo2"/>
       </w:pPr>
-      <w:bookmarkStart w:id="34" w:name="_Toc233894031"/>
+      <w:bookmarkStart w:id="35" w:name="_Toc234146077"/>
+      <w:r>
+        <w:t>2.6.11 AUTH CONTROLLER</w:t>
+      </w:r>
+      <w:bookmarkEnd w:id="35"/>
+    </w:p>
+    <w:p>
+      <w:r>
+        <w:tab/>
+      </w:r>
+      <w:r>
+        <w:tab/>
+        <w:t xml:space="preserve">O </w:t>
+      </w:r>
+      <w:proofErr w:type="spellStart"/>
+      <w:r>
+        <w:rPr>
+          <w:b/>
+          <w:bCs/>
+        </w:rPr>
+        <w:t>AuthController</w:t>
+      </w:r>
+      <w:proofErr w:type="spellEnd"/>
+      <w:r>
+        <w:rPr>
+          <w:b/>
+          <w:bCs/>
+        </w:rPr>
+        <w:t xml:space="preserve"> </w:t>
+      </w:r>
+      <w:r>
+        <w:t xml:space="preserve">disponibiliza apenas o </w:t>
+      </w:r>
+      <w:proofErr w:type="spellStart"/>
+      <w:r>
+        <w:t>endpoint</w:t>
+      </w:r>
+      <w:proofErr w:type="spellEnd"/>
+      <w:r>
+        <w:t xml:space="preserve"> </w:t>
+      </w:r>
+      <w:r>
+        <w:rPr>
+          <w:b/>
+          <w:bCs/>
+        </w:rPr>
+        <w:t>POST</w:t>
+      </w:r>
+      <w:r>
+        <w:t xml:space="preserve">, responsável por fazer o login com os dados enviados pelo </w:t>
+      </w:r>
+      <w:proofErr w:type="spellStart"/>
+      <w:r>
+        <w:t>frontend</w:t>
+      </w:r>
+      <w:proofErr w:type="spellEnd"/>
+      <w:r>
+        <w:t>.</w:t>
+      </w:r>
+    </w:p>
+    <w:p/>
+    <w:tbl>
+      <w:tblPr>
+        <w:tblStyle w:val="Tabelacomgrade"/>
+        <w:tblW w:w="0" w:type="auto"/>
+        <w:tblInd w:w="10" w:type="dxa"/>
+        <w:tblLook w:val="04A0" w:firstRow="1" w:lastRow="0" w:firstColumn="1" w:lastColumn="0" w:noHBand="0" w:noVBand="1"/>
+      </w:tblPr>
+      <w:tblGrid>
+        <w:gridCol w:w="2112"/>
+        <w:gridCol w:w="2551"/>
+        <w:gridCol w:w="4387"/>
+      </w:tblGrid>
+      <w:tr>
+        <w:tc>
+          <w:tcPr>
+            <w:tcW w:w="2112" w:type="dxa"/>
+          </w:tcPr>
+          <w:p>
+            <w:pPr>
+              <w:ind w:left="0" w:firstLine="0"/>
+              <w:jc w:val="center"/>
+              <w:rPr>
+                <w:b/>
+                <w:bCs/>
+              </w:rPr>
+            </w:pPr>
+            <w:r>
+              <w:rPr>
+                <w:b/>
+                <w:bCs/>
+              </w:rPr>
+              <w:t>Método HTTP</w:t>
+            </w:r>
+          </w:p>
+        </w:tc>
+        <w:tc>
+          <w:tcPr>
+            <w:tcW w:w="2551" w:type="dxa"/>
+          </w:tcPr>
+          <w:p>
+            <w:pPr>
+              <w:ind w:left="0" w:firstLine="0"/>
+              <w:jc w:val="center"/>
+              <w:rPr>
+                <w:b/>
+                <w:bCs/>
+              </w:rPr>
+            </w:pPr>
+            <w:proofErr w:type="spellStart"/>
+            <w:r>
+              <w:rPr>
+                <w:b/>
+                <w:bCs/>
+              </w:rPr>
+              <w:t>Endpoint</w:t>
+            </w:r>
+            <w:proofErr w:type="spellEnd"/>
+          </w:p>
+        </w:tc>
+        <w:tc>
+          <w:tcPr>
+            <w:tcW w:w="4387" w:type="dxa"/>
+          </w:tcPr>
+          <w:p>
+            <w:pPr>
+              <w:ind w:left="0" w:firstLine="0"/>
+              <w:jc w:val="center"/>
+              <w:rPr>
+                <w:b/>
+                <w:bCs/>
+              </w:rPr>
+            </w:pPr>
+            <w:r>
+              <w:rPr>
+                <w:b/>
+                <w:bCs/>
+              </w:rPr>
+              <w:t>Descrição</w:t>
+            </w:r>
+          </w:p>
+        </w:tc>
+      </w:tr>
+      <w:tr>
+        <w:tc>
+          <w:tcPr>
+            <w:tcW w:w="2112" w:type="dxa"/>
+          </w:tcPr>
+          <w:p>
+            <w:pPr>
+              <w:ind w:left="0" w:firstLine="0"/>
+              <w:jc w:val="center"/>
+            </w:pPr>
+            <w:r>
+              <w:t>POST</w:t>
+            </w:r>
+          </w:p>
+        </w:tc>
+        <w:tc>
+          <w:tcPr>
+            <w:tcW w:w="2551" w:type="dxa"/>
+          </w:tcPr>
+          <w:p>
+            <w:pPr>
+              <w:ind w:left="0" w:firstLine="0"/>
+            </w:pPr>
+            <w:r>
+              <w:t>/</w:t>
+            </w:r>
+            <w:proofErr w:type="spellStart"/>
+            <w:r>
+              <w:t>auth</w:t>
+            </w:r>
+            <w:proofErr w:type="spellEnd"/>
+            <w:r>
+              <w:t>/login</w:t>
+            </w:r>
+          </w:p>
+        </w:tc>
+        <w:tc>
+          <w:tcPr>
+            <w:tcW w:w="4387" w:type="dxa"/>
+          </w:tcPr>
+          <w:p>
+            <w:pPr>
+              <w:ind w:left="0" w:firstLine="0"/>
+            </w:pPr>
+            <w:r>
+              <w:t xml:space="preserve">Realiza o login com os dados enviados pelo </w:t>
+            </w:r>
+            <w:proofErr w:type="spellStart"/>
+            <w:r>
+              <w:t>frontend</w:t>
+            </w:r>
+            <w:proofErr w:type="spellEnd"/>
+            <w:r>
+              <w:t>.</w:t>
+            </w:r>
+          </w:p>
+        </w:tc>
+      </w:tr>
+    </w:tbl>
+    <w:p/>
+    <w:p/>
+    <w:p>
+      <w:pPr>
+        <w:pStyle w:val="Ttulo2"/>
+      </w:pPr>
+      <w:bookmarkStart w:id="36" w:name="_Toc234146078"/>
       <w:r>
         <w:t>2.7 TRATAMENTO DE EXCEÇÕES</w:t>
       </w:r>
-      <w:bookmarkEnd w:id="34"/>
+      <w:bookmarkEnd w:id="36"/>
     </w:p>
     <w:p/>
     <w:p>
@@ -13574,10 +14394,6 @@
         <w:t>, facilita a identificação de problemas e contribui para a organização e manutenção do código.</w:t>
       </w:r>
     </w:p>
-    <w:p/>
-    <w:p/>
-    <w:p/>
-    <w:p/>
     <w:p>
       <w:pPr>
         <w:ind w:left="0" w:firstLine="0"/>
@@ -13585,9 +14401,14 @@
     </w:p>
     <w:p>
       <w:pPr>
+        <w:ind w:left="0" w:firstLine="0"/>
+      </w:pPr>
+    </w:p>
+    <w:p>
+      <w:pPr>
         <w:pStyle w:val="Ttulo2"/>
       </w:pPr>
-      <w:bookmarkStart w:id="35" w:name="_Toc233894032"/>
+      <w:bookmarkStart w:id="37" w:name="_Toc234146079"/>
       <w:r>
         <w:lastRenderedPageBreak/>
         <w:t xml:space="preserve">2.7.1 </w:t>
@@ -13596,7 +14417,7 @@
       <w:r>
         <w:t>GlobalExceptionHandler</w:t>
       </w:r>
-      <w:bookmarkEnd w:id="35"/>
+      <w:bookmarkEnd w:id="37"/>
       <w:proofErr w:type="spellEnd"/>
     </w:p>
     <w:p/>
@@ -13681,7 +14502,7 @@
       <w:pPr>
         <w:pStyle w:val="Ttulo2"/>
       </w:pPr>
-      <w:bookmarkStart w:id="36" w:name="_Toc233894033"/>
+      <w:bookmarkStart w:id="38" w:name="_Toc234146080"/>
       <w:r>
         <w:t xml:space="preserve">2.7.2 </w:t>
       </w:r>
@@ -13689,7 +14510,7 @@
       <w:r>
         <w:t>ErrorResponse</w:t>
       </w:r>
-      <w:bookmarkEnd w:id="36"/>
+      <w:bookmarkEnd w:id="38"/>
       <w:proofErr w:type="spellEnd"/>
     </w:p>
     <w:p/>
@@ -13876,24 +14697,20 @@
       </w:tr>
     </w:tbl>
     <w:p/>
-    <w:p/>
-    <w:p/>
-    <w:p/>
-    <w:p/>
-    <w:p/>
-    <w:p/>
-    <w:p/>
-    <w:p/>
+    <w:p>
+      <w:pPr>
+        <w:ind w:left="0" w:firstLine="0"/>
+      </w:pPr>
+    </w:p>
     <w:p>
       <w:pPr>
         <w:pStyle w:val="Ttulo2"/>
       </w:pPr>
-      <w:bookmarkStart w:id="37" w:name="_Toc233894034"/>
-      <w:r>
-        <w:lastRenderedPageBreak/>
+      <w:bookmarkStart w:id="39" w:name="_Toc234146081"/>
+      <w:r>
         <w:t>2.7.3 EXCEÇÕES PERSONALIZADAS</w:t>
       </w:r>
-      <w:bookmarkEnd w:id="37"/>
+      <w:bookmarkEnd w:id="39"/>
     </w:p>
     <w:p/>
     <w:p>
@@ -13934,14 +14751,14 @@
         <w:tblLook w:val="04A0" w:firstRow="1" w:lastRow="0" w:firstColumn="1" w:lastColumn="0" w:noHBand="0" w:noVBand="1"/>
       </w:tblPr>
       <w:tblGrid>
-        <w:gridCol w:w="3437"/>
-        <w:gridCol w:w="2875"/>
-        <w:gridCol w:w="3029"/>
+        <w:gridCol w:w="3570"/>
+        <w:gridCol w:w="2835"/>
+        <w:gridCol w:w="2936"/>
       </w:tblGrid>
       <w:tr>
         <w:tc>
           <w:tcPr>
-            <w:tcW w:w="3437" w:type="dxa"/>
+            <w:tcW w:w="3450" w:type="dxa"/>
           </w:tcPr>
           <w:p>
             <w:pPr>
@@ -13957,13 +14774,14 @@
                 <w:b/>
                 <w:bCs/>
               </w:rPr>
+              <w:lastRenderedPageBreak/>
               <w:t>Exceção</w:t>
             </w:r>
           </w:p>
         </w:tc>
         <w:tc>
           <w:tcPr>
-            <w:tcW w:w="2875" w:type="dxa"/>
+            <w:tcW w:w="2868" w:type="dxa"/>
           </w:tcPr>
           <w:p>
             <w:pPr>
@@ -13985,7 +14803,7 @@
         </w:tc>
         <w:tc>
           <w:tcPr>
-            <w:tcW w:w="3029" w:type="dxa"/>
+            <w:tcW w:w="3023" w:type="dxa"/>
           </w:tcPr>
           <w:p>
             <w:pPr>
@@ -14009,7 +14827,7 @@
       <w:tr>
         <w:tc>
           <w:tcPr>
-            <w:tcW w:w="3437" w:type="dxa"/>
+            <w:tcW w:w="3450" w:type="dxa"/>
           </w:tcPr>
           <w:p>
             <w:pPr>
@@ -14025,7 +14843,7 @@
         </w:tc>
         <w:tc>
           <w:tcPr>
-            <w:tcW w:w="2875" w:type="dxa"/>
+            <w:tcW w:w="2868" w:type="dxa"/>
           </w:tcPr>
           <w:p>
             <w:pPr>
@@ -14054,7 +14872,7 @@
         </w:tc>
         <w:tc>
           <w:tcPr>
-            <w:tcW w:w="3029" w:type="dxa"/>
+            <w:tcW w:w="3023" w:type="dxa"/>
           </w:tcPr>
           <w:p>
             <w:pPr>
@@ -14069,7 +14887,7 @@
       <w:tr>
         <w:tc>
           <w:tcPr>
-            <w:tcW w:w="3437" w:type="dxa"/>
+            <w:tcW w:w="3450" w:type="dxa"/>
           </w:tcPr>
           <w:p>
             <w:pPr>
@@ -14085,7 +14903,7 @@
         </w:tc>
         <w:tc>
           <w:tcPr>
-            <w:tcW w:w="2875" w:type="dxa"/>
+            <w:tcW w:w="2868" w:type="dxa"/>
           </w:tcPr>
           <w:p>
             <w:pPr>
@@ -14114,7 +14932,7 @@
         </w:tc>
         <w:tc>
           <w:tcPr>
-            <w:tcW w:w="3029" w:type="dxa"/>
+            <w:tcW w:w="3023" w:type="dxa"/>
           </w:tcPr>
           <w:p>
             <w:pPr>
@@ -14122,37 +14940,162 @@
             </w:pPr>
             <w:r>
               <w:t>Lançada quando os dados enviados na requisição não atendem às regras de validação da aplicação.</w:t>
+            </w:r>
+          </w:p>
+        </w:tc>
+      </w:tr>
+      <w:tr>
+        <w:tc>
+          <w:tcPr>
+            <w:tcW w:w="3450" w:type="dxa"/>
+          </w:tcPr>
+          <w:p>
+            <w:pPr>
+              <w:ind w:left="0" w:firstLine="0"/>
+              <w:jc w:val="center"/>
+            </w:pPr>
+            <w:proofErr w:type="spellStart"/>
+            <w:r>
+              <w:t>EmailJaCadastradoException</w:t>
+            </w:r>
+            <w:proofErr w:type="spellEnd"/>
+          </w:p>
+        </w:tc>
+        <w:tc>
+          <w:tcPr>
+            <w:tcW w:w="2868" w:type="dxa"/>
+          </w:tcPr>
+          <w:p>
+            <w:pPr>
+              <w:ind w:left="0" w:firstLine="0"/>
+            </w:pPr>
+            <w:r>
+              <w:t>400(</w:t>
+            </w:r>
+            <w:proofErr w:type="spellStart"/>
+            <w:r>
+              <w:t>Bad</w:t>
+            </w:r>
+            <w:proofErr w:type="spellEnd"/>
+            <w:r>
+              <w:t xml:space="preserve"> </w:t>
+            </w:r>
+            <w:proofErr w:type="spellStart"/>
+            <w:r>
+              <w:t>Request</w:t>
+            </w:r>
+            <w:proofErr w:type="spellEnd"/>
+            <w:r>
+              <w:t>)</w:t>
+            </w:r>
+          </w:p>
+        </w:tc>
+        <w:tc>
+          <w:tcPr>
+            <w:tcW w:w="3023" w:type="dxa"/>
+          </w:tcPr>
+          <w:p>
+            <w:pPr>
+              <w:ind w:left="0" w:firstLine="0"/>
+            </w:pPr>
+            <w:r>
+              <w:t xml:space="preserve">Lançada quando o </w:t>
+            </w:r>
+            <w:proofErr w:type="spellStart"/>
+            <w:r>
+              <w:t>email</w:t>
+            </w:r>
+            <w:proofErr w:type="spellEnd"/>
+            <w:r>
+              <w:t xml:space="preserve"> enviado pelo </w:t>
+            </w:r>
+            <w:proofErr w:type="spellStart"/>
+            <w:r>
+              <w:t>frontend</w:t>
+            </w:r>
+            <w:proofErr w:type="spellEnd"/>
+            <w:r>
+              <w:t xml:space="preserve"> no cadastro já existe no banco.</w:t>
+            </w:r>
+          </w:p>
+        </w:tc>
+      </w:tr>
+      <w:tr>
+        <w:tc>
+          <w:tcPr>
+            <w:tcW w:w="3450" w:type="dxa"/>
+          </w:tcPr>
+          <w:p>
+            <w:pPr>
+              <w:ind w:left="0" w:firstLine="0"/>
+              <w:jc w:val="center"/>
+            </w:pPr>
+            <w:proofErr w:type="spellStart"/>
+            <w:r>
+              <w:t>CredenciaisInvalidasException</w:t>
+            </w:r>
+            <w:proofErr w:type="spellEnd"/>
+          </w:p>
+        </w:tc>
+        <w:tc>
+          <w:tcPr>
+            <w:tcW w:w="2868" w:type="dxa"/>
+          </w:tcPr>
+          <w:p>
+            <w:pPr>
+              <w:ind w:left="0" w:firstLine="0"/>
+            </w:pPr>
+            <w:r>
+              <w:t>401(</w:t>
+            </w:r>
+            <w:proofErr w:type="spellStart"/>
+            <w:r>
+              <w:t>Unauthorized</w:t>
+            </w:r>
+            <w:proofErr w:type="spellEnd"/>
+            <w:r>
+              <w:t>)</w:t>
+            </w:r>
+          </w:p>
+        </w:tc>
+        <w:tc>
+          <w:tcPr>
+            <w:tcW w:w="3023" w:type="dxa"/>
+          </w:tcPr>
+          <w:p>
+            <w:pPr>
+              <w:ind w:left="0" w:firstLine="0"/>
+            </w:pPr>
+            <w:r>
+              <w:t xml:space="preserve">Lançado quando os dados enviados pelo </w:t>
+            </w:r>
+            <w:proofErr w:type="spellStart"/>
+            <w:r>
+              <w:t>frontend</w:t>
+            </w:r>
+            <w:proofErr w:type="spellEnd"/>
+            <w:r>
+              <w:t xml:space="preserve"> no login não coincidem com nenhum salvos no banco.</w:t>
             </w:r>
           </w:p>
         </w:tc>
       </w:tr>
     </w:tbl>
     <w:p/>
-    <w:p/>
-    <w:p/>
-    <w:p/>
-    <w:p/>
-    <w:p/>
-    <w:p/>
-    <w:p/>
-    <w:p/>
-    <w:p/>
-    <w:p/>
-    <w:p/>
-    <w:p/>
-    <w:p/>
-    <w:p/>
-    <w:p/>
+    <w:p>
+      <w:pPr>
+        <w:ind w:left="0" w:firstLine="0"/>
+      </w:pPr>
+    </w:p>
     <w:p>
       <w:pPr>
         <w:pStyle w:val="Ttulo2"/>
       </w:pPr>
-      <w:bookmarkStart w:id="38" w:name="_Toc233894035"/>
-      <w:r>
-        <w:lastRenderedPageBreak/>
+      <w:bookmarkStart w:id="40" w:name="_Toc234146082"/>
+      <w:r>
         <w:t>2.7.4 FLUXO DO TRATAMENTO DE EXCEÇÕES</w:t>
       </w:r>
-      <w:bookmarkEnd w:id="38"/>
+      <w:bookmarkEnd w:id="40"/>
     </w:p>
     <w:p/>
     <w:p>
@@ -14232,12 +15175,17 @@
         <w:t>Figura 4 – Fluxo do tratamento de exceções</w:t>
       </w:r>
     </w:p>
-    <w:p/>
+    <w:p>
+      <w:pPr>
+        <w:ind w:left="0" w:firstLine="0"/>
+      </w:pPr>
+    </w:p>
     <w:p>
       <w:r>
         <w:rPr>
           <w:noProof/>
         </w:rPr>
+        <w:lastRenderedPageBreak/>
         <w:drawing>
           <wp:inline distT="0" distB="0" distL="0" distR="0" wp14:anchorId="7DA21871" wp14:editId="4F7B7C7F">
             <wp:extent cx="5756910" cy="2456815"/>
@@ -14314,6 +15262,90 @@
       </w:r>
     </w:p>
     <w:p/>
+    <w:p>
+      <w:pPr>
+        <w:ind w:left="0" w:firstLine="0"/>
+      </w:pPr>
+    </w:p>
+    <w:p>
+      <w:pPr>
+        <w:ind w:left="0" w:firstLine="0"/>
+      </w:pPr>
+    </w:p>
+    <w:p>
+      <w:pPr>
+        <w:pStyle w:val="Ttulo2"/>
+      </w:pPr>
+      <w:bookmarkStart w:id="41" w:name="_Toc234146083"/>
+      <w:r>
+        <w:t>2.7.5 EXEMPLO DE RESPOSTA</w:t>
+      </w:r>
+      <w:bookmarkEnd w:id="41"/>
+    </w:p>
+    <w:p/>
+    <w:p>
+      <w:r>
+        <w:tab/>
+      </w:r>
+      <w:r>
+        <w:tab/>
+        <w:t>Quando ocorre uma exceção, a API retorna uma resposta em formato JSON semelhante ao exemplo abaixo:</w:t>
+      </w:r>
+    </w:p>
+    <w:p/>
+    <w:p>
+      <w:pPr>
+        <w:jc w:val="left"/>
+      </w:pPr>
+      <w:r>
+        <w:t>{</w:t>
+      </w:r>
+    </w:p>
+    <w:p>
+      <w:pPr>
+        <w:jc w:val="left"/>
+      </w:pPr>
+      <w:r>
+        <w:t>"</w:t>
+      </w:r>
+      <w:proofErr w:type="spellStart"/>
+      <w:r>
+        <w:t>timestamp</w:t>
+      </w:r>
+      <w:proofErr w:type="spellEnd"/>
+      <w:r>
+        <w:t>": "2026-07-01T20:15:43.512",</w:t>
+      </w:r>
+    </w:p>
+    <w:p>
+      <w:pPr>
+        <w:jc w:val="left"/>
+      </w:pPr>
+      <w:r>
+        <w:t>"status": 404,</w:t>
+      </w:r>
+    </w:p>
+    <w:p>
+      <w:pPr>
+        <w:jc w:val="left"/>
+      </w:pPr>
+      <w:r>
+        <w:t>"mensagem": "Teste não encontrado!"</w:t>
+      </w:r>
+    </w:p>
+    <w:p>
+      <w:pPr>
+        <w:jc w:val="left"/>
+      </w:pPr>
+      <w:r>
+        <w:t>}</w:t>
+      </w:r>
+    </w:p>
+    <w:p>
+      <w:pPr>
+        <w:pStyle w:val="Ttulo1"/>
+      </w:pPr>
+    </w:p>
     <w:p/>
     <w:p/>
     <w:p/>
@@ -14321,108 +15353,24 @@
     <w:p/>
     <w:p/>
     <w:p/>
-    <w:p/>
-    <w:p/>
-    <w:p/>
-    <w:p/>
-    <w:p>
-      <w:pPr>
-        <w:pStyle w:val="Ttulo2"/>
-      </w:pPr>
-      <w:bookmarkStart w:id="39" w:name="_Toc233894036"/>
-      <w:r>
-        <w:lastRenderedPageBreak/>
-        <w:t>2.7.5 EXEMPLO DE RESPOSTA</w:t>
-      </w:r>
-      <w:bookmarkEnd w:id="39"/>
-    </w:p>
-    <w:p/>
-    <w:p>
-      <w:r>
-        <w:tab/>
-      </w:r>
-      <w:r>
-        <w:tab/>
-      </w:r>
-      <w:r>
-        <w:t>Quando ocorre uma exceção, a API retorna uma resposta em formato JSON semelhante ao exemplo abaixo:</w:t>
-      </w:r>
-    </w:p>
-    <w:p/>
-    <w:p>
-      <w:pPr>
-        <w:jc w:val="left"/>
-      </w:pPr>
-      <w:r>
-        <w:t>{</w:t>
-      </w:r>
-    </w:p>
-    <w:p>
-      <w:pPr>
-        <w:jc w:val="left"/>
-      </w:pPr>
-      <w:r>
-        <w:t>"</w:t>
-      </w:r>
-      <w:proofErr w:type="spellStart"/>
-      <w:r>
-        <w:t>timestamp</w:t>
-      </w:r>
-      <w:proofErr w:type="spellEnd"/>
-      <w:r>
-        <w:t>": "2026-07-01T20:15:43.512",</w:t>
-      </w:r>
-    </w:p>
-    <w:p>
-      <w:pPr>
-        <w:jc w:val="left"/>
-      </w:pPr>
-      <w:r>
-        <w:t>"status": 404,</w:t>
-      </w:r>
-    </w:p>
-    <w:p>
-      <w:pPr>
-        <w:jc w:val="left"/>
-      </w:pPr>
-      <w:r>
-        <w:t>"mensagem": "Teste não encontrado!"</w:t>
-      </w:r>
-    </w:p>
-    <w:p>
-      <w:pPr>
-        <w:jc w:val="left"/>
-      </w:pPr>
-      <w:r>
-        <w:t>}</w:t>
-      </w:r>
-    </w:p>
-    <w:p>
-      <w:pPr>
-        <w:pStyle w:val="Ttulo1"/>
-      </w:pPr>
-    </w:p>
-    <w:p/>
     <w:p>
       <w:pPr>
         <w:pStyle w:val="Ttulo1"/>
         <w:spacing w:after="0"/>
         <w:ind w:left="-5"/>
       </w:pPr>
-      <w:bookmarkStart w:id="40" w:name="_Toc233894037"/>
-      <w:r>
+      <w:bookmarkStart w:id="42" w:name="_Toc234146084"/>
+      <w:r>
+        <w:lastRenderedPageBreak/>
         <w:t>3</w:t>
       </w:r>
       <w:r>
-        <w:t xml:space="preserve">. </w:t>
-      </w:r>
-      <w:r>
-        <w:t>MANUAL DE INSTALAÇÃO E EXECUÇÃO</w:t>
-      </w:r>
-      <w:bookmarkEnd w:id="40"/>
+        <w:t>. MANUAL DE INSTALAÇÃO E EXECUÇÃO</w:t>
+      </w:r>
       <w:r>
         <w:t xml:space="preserve"> (BACKEND)</w:t>
       </w:r>
+      <w:bookmarkEnd w:id="42"/>
     </w:p>
     <w:p/>
     <w:p>
@@ -14444,7 +15392,7 @@
 </file>
 
 <file path=word/endnotes.xml><?xml version="1.0" encoding="utf-8"?>
-<w:endnotes xmlns:wpc="http://schemas.microsoft.com/office/word/2010/wordprocessingCanvas" xmlns:cx="http://schemas.microsoft.com/office/drawing/2014/chartex" xmlns:cx1="http://schemas.microsoft.com/office/drawing/2015/9/8/chartex" xmlns:cx2="http://schemas.microsoft.com/office/drawing/2015/10/21/chartex" xmlns:cx3="http://schemas.microsoft.com/office/drawing/2016/5/9/chartex" xmlns:cx4="http://schemas.microsoft.com/office/drawing/2016/5/10/chartex" xmlns:cx5="http://schemas.microsoft.com/office/drawing/2016/5/11/chartex" xmlns:cx6="http://schemas.microsoft.com/office/drawing/2016/5/12/chartex" xmlns:cx7="http://schemas.microsoft.com/office/drawing/2016/5/13/chartex" xmlns:cx8="http://schemas.microsoft.com/office/drawing/2016/5/14/chartex" xmlns:mc="http://schemas.openxmlformats.org/markup-compatibility/2006" xmlns:aink="http://schemas.microsoft.com/office/drawing/2016/ink" xmlns:am3d="http://schemas.microsoft.com/office/drawing/2017/model3d" xmlns:o="urn:schemas-microsoft-com:office:office" xmlns:r="http://schemas.openxmlformats.org/officeDocument/2006/relationships" xmlns:m="http://schemas.openxmlformats.org/officeDocument/2006/math" xmlns:v="urn:schemas-microsoft-com:vml" xmlns:wp14="http://schemas.microsoft.com/office/word/2010/wordprocessingDrawing" xmlns:wp="http://schemas.openxmlformats.org/drawingml/2006/wordprocessingDrawing" xmlns:w10="urn:schemas-microsoft-com:office:word" xmlns:w="http://schemas.openxmlformats.org/wordprocessingml/2006/main" xmlns:w14="http://schemas.microsoft.com/office/word/2010/wordml" xmlns:w15="http://schemas.microsoft.com/office/word/2012/wordml" xmlns:w16cex="http://schemas.microsoft.com/office/word/2018/wordml/cex" xmlns:w16cid="http://schemas.microsoft.com/office/word/2016/wordml/cid" xmlns:w16="http://schemas.microsoft.com/office/word/2018/wordml" xmlns:w16sdtdh="http://schemas.microsoft.com/office/word/2020/wordml/sdtdatahash" xmlns:w16se="http://schemas.microsoft.com/office/word/2015/wordml/symex" xmlns:wpg="http://schemas.microsoft.com/office/word/2010/wordprocessingGroup" xmlns:wpi="http://schemas.microsoft.com/office/word/2010/wordprocessingInk" xmlns:wne="http://schemas.microsoft.com/office/word/2006/wordml" xmlns:wps="http://schemas.microsoft.com/office/word/2010/wordprocessingShape" mc:Ignorable="w14 w15 w16se w16cid w16 w16cex w16sdtdh wp14">
+<w:endnotes xmlns:wpc="http://schemas.microsoft.com/office/word/2010/wordprocessingCanvas" xmlns:cx="http://schemas.microsoft.com/office/drawing/2014/chartex" xmlns:cx1="http://schemas.microsoft.com/office/drawing/2015/9/8/chartex" xmlns:cx2="http://schemas.microsoft.com/office/drawing/2015/10/21/chartex" xmlns:cx3="http://schemas.microsoft.com/office/drawing/2016/5/9/chartex" xmlns:cx4="http://schemas.microsoft.com/office/drawing/2016/5/10/chartex" xmlns:cx5="http://schemas.microsoft.com/office/drawing/2016/5/11/chartex" xmlns:cx6="http://schemas.microsoft.com/office/drawing/2016/5/12/chartex" xmlns:cx7="http://schemas.microsoft.com/office/drawing/2016/5/13/chartex" xmlns:cx8="http://schemas.microsoft.com/office/drawing/2016/5/14/chartex" xmlns:mc="http://schemas.openxmlformats.org/markup-compatibility/2006" xmlns:aink="http://schemas.microsoft.com/office/drawing/2016/ink" xmlns:am3d="http://schemas.microsoft.com/office/drawing/2017/model3d" xmlns:o="urn:schemas-microsoft-com:office:office" xmlns:oel="http://schemas.microsoft.com/office/2019/extlst" xmlns:r="http://schemas.openxmlformats.org/officeDocument/2006/relationships" xmlns:m="http://schemas.openxmlformats.org/officeDocument/2006/math" xmlns:v="urn:schemas-microsoft-com:vml" xmlns:wp14="http://schemas.microsoft.com/office/word/2010/wordprocessingDrawing" xmlns:wp="http://schemas.openxmlformats.org/drawingml/2006/wordprocessingDrawing" xmlns:w10="urn:schemas-microsoft-com:office:word" xmlns:w="http://schemas.openxmlformats.org/wordprocessingml/2006/main" xmlns:w14="http://schemas.microsoft.com/office/word/2010/wordml" xmlns:w15="http://schemas.microsoft.com/office/word/2012/wordml" xmlns:w16cex="http://schemas.microsoft.com/office/word/2018/wordml/cex" xmlns:w16cid="http://schemas.microsoft.com/office/word/2016/wordml/cid" xmlns:w16="http://schemas.microsoft.com/office/word/2018/wordml" xmlns:w16du="http://schemas.microsoft.com/office/word/2023/wordml/word16du" xmlns:w16sdtdh="http://schemas.microsoft.com/office/word/2020/wordml/sdtdatahash" xmlns:w16sdtfl="http://schemas.microsoft.com/office/word/2024/wordml/sdtformatlock" xmlns:w16se="http://schemas.microsoft.com/office/word/2015/wordml/symex" xmlns:wpg="http://schemas.microsoft.com/office/word/2010/wordprocessingGroup" xmlns:wpi="http://schemas.microsoft.com/office/word/2010/wordprocessingInk" xmlns:wne="http://schemas.microsoft.com/office/word/2006/wordml" xmlns:wps="http://schemas.microsoft.com/office/word/2010/wordprocessingShape" mc:Ignorable="w14 w15 w16se w16cid w16 w16cex w16sdtdh w16sdtfl w16du wp14">
   <w:endnote w:type="separator" w:id="-1">
     <w:p>
       <w:pPr>
@@ -14469,7 +15417,7 @@
 </file>
 
 <file path=word/footnotes.xml><?xml version="1.0" encoding="utf-8"?>
-<w:footnotes xmlns:wpc="http://schemas.microsoft.com/office/word/2010/wordprocessingCanvas" xmlns:cx="http://schemas.microsoft.com/office/drawing/2014/chartex" xmlns:cx1="http://schemas.microsoft.com/office/drawing/2015/9/8/chartex" xmlns:cx2="http://schemas.microsoft.com/office/drawing/2015/10/21/chartex" xmlns:cx3="http://schemas.microsoft.com/office/drawing/2016/5/9/chartex" xmlns:cx4="http://schemas.microsoft.com/office/drawing/2016/5/10/chartex" xmlns:cx5="http://schemas.microsoft.com/office/drawing/2016/5/11/chartex" xmlns:cx6="http://schemas.microsoft.com/office/drawing/2016/5/12/chartex" xmlns:cx7="http://schemas.microsoft.com/office/drawing/2016/5/13/chartex" xmlns:cx8="http://schemas.microsoft.com/office/drawing/2016/5/14/chartex" xmlns:mc="http://schemas.openxmlformats.org/markup-compatibility/2006" xmlns:aink="http://schemas.microsoft.com/office/drawing/2016/ink" xmlns:am3d="http://schemas.microsoft.com/office/drawing/2017/model3d" xmlns:o="urn:schemas-microsoft-com:office:office" xmlns:r="http://schemas.openxmlformats.org/officeDocument/2006/relationships" xmlns:m="http://schemas.openxmlformats.org/officeDocument/2006/math" xmlns:v="urn:schemas-microsoft-com:vml" xmlns:wp14="http://schemas.microsoft.com/office/word/2010/wordprocessingDrawing" xmlns:wp="http://schemas.openxmlformats.org/drawingml/2006/wordprocessingDrawing" xmlns:w10="urn:schemas-microsoft-com:office:word" xmlns:w="http://schemas.openxmlformats.org/wordprocessingml/2006/main" xmlns:w14="http://schemas.microsoft.com/office/word/2010/wordml" xmlns:w15="http://schemas.microsoft.com/office/word/2012/wordml" xmlns:w16cex="http://schemas.microsoft.com/office/word/2018/wordml/cex" xmlns:w16cid="http://schemas.microsoft.com/office/word/2016/wordml/cid" xmlns:w16="http://schemas.microsoft.com/office/word/2018/wordml" xmlns:w16sdtdh="http://schemas.microsoft.com/office/word/2020/wordml/sdtdatahash" xmlns:w16se="http://schemas.microsoft.com/office/word/2015/wordml/symex" xmlns:wpg="http://schemas.microsoft.com/office/word/2010/wordprocessingGroup" xmlns:wpi="http://schemas.microsoft.com/office/word/2010/wordprocessingInk" xmlns:wne="http://schemas.microsoft.com/office/word/2006/wordml" xmlns:wps="http://schemas.microsoft.com/office/word/2010/wordprocessingShape" mc:Ignorable="w14 w15 w16se w16cid w16 w16cex w16sdtdh wp14">
+<w:footnotes xmlns:wpc="http://schemas.microsoft.com/office/word/2010/wordprocessingCanvas" xmlns:cx="http://schemas.microsoft.com/office/drawing/2014/chartex" xmlns:cx1="http://schemas.microsoft.com/office/drawing/2015/9/8/chartex" xmlns:cx2="http://schemas.microsoft.com/office/drawing/2015/10/21/chartex" xmlns:cx3="http://schemas.microsoft.com/office/drawing/2016/5/9/chartex" xmlns:cx4="http://schemas.microsoft.com/office/drawing/2016/5/10/chartex" xmlns:cx5="http://schemas.microsoft.com/office/drawing/2016/5/11/chartex" xmlns:cx6="http://schemas.microsoft.com/office/drawing/2016/5/12/chartex" xmlns:cx7="http://schemas.microsoft.com/office/drawing/2016/5/13/chartex" xmlns:cx8="http://schemas.microsoft.com/office/drawing/2016/5/14/chartex" xmlns:mc="http://schemas.openxmlformats.org/markup-compatibility/2006" xmlns:aink="http://schemas.microsoft.com/office/drawing/2016/ink" xmlns:am3d="http://schemas.microsoft.com/office/drawing/2017/model3d" xmlns:o="urn:schemas-microsoft-com:office:office" xmlns:oel="http://schemas.microsoft.com/office/2019/extlst" xmlns:r="http://schemas.openxmlformats.org/officeDocument/2006/relationships" xmlns:m="http://schemas.openxmlformats.org/officeDocument/2006/math" xmlns:v="urn:schemas-microsoft-com:vml" xmlns:wp14="http://schemas.microsoft.com/office/word/2010/wordprocessingDrawing" xmlns:wp="http://schemas.openxmlformats.org/drawingml/2006/wordprocessingDrawing" xmlns:w10="urn:schemas-microsoft-com:office:word" xmlns:w="http://schemas.openxmlformats.org/wordprocessingml/2006/main" xmlns:w14="http://schemas.microsoft.com/office/word/2010/wordml" xmlns:w15="http://schemas.microsoft.com/office/word/2012/wordml" xmlns:w16cex="http://schemas.microsoft.com/office/word/2018/wordml/cex" xmlns:w16cid="http://schemas.microsoft.com/office/word/2016/wordml/cid" xmlns:w16="http://schemas.microsoft.com/office/word/2018/wordml" xmlns:w16du="http://schemas.microsoft.com/office/word/2023/wordml/word16du" xmlns:w16sdtdh="http://schemas.microsoft.com/office/word/2020/wordml/sdtdatahash" xmlns:w16sdtfl="http://schemas.microsoft.com/office/word/2024/wordml/sdtformatlock" xmlns:w16se="http://schemas.microsoft.com/office/word/2015/wordml/symex" xmlns:wpg="http://schemas.microsoft.com/office/word/2010/wordprocessingGroup" xmlns:wpi="http://schemas.microsoft.com/office/word/2010/wordprocessingInk" xmlns:wne="http://schemas.microsoft.com/office/word/2006/wordml" xmlns:wps="http://schemas.microsoft.com/office/word/2010/wordprocessingShape" mc:Ignorable="w14 w15 w16se w16cid w16 w16cex w16sdtdh w16sdtfl w16du wp14">
   <w:footnote w:type="separator" w:id="-1">
     <w:p>
       <w:pPr>
@@ -14494,7 +15442,7 @@
 </file>
 
 <file path=word/numbering.xml><?xml version="1.0" encoding="utf-8"?>
-<w:numbering xmlns:wpc="http://schemas.microsoft.com/office/word/2010/wordprocessingCanvas" xmlns:cx="http://schemas.microsoft.com/office/drawing/2014/chartex" xmlns:cx1="http://schemas.microsoft.com/office/drawing/2015/9/8/chartex" xmlns:cx2="http://schemas.microsoft.com/office/drawing/2015/10/21/chartex" xmlns:cx3="http://schemas.microsoft.com/office/drawing/2016/5/9/chartex" xmlns:cx4="http://schemas.microsoft.com/office/drawing/2016/5/10/chartex" xmlns:cx5="http://schemas.microsoft.com/office/drawing/2016/5/11/chartex" xmlns:cx6="http://schemas.microsoft.com/office/drawing/2016/5/12/chartex" xmlns:cx7="http://schemas.microsoft.com/office/drawing/2016/5/13/chartex" xmlns:cx8="http://schemas.microsoft.com/office/drawing/2016/5/14/chartex" xmlns:mc="http://schemas.openxmlformats.org/markup-compatibility/2006" xmlns:aink="http://schemas.microsoft.com/office/drawing/2016/ink" xmlns:am3d="http://schemas.microsoft.com/office/drawing/2017/model3d" xmlns:o="urn:schemas-microsoft-com:office:office" xmlns:r="http://schemas.openxmlformats.org/officeDocument/2006/relationships" xmlns:m="http://schemas.openxmlformats.org/officeDocument/2006/math" xmlns:v="urn:schemas-microsoft-com:vml" xmlns:wp14="http://schemas.microsoft.com/office/word/2010/wordprocessingDrawing" xmlns:wp="http://schemas.openxmlformats.org/drawingml/2006/wordprocessingDrawing" xmlns:w10="urn:schemas-microsoft-com:office:word" xmlns:w="http://schemas.openxmlformats.org/wordprocessingml/2006/main" xmlns:w14="http://schemas.microsoft.com/office/word/2010/wordml" xmlns:w15="http://schemas.microsoft.com/office/word/2012/wordml" xmlns:w16cex="http://schemas.microsoft.com/office/word/2018/wordml/cex" xmlns:w16cid="http://schemas.microsoft.com/office/word/2016/wordml/cid" xmlns:w16="http://schemas.microsoft.com/office/word/2018/wordml" xmlns:w16sdtdh="http://schemas.microsoft.com/office/word/2020/wordml/sdtdatahash" xmlns:w16se="http://schemas.microsoft.com/office/word/2015/wordml/symex" xmlns:wpg="http://schemas.microsoft.com/office/word/2010/wordprocessingGroup" xmlns:wpi="http://schemas.microsoft.com/office/word/2010/wordprocessingInk" xmlns:wne="http://schemas.microsoft.com/office/word/2006/wordml" xmlns:wps="http://schemas.microsoft.com/office/word/2010/wordprocessingShape" mc:Ignorable="w14 w15 w16se w16cid w16 w16cex w16sdtdh wp14">
+<w:numbering xmlns:wpc="http://schemas.microsoft.com/office/word/2010/wordprocessingCanvas" xmlns:cx="http://schemas.microsoft.com/office/drawing/2014/chartex" xmlns:cx1="http://schemas.microsoft.com/office/drawing/2015/9/8/chartex" xmlns:cx2="http://schemas.microsoft.com/office/drawing/2015/10/21/chartex" xmlns:cx3="http://schemas.microsoft.com/office/drawing/2016/5/9/chartex" xmlns:cx4="http://schemas.microsoft.com/office/drawing/2016/5/10/chartex" xmlns:cx5="http://schemas.microsoft.com/office/drawing/2016/5/11/chartex" xmlns:cx6="http://schemas.microsoft.com/office/drawing/2016/5/12/chartex" xmlns:cx7="http://schemas.microsoft.com/office/drawing/2016/5/13/chartex" xmlns:cx8="http://schemas.microsoft.com/office/drawing/2016/5/14/chartex" xmlns:mc="http://schemas.openxmlformats.org/markup-compatibility/2006" xmlns:aink="http://schemas.microsoft.com/office/drawing/2016/ink" xmlns:am3d="http://schemas.microsoft.com/office/drawing/2017/model3d" xmlns:o="urn:schemas-microsoft-com:office:office" xmlns:oel="http://schemas.microsoft.com/office/2019/extlst" xmlns:r="http://schemas.openxmlformats.org/officeDocument/2006/relationships" xmlns:m="http://schemas.openxmlformats.org/officeDocument/2006/math" xmlns:v="urn:schemas-microsoft-com:vml" xmlns:wp14="http://schemas.microsoft.com/office/word/2010/wordprocessingDrawing" xmlns:wp="http://schemas.openxmlformats.org/drawingml/2006/wordprocessingDrawing" xmlns:w10="urn:schemas-microsoft-com:office:word" xmlns:w="http://schemas.openxmlformats.org/wordprocessingml/2006/main" xmlns:w14="http://schemas.microsoft.com/office/word/2010/wordml" xmlns:w15="http://schemas.microsoft.com/office/word/2012/wordml" xmlns:w16cex="http://schemas.microsoft.com/office/word/2018/wordml/cex" xmlns:w16cid="http://schemas.microsoft.com/office/word/2016/wordml/cid" xmlns:w16="http://schemas.microsoft.com/office/word/2018/wordml" xmlns:w16du="http://schemas.microsoft.com/office/word/2023/wordml/word16du" xmlns:w16sdtdh="http://schemas.microsoft.com/office/word/2020/wordml/sdtdatahash" xmlns:w16sdtfl="http://schemas.microsoft.com/office/word/2024/wordml/sdtformatlock" xmlns:w16se="http://schemas.microsoft.com/office/word/2015/wordml/symex" xmlns:wpg="http://schemas.microsoft.com/office/word/2010/wordprocessingGroup" xmlns:wpi="http://schemas.microsoft.com/office/word/2010/wordprocessingInk" xmlns:wne="http://schemas.microsoft.com/office/word/2006/wordml" xmlns:wps="http://schemas.microsoft.com/office/word/2010/wordprocessingShape" mc:Ignorable="w14 w15 w16se w16cid w16 w16cex w16sdtdh w16sdtfl w16du wp14">
   <w:abstractNum w:abstractNumId="0" w15:restartNumberingAfterBreak="0">
     <w:nsid w:val="3B5743A5"/>
     <w:multiLevelType w:val="multilevel"/>
@@ -14856,17 +15804,17 @@
       </w:rPr>
     </w:lvl>
   </w:abstractNum>
-  <w:num w:numId="1">
+  <w:num w:numId="1" w16cid:durableId="754009576">
     <w:abstractNumId w:val="1"/>
   </w:num>
-  <w:num w:numId="2">
+  <w:num w:numId="2" w16cid:durableId="45494276">
     <w:abstractNumId w:val="0"/>
   </w:num>
 </w:numbering>
 </file>
 
 <file path=word/styles.xml><?xml version="1.0" encoding="utf-8"?>
-<w:styles xmlns:mc="http://schemas.openxmlformats.org/markup-compatibility/2006" xmlns:r="http://schemas.openxmlformats.org/officeDocument/2006/relationships" xmlns:w="http://schemas.openxmlformats.org/wordprocessingml/2006/main" xmlns:w14="http://schemas.microsoft.com/office/word/2010/wordml" xmlns:w15="http://schemas.microsoft.com/office/word/2012/wordml" xmlns:w16cex="http://schemas.microsoft.com/office/word/2018/wordml/cex" xmlns:w16cid="http://schemas.microsoft.com/office/word/2016/wordml/cid" xmlns:w16="http://schemas.microsoft.com/office/word/2018/wordml" xmlns:w16sdtdh="http://schemas.microsoft.com/office/word/2020/wordml/sdtdatahash" xmlns:w16se="http://schemas.microsoft.com/office/word/2015/wordml/symex" mc:Ignorable="w14 w15 w16se w16cid w16 w16cex w16sdtdh">
+<w:styles xmlns:mc="http://schemas.openxmlformats.org/markup-compatibility/2006" xmlns:r="http://schemas.openxmlformats.org/officeDocument/2006/relationships" xmlns:w="http://schemas.openxmlformats.org/wordprocessingml/2006/main" xmlns:w14="http://schemas.microsoft.com/office/word/2010/wordml" xmlns:w15="http://schemas.microsoft.com/office/word/2012/wordml" xmlns:w16cex="http://schemas.microsoft.com/office/word/2018/wordml/cex" xmlns:w16cid="http://schemas.microsoft.com/office/word/2016/wordml/cid" xmlns:w16="http://schemas.microsoft.com/office/word/2018/wordml" xmlns:w16du="http://schemas.microsoft.com/office/word/2023/wordml/word16du" xmlns:w16sdtdh="http://schemas.microsoft.com/office/word/2020/wordml/sdtdatahash" xmlns:w16sdtfl="http://schemas.microsoft.com/office/word/2024/wordml/sdtformatlock" xmlns:w16se="http://schemas.microsoft.com/office/word/2015/wordml/symex" mc:Ignorable="w14 w15 w16se w16cid w16 w16cex w16sdtdh w16sdtfl w16du">
   <w:docDefaults>
     <w:rPrDefault>
       <w:rPr>

</xml_diff>